<commit_message>
Proposal rewritten for a policy audience: two pages, countries first, plain panel explanation
Co-Authored-By: Claude Fable 5 <noreply@anthropic.com>
Claude-Session: https://claude.ai/code/session_01DNzQPDcr3zfLTraMHUHqUn
</commit_message>
<xml_diff>
--- a/report/cpf_proposal.docx
+++ b/report/cpf_proposal.docx
@@ -33,12 +33,12 @@
           <w:sz w:val="23"/>
           <w:szCs w:val="23"/>
         </w:rPr>
-        <w:t xml:space="preserve">A harmonized cross-country anatomy of teacher attrition in the Comparative Panel File</w:t>
-      </w:r>
-    </w:p>
-    <w:p>
-      <w:pPr>
-        <w:spacing w:after="120"/>
+        <w:t xml:space="preserve">A proposal to measure teacher attrition across seven countries with harmonized panel data</w:t>
+      </w:r>
+    </w:p>
+    <w:p>
+      <w:pPr>
+        <w:spacing w:after="140"/>
         <w:jc w:val="center"/>
       </w:pPr>
       <w:r>
@@ -62,25 +62,23 @@
     </w:p>
     <w:p>
       <w:pPr>
-        <w:spacing w:after="80" w:before="220"/>
-      </w:pPr>
-      <w:r>
-        <w:rPr>
-          <w:rFonts w:ascii="Garamond" w:cs="Garamond" w:eastAsia="Garamond" w:hAnsi="Garamond"/>
-          <w:b w:val="false"/>
-          <w:bCs w:val="false"/>
+        <w:spacing w:after="90" w:before="240"/>
+      </w:pPr>
+      <w:r>
+        <w:rPr>
+          <w:rFonts w:ascii="Garamond" w:cs="Garamond" w:eastAsia="Garamond" w:hAnsi="Garamond"/>
           <w:smallCaps/>
           <w:color w:val="2A5DB0"/>
           <w:spacing w:val="24"/>
           <w:sz w:val="21"/>
           <w:szCs w:val="21"/>
         </w:rPr>
-        <w:t xml:space="preserve">The problem</w:t>
-      </w:r>
-    </w:p>
-    <w:p>
-      <w:pPr>
-        <w:spacing w:after="60" w:line="300" w:lineRule="auto"/>
+        <w:t xml:space="preserve">Why this matters</w:t>
+      </w:r>
+    </w:p>
+    <w:p>
+      <w:pPr>
+        <w:spacing w:after="70" w:line="300" w:lineRule="auto"/>
         <w:jc w:val="both"/>
       </w:pPr>
       <w:r>
@@ -90,66 +88,28 @@
           <w:sz w:val="22"/>
           <w:szCs w:val="22"/>
         </w:rPr>
-        <w:t xml:space="preserve">Almost everything known about teacher attrition is single-country and single-source. Administrative registers measure the level well but stop at the school door: few personal characteristics, rarely a destination, never a return </w:t>
-      </w:r>
-      <w:r>
-        <w:rPr>
-          <w:rFonts w:ascii="Garamond" w:cs="Garamond" w:eastAsia="Garamond" w:hAnsi="Garamond"/>
-          <w:color w:val="2A5DB0"/>
-          <w:sz w:val="22"/>
-          <w:szCs w:val="22"/>
-        </w:rPr>
-        <w:t xml:space="preserve">(DfE 2025; BFS 2022)</w:t>
-      </w:r>
-      <w:r>
-        <w:rPr>
-          <w:rFonts w:ascii="Garamond" w:cs="Garamond" w:eastAsia="Garamond" w:hAnsi="Garamond"/>
-          <w:color w:val="1A2430"/>
-          <w:sz w:val="22"/>
-          <w:szCs w:val="22"/>
-        </w:rPr>
-        <w:t xml:space="preserve">. Follow-up surveys are richer but run only every four to five years, under restricted-use licenses </w:t>
-      </w:r>
-      <w:r>
-        <w:rPr>
-          <w:rFonts w:ascii="Garamond" w:cs="Garamond" w:eastAsia="Garamond" w:hAnsi="Garamond"/>
-          <w:color w:val="2A5DB0"/>
-          <w:sz w:val="22"/>
-          <w:szCs w:val="22"/>
-        </w:rPr>
-        <w:t xml:space="preserve">(Goldring, Taie and Riddles 2014; NCES 2024)</w:t>
-      </w:r>
-      <w:r>
-        <w:rPr>
-          <w:rFonts w:ascii="Garamond" w:cs="Garamond" w:eastAsia="Garamond" w:hAnsi="Garamond"/>
-          <w:color w:val="1A2430"/>
-          <w:sz w:val="22"/>
-          <w:szCs w:val="22"/>
-        </w:rPr>
-        <w:t xml:space="preserve">. And countries publish different objects entirely: school separations, sector exits, profession exits, voluntary quits.</w:t>
-      </w:r>
-    </w:p>
-    <w:p>
-      <w:pPr>
-        <w:spacing w:after="80" w:before="220"/>
-      </w:pPr>
-      <w:r>
-        <w:rPr>
-          <w:rFonts w:ascii="Garamond" w:cs="Garamond" w:eastAsia="Garamond" w:hAnsi="Garamond"/>
-          <w:b w:val="false"/>
-          <w:bCs w:val="false"/>
+        <w:t xml:space="preserve">Every few years, in almost every rich country, the public debate rediscovers that teachers are quitting. The numbers behind the alarm are usually weak. Some count teachers who merely changed schools. Some count intentions rather than behavior. Some count exits from the public system while the private sector absorbs the same people. To know how many teachers actually leave the classroom, and who they are, you need to follow the same person over time. Very few statistics do that, and almost none do it in a way that can be compared across countries.</w:t>
+      </w:r>
+    </w:p>
+    <w:p>
+      <w:pPr>
+        <w:spacing w:after="90" w:before="240"/>
+      </w:pPr>
+      <w:r>
+        <w:rPr>
+          <w:rFonts w:ascii="Garamond" w:cs="Garamond" w:eastAsia="Garamond" w:hAnsi="Garamond"/>
           <w:smallCaps/>
           <w:color w:val="2A5DB0"/>
           <w:spacing w:val="24"/>
           <w:sz w:val="21"/>
           <w:szCs w:val="21"/>
         </w:rPr>
-        <w:t xml:space="preserve">The proposal</w:t>
-      </w:r>
-    </w:p>
-    <w:p>
-      <w:pPr>
-        <w:spacing w:after="60" w:line="300" w:lineRule="auto"/>
+        <w:t xml:space="preserve">What one country taught us</w:t>
+      </w:r>
+    </w:p>
+    <w:p>
+      <w:pPr>
+        <w:spacing w:after="70" w:line="300" w:lineRule="auto"/>
         <w:jc w:val="both"/>
       </w:pPr>
       <w:r>
@@ -159,48 +119,46 @@
           <w:sz w:val="22"/>
           <w:szCs w:val="22"/>
         </w:rPr>
-        <w:t xml:space="preserve">The first cross-country characterization of the profile of teachers who leave the profession, and of those who return, using the Comparative Panel File </w:t>
-      </w:r>
-      <w:r>
-        <w:rPr>
-          <w:rFonts w:ascii="Garamond" w:cs="Garamond" w:eastAsia="Garamond" w:hAnsi="Garamond"/>
-          <w:color w:val="2A5DB0"/>
-          <w:sz w:val="22"/>
-          <w:szCs w:val="22"/>
-        </w:rPr>
-        <w:t xml:space="preserve">(Turek, Kalmijn and Leopold 2021)</w:t>
-      </w:r>
-      <w:r>
-        <w:rPr>
-          <w:rFonts w:ascii="Garamond" w:cs="Garamond" w:eastAsia="Garamond" w:hAnsi="Garamond"/>
-          <w:color w:val="1A2430"/>
-          <w:sz w:val="22"/>
-          <w:szCs w:val="22"/>
-        </w:rPr>
-        <w:t xml:space="preserve">: seven harmonized household panels — PSID, Understanding Society, SOEP, HILDA, KLIPS, RLMS-HSE, SHP. Panels are the only design that observes exit and re-entry together with the life running alongside them — partnership, births, spousal earnings, health, satisfaction, pay. That is what registers lack, and what turns a rate into a profile.</w:t>
-      </w:r>
-    </w:p>
-    <w:p>
-      <w:pPr>
-        <w:spacing w:after="80" w:before="220"/>
-      </w:pPr>
-      <w:r>
-        <w:rPr>
-          <w:rFonts w:ascii="Garamond" w:cs="Garamond" w:eastAsia="Garamond" w:hAnsi="Garamond"/>
-          <w:b w:val="false"/>
-          <w:bCs w:val="false"/>
+        <w:t xml:space="preserve">In recent work on the United States I built the longest measurement of teacher attrition available from a single instrument. A public household survey asks every March what a person's longest job was last year and what their job is this week. Whoever taught last year and no longer teaches has left the profession. Read across twenty-eight years, the answer is that the share of American teachers leaving has no trend. It averages 8.6 percent per year, most of it retirements and family spells, and the exodus of the headlines does not appear in the data. Two short papers had used the instrument before, mainly to compare teachers with other professions </w:t>
+      </w:r>
+      <w:r>
+        <w:rPr>
+          <w:rFonts w:ascii="Garamond" w:cs="Garamond" w:eastAsia="Garamond" w:hAnsi="Garamond"/>
+          <w:color w:val="2A5DB0"/>
+          <w:sz w:val="22"/>
+          <w:szCs w:val="22"/>
+        </w:rPr>
+        <w:t xml:space="preserve">(Harris and Adams 2007; Aldeman and Yi 2025)</w:t>
+      </w:r>
+      <w:r>
+        <w:rPr>
+          <w:rFonts w:ascii="Garamond" w:cs="Garamond" w:eastAsia="Garamond" w:hAnsi="Garamond"/>
+          <w:color w:val="1A2430"/>
+          <w:sz w:val="22"/>
+          <w:szCs w:val="22"/>
+        </w:rPr>
+        <w:t xml:space="preserve">. Looking deeper turned a number into an anatomy, with exit routes, profiles, earnings changes and policy margins. This proposal applies the same philosophy to seven countries at once.</w:t>
+      </w:r>
+    </w:p>
+    <w:p>
+      <w:pPr>
+        <w:spacing w:after="90" w:before="240"/>
+      </w:pPr>
+      <w:r>
+        <w:rPr>
+          <w:rFonts w:ascii="Garamond" w:cs="Garamond" w:eastAsia="Garamond" w:hAnsi="Garamond"/>
           <w:smallCaps/>
           <w:color w:val="2A5DB0"/>
           <w:spacing w:val="24"/>
           <w:sz w:val="21"/>
           <w:szCs w:val="21"/>
         </w:rPr>
-        <w:t xml:space="preserve">The contribution</w:t>
-      </w:r>
-    </w:p>
-    <w:p>
-      <w:pPr>
-        <w:spacing w:after="60" w:line="300" w:lineRule="auto"/>
+        <w:t xml:space="preserve">The opportunity</w:t>
+      </w:r>
+    </w:p>
+    <w:p>
+      <w:pPr>
+        <w:spacing w:after="70" w:line="300" w:lineRule="auto"/>
         <w:jc w:val="both"/>
       </w:pPr>
       <w:r>
@@ -210,84 +168,46 @@
           <w:sz w:val="22"/>
           <w:szCs w:val="22"/>
         </w:rPr>
-        <w:t xml:space="preserve">Three deliverables no existing study provides: pooled leaving and return rates per country under one definition, decomposed by route; harmonized profiles of leavers and returners, estimable because the CPF codes age, sex, family events, pay and health identically everywhere; and institutional heterogeneity — attrition runs from about 2 percent in Korea to 9 percent in England and scales inversely with civil-service protection, so the same rate can hide very different people. The literature is administrative and single-country </w:t>
-      </w:r>
-      <w:r>
-        <w:rPr>
-          <w:rFonts w:ascii="Garamond" w:cs="Garamond" w:eastAsia="Garamond" w:hAnsi="Garamond"/>
-          <w:color w:val="2A5DB0"/>
-          <w:sz w:val="22"/>
-          <w:szCs w:val="22"/>
-        </w:rPr>
-        <w:t xml:space="preserve">(Buckley and Griselda 2025; Goldhaber and Theobald 2022)</w:t>
-      </w:r>
-      <w:r>
-        <w:rPr>
-          <w:rFonts w:ascii="Garamond" w:cs="Garamond" w:eastAsia="Garamond" w:hAnsi="Garamond"/>
-          <w:color w:val="1A2430"/>
-          <w:sz w:val="22"/>
-          <w:szCs w:val="22"/>
-        </w:rPr>
-        <w:t xml:space="preserve">, U.S. cross-sectional </w:t>
-      </w:r>
-      <w:r>
-        <w:rPr>
-          <w:rFonts w:ascii="Garamond" w:cs="Garamond" w:eastAsia="Garamond" w:hAnsi="Garamond"/>
-          <w:color w:val="2A5DB0"/>
-          <w:sz w:val="22"/>
-          <w:szCs w:val="22"/>
-        </w:rPr>
-        <w:t xml:space="preserve">(Harris and Adams 2007; Aldeman and Yi 2025)</w:t>
-      </w:r>
-      <w:r>
-        <w:rPr>
-          <w:rFonts w:ascii="Garamond" w:cs="Garamond" w:eastAsia="Garamond" w:hAnsi="Garamond"/>
-          <w:color w:val="1A2430"/>
-          <w:sz w:val="22"/>
-          <w:szCs w:val="22"/>
-        </w:rPr>
-        <w:t xml:space="preserve">, or single-country panel </w:t>
-      </w:r>
-      <w:r>
-        <w:rPr>
-          <w:rFonts w:ascii="Garamond" w:cs="Garamond" w:eastAsia="Garamond" w:hAnsi="Garamond"/>
-          <w:color w:val="2A5DB0"/>
-          <w:sz w:val="22"/>
-          <w:szCs w:val="22"/>
-        </w:rPr>
-        <w:t xml:space="preserve">(Hillary, Andrade and Worth 2018; Cuervo and Vera-Toscano 2025)</w:t>
-      </w:r>
-      <w:r>
-        <w:rPr>
-          <w:rFonts w:ascii="Garamond" w:cs="Garamond" w:eastAsia="Garamond" w:hAnsi="Garamond"/>
-          <w:color w:val="1A2430"/>
-          <w:sz w:val="22"/>
-          <w:szCs w:val="22"/>
-        </w:rPr>
-        <w:t xml:space="preserve">. Nobody has put the seven panels side by side.</w:t>
-      </w:r>
-    </w:p>
-    <w:p>
-      <w:pPr>
-        <w:spacing w:after="80" w:before="220"/>
-      </w:pPr>
-      <w:r>
-        <w:rPr>
-          <w:rFonts w:ascii="Garamond" w:cs="Garamond" w:eastAsia="Garamond" w:hAnsi="Garamond"/>
-          <w:b w:val="false"/>
-          <w:bCs w:val="false"/>
+        <w:t xml:space="preserve">The United States, the United Kingdom, Germany, Australia, South Korea, Russia and Switzerland all run a study of the same rare kind. A few thousand households are interviewed every year, in the American case since 1968, and asked about their jobs, incomes, partners, children and health. Because the same people answer year after year, these studies watch careers unfold in a way no snapshot can. They are called household panels. Each has its own name, its own questionnaire and its own coding, which is why they have rarely been used together. A recent academic project, the Comparative Panel File, has harmonized the seven into one open structure with identical variables for employment, income, family and wellbeing </w:t>
+      </w:r>
+      <w:r>
+        <w:rPr>
+          <w:rFonts w:ascii="Garamond" w:cs="Garamond" w:eastAsia="Garamond" w:hAnsi="Garamond"/>
+          <w:color w:val="2A5DB0"/>
+          <w:sz w:val="22"/>
+          <w:szCs w:val="22"/>
+        </w:rPr>
+        <w:t xml:space="preserve">(Turek, Kalmijn and Leopold 2021)</w:t>
+      </w:r>
+      <w:r>
+        <w:rPr>
+          <w:rFonts w:ascii="Garamond" w:cs="Garamond" w:eastAsia="Garamond" w:hAnsi="Garamond"/>
+          <w:color w:val="1A2430"/>
+          <w:sz w:val="22"/>
+          <w:szCs w:val="22"/>
+        </w:rPr>
+        <w:t xml:space="preserve">. It has been used to study retirement, divorce and unemployment across countries. It has never been used for teachers.</w:t>
+      </w:r>
+    </w:p>
+    <w:p>
+      <w:pPr>
+        <w:spacing w:after="90" w:before="240"/>
+      </w:pPr>
+      <w:r>
+        <w:rPr>
+          <w:rFonts w:ascii="Garamond" w:cs="Garamond" w:eastAsia="Garamond" w:hAnsi="Garamond"/>
           <w:smallCaps/>
           <w:color w:val="2A5DB0"/>
           <w:spacing w:val="24"/>
           <w:sz w:val="21"/>
           <w:szCs w:val="21"/>
         </w:rPr>
-        <w:t xml:space="preserve">Feasibility and design</w:t>
-      </w:r>
-    </w:p>
-    <w:p>
-      <w:pPr>
-        <w:spacing w:after="60" w:line="300" w:lineRule="auto"/>
+        <w:t xml:space="preserve">What panel data make possible</w:t>
+      </w:r>
+    </w:p>
+    <w:p>
+      <w:pPr>
+        <w:spacing w:after="70" w:line="300" w:lineRule="auto"/>
         <w:jc w:val="both"/>
       </w:pPr>
       <w:r>
@@ -297,48 +217,46 @@
           <w:sz w:val="22"/>
           <w:szCs w:val="22"/>
         </w:rPr>
-        <w:t xml:space="preserve">Pooling 20–30 waves yields roughly 3,000 (KLIPS, SHP) to 25,000 (SOEP, UKHLS, HILDA) teacher-year observations per country; an 8 percent exit rate on 3,000 observations carries a standard error of half a point — ample for profiles, honest about ruling out annual series in the small panels. The known risk, occupation-coding churn that inflates panel-based exit to double the administrative benchmark </w:t>
-      </w:r>
-      <w:r>
-        <w:rPr>
-          <w:rFonts w:ascii="Garamond" w:cs="Garamond" w:eastAsia="Garamond" w:hAnsi="Garamond"/>
-          <w:color w:val="2A5DB0"/>
-          <w:sz w:val="22"/>
-          <w:szCs w:val="22"/>
-        </w:rPr>
-        <w:t xml:space="preserve">(Buckley and Griselda 2025)</w:t>
-      </w:r>
-      <w:r>
-        <w:rPr>
-          <w:rFonts w:ascii="Garamond" w:cs="Garamond" w:eastAsia="Garamond" w:hAnsi="Garamond"/>
-          <w:color w:val="1A2430"/>
-          <w:sz w:val="22"/>
-          <w:szCs w:val="22"/>
-        </w:rPr>
-        <w:t xml:space="preserve">, is met four ways: requiring an employer change alongside the occupation change, dependent-interviewing flags (SOEP, UKHLS), netting out re-entries, and validating each country against a compiled set of twenty-five administrative benchmarks.</w:t>
-      </w:r>
-    </w:p>
-    <w:p>
-      <w:pPr>
-        <w:spacing w:after="80" w:before="220"/>
-      </w:pPr>
-      <w:r>
-        <w:rPr>
-          <w:rFonts w:ascii="Garamond" w:cs="Garamond" w:eastAsia="Garamond" w:hAnsi="Garamond"/>
-          <w:b w:val="false"/>
-          <w:bCs w:val="false"/>
+        <w:t xml:space="preserve">A panel observes a teacher before, during and after the exit. It sees the child born two years before the resignation, the partner's earnings that make leaving affordable, the health and the job satisfaction that deteriorate beforehand, the wage in the next job, and the return to the classroom three years later. The administrative registers most countries use to count teachers see none of this. They stop at the school door, record no destinations and no returns, and carry little beyond age and sex. Follow-up surveys such as the American one are richer, but they run only every four or five years, their microdata are restricted, and no two countries field the same one </w:t>
+      </w:r>
+      <w:r>
+        <w:rPr>
+          <w:rFonts w:ascii="Garamond" w:cs="Garamond" w:eastAsia="Garamond" w:hAnsi="Garamond"/>
+          <w:color w:val="2A5DB0"/>
+          <w:sz w:val="22"/>
+          <w:szCs w:val="22"/>
+        </w:rPr>
+        <w:t xml:space="preserve">(Goldring, Taie and Riddles 2014; NCES 2024)</w:t>
+      </w:r>
+      <w:r>
+        <w:rPr>
+          <w:rFonts w:ascii="Garamond" w:cs="Garamond" w:eastAsia="Garamond" w:hAnsi="Garamond"/>
+          <w:color w:val="1A2430"/>
+          <w:sz w:val="22"/>
+          <w:szCs w:val="22"/>
+        </w:rPr>
+        <w:t xml:space="preserve">. The panels are small, and the proposal is honest about what that allows. Pooled over twenty to thirty years they hold between roughly three thousand and twenty-five thousand teacher-year observations per country. That is enough to estimate a leaving rate with a precision of about half a percentage point, enough for profiles by age, sex and family situation, and not enough for year-by-year series in the smaller countries.</w:t>
+      </w:r>
+    </w:p>
+    <w:p>
+      <w:pPr>
+        <w:spacing w:after="90" w:before="240"/>
+      </w:pPr>
+      <w:r>
+        <w:rPr>
+          <w:rFonts w:ascii="Garamond" w:cs="Garamond" w:eastAsia="Garamond" w:hAnsi="Garamond"/>
           <w:smallCaps/>
           <w:color w:val="2A5DB0"/>
           <w:spacing w:val="24"/>
           <w:sz w:val="21"/>
           <w:szCs w:val="21"/>
         </w:rPr>
-        <w:t xml:space="preserve">Data access</w:t>
-      </w:r>
-    </w:p>
-    <w:p>
-      <w:pPr>
-        <w:spacing w:after="60" w:line="300" w:lineRule="auto"/>
+        <w:t xml:space="preserve">The contribution</w:t>
+      </w:r>
+    </w:p>
+    <w:p>
+      <w:pPr>
+        <w:spacing w:after="70" w:line="300" w:lineRule="auto"/>
         <w:jc w:val="both"/>
       </w:pPr>
       <w:r>
@@ -348,7 +266,87 @@
           <w:sz w:val="22"/>
           <w:szCs w:val="22"/>
         </w:rPr>
-        <w:t xml:space="preserve">All seven panels are available at no or nominal cost through standard research applications — open registration (PSID, RLMS-HSE), the UK Data Service, a DIW contract (SOEP), the Australian Data Archive (HILDA), the Korea Labor Institute (KLIPS), FORS/SWISSUbase (SHP) — and the CPF harmonization code is open source. No restricted-use license is required at any point; the entire exercise is replicable.</w:t>
+        <w:t xml:space="preserve">Three things would exist that do not exist today. The first is a set of leaving and returning rates measured with one common definition in seven countries. My compilation of some twenty-five national statistics shows why this is needed. Annual attrition runs from about two percent in South Korea to about nine percent in England, but every country publishes a different object, so the published numbers cannot be compared. The second is the profile. Who leaves, and who comes back, described with the same socioeconomic variables everywhere. Whether a system is losing young mothers, mid-career men, teachers in poor health or its best paid staff is precisely what a ministry needs to know before choosing among pensions, childcare, pay and workload as the lever. The third is the institutional comparison. Attrition falls as civil-service protection rises across these countries. Profiles measured on a common footing would show what that protection buys, whom it retains, and at what cost.</w:t>
+      </w:r>
+    </w:p>
+    <w:p>
+      <w:pPr>
+        <w:spacing w:after="90" w:before="240"/>
+      </w:pPr>
+      <w:r>
+        <w:rPr>
+          <w:rFonts w:ascii="Garamond" w:cs="Garamond" w:eastAsia="Garamond" w:hAnsi="Garamond"/>
+          <w:smallCaps/>
+          <w:color w:val="2A5DB0"/>
+          <w:spacing w:val="24"/>
+          <w:sz w:val="21"/>
+          <w:szCs w:val="21"/>
+        </w:rPr>
+        <w:t xml:space="preserve">Getting the measurement right</w:t>
+      </w:r>
+    </w:p>
+    <w:p>
+      <w:pPr>
+        <w:spacing w:after="70" w:line="300" w:lineRule="auto"/>
+        <w:jc w:val="both"/>
+      </w:pPr>
+      <w:r>
+        <w:rPr>
+          <w:rFonts w:ascii="Garamond" w:cs="Garamond" w:eastAsia="Garamond" w:hAnsi="Garamond"/>
+          <w:color w:val="1A2430"/>
+          <w:sz w:val="22"/>
+          <w:szCs w:val="22"/>
+        </w:rPr>
+        <w:t xml:space="preserve">Panel surveys measure occupations with error, and the error is not innocent. When the same person describes their job twice, a promotion or a careless answer can look like a career change. Recent Australian work that checked survey answers against tax records found that panel-based attrition can come out at double the administrative figure for this reason </w:t>
+      </w:r>
+      <w:r>
+        <w:rPr>
+          <w:rFonts w:ascii="Garamond" w:cs="Garamond" w:eastAsia="Garamond" w:hAnsi="Garamond"/>
+          <w:color w:val="2A5DB0"/>
+          <w:sz w:val="22"/>
+          <w:szCs w:val="22"/>
+        </w:rPr>
+        <w:t xml:space="preserve">(Buckley and Griselda 2025)</w:t>
+      </w:r>
+      <w:r>
+        <w:rPr>
+          <w:rFonts w:ascii="Garamond" w:cs="Garamond" w:eastAsia="Garamond" w:hAnsi="Garamond"/>
+          <w:color w:val="1A2430"/>
+          <w:sz w:val="22"/>
+          <w:szCs w:val="22"/>
+        </w:rPr>
+        <w:t xml:space="preserve">. The design confronts this directly. An exit requires a change of employer, not only of occupational code. Two of the panels flag answers carried over from the previous interview, which removes most spurious changes. Returns are netted out rather than ignored, since they are themselves part of the story. And every national estimate is validated against the administrative benchmarks compiled for this proposal, the same discipline that anchored the American work to the official statistics.</w:t>
+      </w:r>
+    </w:p>
+    <w:p>
+      <w:pPr>
+        <w:spacing w:after="90" w:before="240"/>
+      </w:pPr>
+      <w:r>
+        <w:rPr>
+          <w:rFonts w:ascii="Garamond" w:cs="Garamond" w:eastAsia="Garamond" w:hAnsi="Garamond"/>
+          <w:smallCaps/>
+          <w:color w:val="2A5DB0"/>
+          <w:spacing w:val="24"/>
+          <w:sz w:val="21"/>
+          <w:szCs w:val="21"/>
+        </w:rPr>
+        <w:t xml:space="preserve">Access and deliverables</w:t>
+      </w:r>
+    </w:p>
+    <w:p>
+      <w:pPr>
+        <w:spacing w:after="70" w:line="300" w:lineRule="auto"/>
+        <w:jc w:val="both"/>
+      </w:pPr>
+      <w:r>
+        <w:rPr>
+          <w:rFonts w:ascii="Garamond" w:cs="Garamond" w:eastAsia="Garamond" w:hAnsi="Garamond"/>
+          <w:color w:val="1A2430"/>
+          <w:sz w:val="22"/>
+          <w:szCs w:val="22"/>
+        </w:rPr>
+        <w:t xml:space="preserve">All seven studies are open to researchers at no or nominal cost through standard applications, and the harmonization code is public. Nothing in the project requires restricted licenses or special agreements, so every result can be replicated by anyone. The deliverables are a comparative report with the rates, the routes and the profiles, a public replication package that extends the Comparative Panel File, and short country notes for the systems where the findings speak to live debates on pay, pensions and family leave.</w:t>
       </w:r>
     </w:p>
     <w:p>
@@ -400,7 +398,7 @@
           <w:sz w:val="20"/>
           <w:szCs w:val="20"/>
         </w:rPr>
-        <w:t xml:space="preserve">BFS — Bundesamt für Statistik (2022). Verbleib der Lehrkräfte an der obligatorischen Schule. Neuchâtel: BFS, Längsschnittanalysen im Bildungsbereich.</w:t>
+        <w:t xml:space="preserve">Buckley, J., and S. Griselda (2025). “Who Stays, Who Goes? A New Look at Teacher Attrition Using Administrative Data.” e61 Institute Research Note.</w:t>
       </w:r>
     </w:p>
     <w:p>
@@ -415,7 +413,7 @@
           <w:sz w:val="20"/>
           <w:szCs w:val="20"/>
         </w:rPr>
-        <w:t xml:space="preserve">Buckley, J., and S. Griselda (2025). “Who Stays, Who Goes? A New Look at Teacher Attrition Using Administrative Data.” e61 Institute Research Note.</w:t>
+        <w:t xml:space="preserve">Goldring, R., S. Taie, and M. Riddles (2014). Teacher Attrition and Mobility: Results from the 2012–13 Teacher Follow-up Survey. NCES 2014-077, U.S. Department of Education.</w:t>
       </w:r>
     </w:p>
     <w:p>
@@ -430,7 +428,7 @@
           <w:sz w:val="20"/>
           <w:szCs w:val="20"/>
         </w:rPr>
-        <w:t xml:space="preserve">Cuervo, H., and E. Vera-Toscano (2025). “Teacher Retention and Attrition: Understanding Why Teachers Leave and Their Post-Teaching Pathways in Australia.” Asia Pacific Journal of Education.</w:t>
+        <w:t xml:space="preserve">Harris, D., and S. Adams (2007). “Understanding the Level and Causes of Teacher Turnover: A Comparison with Other Professions.” Economics of Education Review 26(3), 325–337.</w:t>
       </w:r>
     </w:p>
     <w:p>
@@ -445,7 +443,7 @@
           <w:sz w:val="20"/>
           <w:szCs w:val="20"/>
         </w:rPr>
-        <w:t xml:space="preserve">DfE — Department for Education (2025). School Workforce in England, 2024/25. Explore Education Statistics.</w:t>
+        <w:t xml:space="preserve">National Center for Education Statistics (2024). Teacher Attrition and Mobility: Results from the 2021–22 Teacher Follow-up Survey. NCES 2024-039, U.S. Department of Education.</w:t>
       </w:r>
     </w:p>
     <w:p>
@@ -460,7 +458,7 @@
           <w:sz w:val="20"/>
           <w:szCs w:val="20"/>
         </w:rPr>
-        <w:t xml:space="preserve">Goldhaber, D., and R. Theobald (2022). “Teacher Attrition and Mobility Over Time.” Educational Researcher 51(3), 235–237.</w:t>
+        <w:t xml:space="preserve">OECD (2025). Education at a Glance 2025. Paris: OECD Publishing.</w:t>
       </w:r>
     </w:p>
     <w:p>
@@ -475,82 +473,7 @@
           <w:sz w:val="20"/>
           <w:szCs w:val="20"/>
         </w:rPr>
-        <w:t xml:space="preserve">Goldring, R., S. Taie, and M. Riddles (2014). Teacher Attrition and Mobility: Results from the 2012–13 Teacher Follow-up Survey. NCES 2014-077, U.S. Department of Education.</w:t>
-      </w:r>
-    </w:p>
-    <w:p>
-      <w:pPr>
-        <w:spacing w:after="120" w:line="276" w:lineRule="auto"/>
-        <w:ind w:left="420" w:hanging="420"/>
-      </w:pPr>
-      <w:r>
-        <w:rPr>
-          <w:rFonts w:ascii="Garamond" w:cs="Garamond" w:eastAsia="Garamond" w:hAnsi="Garamond"/>
-          <w:color w:val="1A2430"/>
-          <w:sz w:val="20"/>
-          <w:szCs w:val="20"/>
-        </w:rPr>
-        <w:t xml:space="preserve">Harris, D., and S. Adams (2007). “Understanding the Level and Causes of Teacher Turnover: A Comparison with Other Professions.” Economics of Education Review 26(3), 325–337.</w:t>
-      </w:r>
-    </w:p>
-    <w:p>
-      <w:pPr>
-        <w:spacing w:after="120" w:line="276" w:lineRule="auto"/>
-        <w:ind w:left="420" w:hanging="420"/>
-      </w:pPr>
-      <w:r>
-        <w:rPr>
-          <w:rFonts w:ascii="Garamond" w:cs="Garamond" w:eastAsia="Garamond" w:hAnsi="Garamond"/>
-          <w:color w:val="1A2430"/>
-          <w:sz w:val="20"/>
-          <w:szCs w:val="20"/>
-        </w:rPr>
-        <w:t xml:space="preserve">Hillary, J., J. Andrade, and J. Worth (2018). Teacher Retention and Turnover Research — Update 4: How Do Teachers Compare to Nurses and Police Officers? Slough: NFER.</w:t>
-      </w:r>
-    </w:p>
-    <w:p>
-      <w:pPr>
-        <w:spacing w:after="120" w:line="276" w:lineRule="auto"/>
-        <w:ind w:left="420" w:hanging="420"/>
-      </w:pPr>
-      <w:r>
-        <w:rPr>
-          <w:rFonts w:ascii="Garamond" w:cs="Garamond" w:eastAsia="Garamond" w:hAnsi="Garamond"/>
-          <w:color w:val="1A2430"/>
-          <w:sz w:val="20"/>
-          <w:szCs w:val="20"/>
-        </w:rPr>
-        <w:t xml:space="preserve">NCES — National Center for Education Statistics (2024). Teacher Attrition and Mobility: Results from the 2021–22 Teacher Follow-up Survey. NCES 2024-039, U.S. Department of Education.</w:t>
-      </w:r>
-    </w:p>
-    <w:p>
-      <w:pPr>
-        <w:spacing w:after="120" w:line="276" w:lineRule="auto"/>
-        <w:ind w:left="420" w:hanging="420"/>
-      </w:pPr>
-      <w:r>
-        <w:rPr>
-          <w:rFonts w:ascii="Garamond" w:cs="Garamond" w:eastAsia="Garamond" w:hAnsi="Garamond"/>
-          <w:color w:val="1A2430"/>
-          <w:sz w:val="20"/>
-          <w:szCs w:val="20"/>
-        </w:rPr>
         <w:t xml:space="preserve">Turek, K., M. Kalmijn, and T. Leopold (2021). “The Comparative Panel File: Harmonized Panel Surveys from Seven Countries.” European Sociological Review 37(3), 505–523.</w:t>
-      </w:r>
-    </w:p>
-    <w:p>
-      <w:pPr>
-        <w:spacing w:after="120" w:line="276" w:lineRule="auto"/>
-        <w:ind w:left="420" w:hanging="420"/>
-      </w:pPr>
-      <w:r>
-        <w:rPr>
-          <w:rFonts w:ascii="Garamond" w:cs="Garamond" w:eastAsia="Garamond" w:hAnsi="Garamond"/>
-          <w:color w:val="1A2430"/>
-          <w:sz w:val="20"/>
-          <w:szCs w:val="20"/>
-        </w:rPr>
-        <w:t xml:space="preserve">Weldon, P. (2018). “Early Career Teacher Attrition in Australia: Evidence, Definition, Classification and Measurement.” Australian Journal of Education 62(1), 61–78.</w:t>
       </w:r>
     </w:p>
     <w:sectPr>

</xml_diff>

<commit_message>
Proposal: classic structure with numbered professional sections, no US-paper reference
Co-Authored-By: Claude Fable 5 <noreply@anthropic.com>
Claude-Session: https://claude.ai/code/session_01DNzQPDcr3zfLTraMHUHqUn
</commit_message>
<xml_diff>
--- a/report/cpf_proposal.docx
+++ b/report/cpf_proposal.docx
@@ -33,7 +33,7 @@
           <w:sz w:val="23"/>
           <w:szCs w:val="23"/>
         </w:rPr>
-        <w:t xml:space="preserve">A proposal to measure teacher attrition across seven countries with harmonized panel data</w:t>
+        <w:t xml:space="preserve">Measuring teacher attrition across seven countries with harmonized panel data</w:t>
       </w:r>
     </w:p>
     <w:p>
@@ -69,11 +69,11 @@
           <w:rFonts w:ascii="Garamond" w:cs="Garamond" w:eastAsia="Garamond" w:hAnsi="Garamond"/>
           <w:smallCaps/>
           <w:color w:val="2A5DB0"/>
-          <w:spacing w:val="24"/>
-          <w:sz w:val="21"/>
-          <w:szCs w:val="21"/>
-        </w:rPr>
-        <w:t xml:space="preserve">Why this matters</w:t>
+          <w:spacing w:val="20"/>
+          <w:sz w:val="22"/>
+          <w:szCs w:val="22"/>
+        </w:rPr>
+        <w:t xml:space="preserve">1.  Motivation and Background</w:t>
       </w:r>
     </w:p>
     <w:p>
@@ -88,23 +88,7 @@
           <w:sz w:val="22"/>
           <w:szCs w:val="22"/>
         </w:rPr>
-        <w:t xml:space="preserve">Every few years, in almost every rich country, the public debate rediscovers that teachers are quitting. The numbers behind the alarm are usually weak. Some count teachers who merely changed schools. Some count intentions rather than behavior. Some count exits from the public system while the private sector absorbs the same people. To know how many teachers actually leave the classroom, and who they are, you need to follow the same person over time. Very few statistics do that, and almost none do it in a way that can be compared across countries.</w:t>
-      </w:r>
-    </w:p>
-    <w:p>
-      <w:pPr>
-        <w:spacing w:after="90" w:before="240"/>
-      </w:pPr>
-      <w:r>
-        <w:rPr>
-          <w:rFonts w:ascii="Garamond" w:cs="Garamond" w:eastAsia="Garamond" w:hAnsi="Garamond"/>
-          <w:smallCaps/>
-          <w:color w:val="2A5DB0"/>
-          <w:spacing w:val="24"/>
-          <w:sz w:val="21"/>
-          <w:szCs w:val="21"/>
-        </w:rPr>
-        <w:t xml:space="preserve">What one country taught us</w:t>
+        <w:t xml:space="preserve">Every few years, in almost every rich country, the public debate rediscovers that teachers are quitting. The numbers behind the alarm are usually weak. Some count teachers who merely changed schools. Some count intentions rather than behavior. Some count exits from the public system while the private sector absorbs the same people. To know how many teachers actually leave the classroom, and who they are, one must follow the same person over time. Very few statistics do that, and almost none do it in a way that can be compared across countries.</w:t>
       </w:r>
     </w:p>
     <w:p>
@@ -119,25 +103,43 @@
           <w:sz w:val="22"/>
           <w:szCs w:val="22"/>
         </w:rPr>
-        <w:t xml:space="preserve">In recent work on the United States I built the longest measurement of teacher attrition available from a single instrument. A public household survey asks every March what a person's longest job was last year and what their job is this week. Whoever taught last year and no longer teaches has left the profession. Read across twenty-eight years, the answer is that the share of American teachers leaving has no trend. It averages 8.6 percent per year, most of it retirements and family spells, and the exodus of the headlines does not appear in the data. Two short papers had used the instrument before, mainly to compare teachers with other professions </w:t>
-      </w:r>
-      <w:r>
-        <w:rPr>
-          <w:rFonts w:ascii="Garamond" w:cs="Garamond" w:eastAsia="Garamond" w:hAnsi="Garamond"/>
-          <w:color w:val="2A5DB0"/>
-          <w:sz w:val="22"/>
-          <w:szCs w:val="22"/>
-        </w:rPr>
-        <w:t xml:space="preserve">(Harris and Adams 2007; Aldeman and Yi 2025)</w:t>
-      </w:r>
-      <w:r>
-        <w:rPr>
-          <w:rFonts w:ascii="Garamond" w:cs="Garamond" w:eastAsia="Garamond" w:hAnsi="Garamond"/>
-          <w:color w:val="1A2430"/>
-          <w:sz w:val="22"/>
-          <w:szCs w:val="22"/>
-        </w:rPr>
-        <w:t xml:space="preserve">. Looking deeper turned a number into an anatomy, with exit routes, profiles, earnings changes and policy margins. This proposal applies the same philosophy to seven countries at once.</w:t>
+        <w:t xml:space="preserve">The existing measurement landscape has two pillars, and both fall short of that standard. Administrative registers count teachers well but stop at the school door. They carry little beyond age and sex, record no destinations and no returns. Dedicated follow-up surveys are richer but run only every four or five years, their microdata are restricted, and no two countries field the same one </w:t>
+      </w:r>
+      <w:r>
+        <w:rPr>
+          <w:rFonts w:ascii="Garamond" w:cs="Garamond" w:eastAsia="Garamond" w:hAnsi="Garamond"/>
+          <w:color w:val="2A5DB0"/>
+          <w:sz w:val="22"/>
+          <w:szCs w:val="22"/>
+        </w:rPr>
+        <w:t xml:space="preserve">(Goldring, Taie and Riddles 2014; NCES 2024)</w:t>
+      </w:r>
+      <w:r>
+        <w:rPr>
+          <w:rFonts w:ascii="Garamond" w:cs="Garamond" w:eastAsia="Garamond" w:hAnsi="Garamond"/>
+          <w:color w:val="1A2430"/>
+          <w:sz w:val="22"/>
+          <w:szCs w:val="22"/>
+        </w:rPr>
+        <w:t xml:space="preserve">. The result is that annual attrition figures range from about two percent in South Korea to about nine percent in England, yet every national statistic measures a different object, so the published numbers cannot be compared, and teacher shortages remain a shared concern addressed with uncoordinated evidence </w:t>
+      </w:r>
+      <w:r>
+        <w:rPr>
+          <w:rFonts w:ascii="Garamond" w:cs="Garamond" w:eastAsia="Garamond" w:hAnsi="Garamond"/>
+          <w:color w:val="2A5DB0"/>
+          <w:sz w:val="22"/>
+          <w:szCs w:val="22"/>
+        </w:rPr>
+        <w:t xml:space="preserve">(OECD 2025)</w:t>
+      </w:r>
+      <w:r>
+        <w:rPr>
+          <w:rFonts w:ascii="Garamond" w:cs="Garamond" w:eastAsia="Garamond" w:hAnsi="Garamond"/>
+          <w:color w:val="1A2430"/>
+          <w:sz w:val="22"/>
+          <w:szCs w:val="22"/>
+        </w:rPr>
+        <w:t xml:space="preserve">.</w:t>
       </w:r>
     </w:p>
     <w:p>
@@ -149,11 +151,11 @@
           <w:rFonts w:ascii="Garamond" w:cs="Garamond" w:eastAsia="Garamond" w:hAnsi="Garamond"/>
           <w:smallCaps/>
           <w:color w:val="2A5DB0"/>
-          <w:spacing w:val="24"/>
-          <w:sz w:val="21"/>
-          <w:szCs w:val="21"/>
-        </w:rPr>
-        <w:t xml:space="preserve">The opportunity</w:t>
+          <w:spacing w:val="20"/>
+          <w:sz w:val="22"/>
+          <w:szCs w:val="22"/>
+        </w:rPr>
+        <w:t xml:space="preserve">2.  Objectives</w:t>
       </w:r>
     </w:p>
     <w:p>
@@ -168,25 +170,7 @@
           <w:sz w:val="22"/>
           <w:szCs w:val="22"/>
         </w:rPr>
-        <w:t xml:space="preserve">The United States, the United Kingdom, Germany, Australia, South Korea, Russia and Switzerland all run a study of the same rare kind. A few thousand households are interviewed every year, in the American case since 1968, and asked about their jobs, incomes, partners, children and health. Because the same people answer year after year, these studies watch careers unfold in a way no snapshot can. They are called household panels. Each has its own name, its own questionnaire and its own coding, which is why they have rarely been used together. A recent academic project, the Comparative Panel File, has harmonized the seven into one open structure with identical variables for employment, income, family and wellbeing </w:t>
-      </w:r>
-      <w:r>
-        <w:rPr>
-          <w:rFonts w:ascii="Garamond" w:cs="Garamond" w:eastAsia="Garamond" w:hAnsi="Garamond"/>
-          <w:color w:val="2A5DB0"/>
-          <w:sz w:val="22"/>
-          <w:szCs w:val="22"/>
-        </w:rPr>
-        <w:t xml:space="preserve">(Turek, Kalmijn and Leopold 2021)</w:t>
-      </w:r>
-      <w:r>
-        <w:rPr>
-          <w:rFonts w:ascii="Garamond" w:cs="Garamond" w:eastAsia="Garamond" w:hAnsi="Garamond"/>
-          <w:color w:val="1A2430"/>
-          <w:sz w:val="22"/>
-          <w:szCs w:val="22"/>
-        </w:rPr>
-        <w:t xml:space="preserve">. It has been used to study retirement, divorce and unemployment across countries. It has never been used for teachers.</w:t>
+        <w:t xml:space="preserve">The project has three objectives. First, to estimate teacher attrition and re-entry rates for seven countries under a single, common definition, decomposed by destination, namely another job, unemployment, or withdrawal from the labor force. Second, to characterize the socioeconomic profile of the teachers who leave and of those who return, using identical variables in every country. Third, to link the cross-country differences in rates and profiles to institutional differences in job protection, pay and family policy, so the comparison speaks to the levers governments actually control.</w:t>
       </w:r>
     </w:p>
     <w:p>
@@ -198,11 +182,11 @@
           <w:rFonts w:ascii="Garamond" w:cs="Garamond" w:eastAsia="Garamond" w:hAnsi="Garamond"/>
           <w:smallCaps/>
           <w:color w:val="2A5DB0"/>
-          <w:spacing w:val="24"/>
-          <w:sz w:val="21"/>
-          <w:szCs w:val="21"/>
-        </w:rPr>
-        <w:t xml:space="preserve">What panel data make possible</w:t>
+          <w:spacing w:val="20"/>
+          <w:sz w:val="22"/>
+          <w:szCs w:val="22"/>
+        </w:rPr>
+        <w:t xml:space="preserve">3.  Data</w:t>
       </w:r>
     </w:p>
     <w:p>
@@ -217,41 +201,25 @@
           <w:sz w:val="22"/>
           <w:szCs w:val="22"/>
         </w:rPr>
-        <w:t xml:space="preserve">A panel observes a teacher before, during and after the exit. It sees the child born two years before the resignation, the partner's earnings that make leaving affordable, the health and the job satisfaction that deteriorate beforehand, the wage in the next job, and the return to the classroom three years later. The administrative registers most countries use to count teachers see none of this. They stop at the school door, record no destinations and no returns, and carry little beyond age and sex. Follow-up surveys such as the American one are richer, but they run only every four or five years, their microdata are restricted, and no two countries field the same one </w:t>
-      </w:r>
-      <w:r>
-        <w:rPr>
-          <w:rFonts w:ascii="Garamond" w:cs="Garamond" w:eastAsia="Garamond" w:hAnsi="Garamond"/>
-          <w:color w:val="2A5DB0"/>
-          <w:sz w:val="22"/>
-          <w:szCs w:val="22"/>
-        </w:rPr>
-        <w:t xml:space="preserve">(Goldring, Taie and Riddles 2014; NCES 2024)</w:t>
-      </w:r>
-      <w:r>
-        <w:rPr>
-          <w:rFonts w:ascii="Garamond" w:cs="Garamond" w:eastAsia="Garamond" w:hAnsi="Garamond"/>
-          <w:color w:val="1A2430"/>
-          <w:sz w:val="22"/>
-          <w:szCs w:val="22"/>
-        </w:rPr>
-        <w:t xml:space="preserve">. The panels are small, and the proposal is honest about what that allows. Pooled over twenty to thirty years they hold between roughly three thousand and twenty-five thousand teacher-year observations per country. That is enough to estimate a leaving rate with a precision of about half a percentage point, enough for profiles by age, sex and family situation, and not enough for year-by-year series in the smaller countries.</w:t>
-      </w:r>
-    </w:p>
-    <w:p>
-      <w:pPr>
-        <w:spacing w:after="90" w:before="240"/>
-      </w:pPr>
-      <w:r>
-        <w:rPr>
-          <w:rFonts w:ascii="Garamond" w:cs="Garamond" w:eastAsia="Garamond" w:hAnsi="Garamond"/>
-          <w:smallCaps/>
-          <w:color w:val="2A5DB0"/>
-          <w:spacing w:val="24"/>
-          <w:sz w:val="21"/>
-          <w:szCs w:val="21"/>
-        </w:rPr>
-        <w:t xml:space="preserve">The contribution</w:t>
+        <w:t xml:space="preserve">The United States, the United Kingdom, Germany, Australia, South Korea, Russia and Switzerland all run a study of the same rare kind. A few thousand households are interviewed every year, in the American case since 1968, about their jobs, incomes, partners, children and health. Because the same people answer year after year, these studies watch careers unfold in a way no snapshot can. They are called household panels. Each has its own name, questionnaire and coding, which is why they have rarely been used together. The Comparative Panel File harmonizes the seven into one open structure with identical variables for employment, income, family and wellbeing </w:t>
+      </w:r>
+      <w:r>
+        <w:rPr>
+          <w:rFonts w:ascii="Garamond" w:cs="Garamond" w:eastAsia="Garamond" w:hAnsi="Garamond"/>
+          <w:color w:val="2A5DB0"/>
+          <w:sz w:val="22"/>
+          <w:szCs w:val="22"/>
+        </w:rPr>
+        <w:t xml:space="preserve">(Turek, Kalmijn and Leopold 2021)</w:t>
+      </w:r>
+      <w:r>
+        <w:rPr>
+          <w:rFonts w:ascii="Garamond" w:cs="Garamond" w:eastAsia="Garamond" w:hAnsi="Garamond"/>
+          <w:color w:val="1A2430"/>
+          <w:sz w:val="22"/>
+          <w:szCs w:val="22"/>
+        </w:rPr>
+        <w:t xml:space="preserve">. It has been used to study retirement, divorce and unemployment across countries. It has never been used for teachers.</w:t>
       </w:r>
     </w:p>
     <w:p>
@@ -266,7 +234,7 @@
           <w:sz w:val="22"/>
           <w:szCs w:val="22"/>
         </w:rPr>
-        <w:t xml:space="preserve">Three things would exist that do not exist today. The first is a set of leaving and returning rates measured with one common definition in seven countries. My compilation of some twenty-five national statistics shows why this is needed. Annual attrition runs from about two percent in South Korea to about nine percent in England, but every country publishes a different object, so the published numbers cannot be compared. The second is the profile. Who leaves, and who comes back, described with the same socioeconomic variables everywhere. Whether a system is losing young mothers, mid-career men, teachers in poor health or its best paid staff is precisely what a ministry needs to know before choosing among pensions, childcare, pay and workload as the lever. The third is the institutional comparison. Attrition falls as civil-service protection rises across these countries. Profiles measured on a common footing would show what that protection buys, whom it retains, and at what cost.</w:t>
+        <w:t xml:space="preserve">A panel observes a teacher before, during and after the exit. It sees the child born two years before the resignation, the partner's earnings that make leaving affordable, the health and job satisfaction that deteriorate beforehand, the wage in the next job, and the return to the classroom three years later. Pooled over twenty to thirty years, the panels hold between roughly three thousand and twenty-five thousand teacher-year observations per country. That is enough to estimate a leaving rate with a precision of about half a percentage point and to support profiles by age, sex and family situation, though not year-by-year series in the smaller countries. The proposal is explicit about that frontier.</w:t>
       </w:r>
     </w:p>
     <w:p>
@@ -278,11 +246,11 @@
           <w:rFonts w:ascii="Garamond" w:cs="Garamond" w:eastAsia="Garamond" w:hAnsi="Garamond"/>
           <w:smallCaps/>
           <w:color w:val="2A5DB0"/>
-          <w:spacing w:val="24"/>
-          <w:sz w:val="21"/>
-          <w:szCs w:val="21"/>
-        </w:rPr>
-        <w:t xml:space="preserve">Getting the measurement right</w:t>
+          <w:spacing w:val="20"/>
+          <w:sz w:val="22"/>
+          <w:szCs w:val="22"/>
+        </w:rPr>
+        <w:t xml:space="preserve">4.  Empirical Strategy</w:t>
       </w:r>
     </w:p>
     <w:p>
@@ -297,7 +265,7 @@
           <w:sz w:val="22"/>
           <w:szCs w:val="22"/>
         </w:rPr>
-        <w:t xml:space="preserve">Panel surveys measure occupations with error, and the error is not innocent. When the same person describes their job twice, a promotion or a careless answer can look like a career change. Recent Australian work that checked survey answers against tax records found that panel-based attrition can come out at double the administrative figure for this reason </w:t>
+        <w:t xml:space="preserve">Occupations are measured with error in surveys, and the error is not innocent. When the same person describes their job twice, a promotion or a careless answer can look like a career change. Recent Australian work that checked survey answers against tax records found that panel-based attrition can come out at double the administrative figure for this reason </w:t>
       </w:r>
       <w:r>
         <w:rPr>
@@ -315,7 +283,7 @@
           <w:sz w:val="22"/>
           <w:szCs w:val="22"/>
         </w:rPr>
-        <w:t xml:space="preserve">. The design confronts this directly. An exit requires a change of employer, not only of occupational code. Two of the panels flag answers carried over from the previous interview, which removes most spurious changes. Returns are netted out rather than ignored, since they are themselves part of the story. And every national estimate is validated against the administrative benchmarks compiled for this proposal, the same discipline that anchored the American work to the official statistics.</w:t>
+        <w:t xml:space="preserve">. The empirical design confronts this directly. An exit requires a change of employer, not only of occupational code. Interview flags that mark answers carried over from the previous year are used where available to remove spurious changes. Re-entries are modeled rather than ignored, since they are themselves an object of interest. Rates are estimated by pooling waves within country, profiles by harmonized regression models of the exit and return decisions, and every national estimate is validated against a set of twenty-five administrative benchmarks compiled for this proposal from ministries, statistical offices and teacher registers.</w:t>
       </w:r>
     </w:p>
     <w:p>
@@ -327,11 +295,11 @@
           <w:rFonts w:ascii="Garamond" w:cs="Garamond" w:eastAsia="Garamond" w:hAnsi="Garamond"/>
           <w:smallCaps/>
           <w:color w:val="2A5DB0"/>
-          <w:spacing w:val="24"/>
-          <w:sz w:val="21"/>
-          <w:szCs w:val="21"/>
-        </w:rPr>
-        <w:t xml:space="preserve">Access and deliverables</w:t>
+          <w:spacing w:val="20"/>
+          <w:sz w:val="22"/>
+          <w:szCs w:val="22"/>
+        </w:rPr>
+        <w:t xml:space="preserve">5.  Expected Contribution and Policy Relevance</w:t>
       </w:r>
     </w:p>
     <w:p>
@@ -346,7 +314,38 @@
           <w:sz w:val="22"/>
           <w:szCs w:val="22"/>
         </w:rPr>
-        <w:t xml:space="preserve">All seven studies are open to researchers at no or nominal cost through standard applications, and the harmonization code is public. Nothing in the project requires restricted licenses or special agreements, so every result can be replicated by anyone. The deliverables are a comparative report with the rates, the routes and the profiles, a public replication package that extends the Comparative Panel File, and short country notes for the systems where the findings speak to live debates on pay, pensions and family leave.</w:t>
+        <w:t xml:space="preserve">Three things would exist that do not exist today. The first is a set of attrition and return rates that can genuinely be compared across countries. The second is the profile behind each rate. Whether a system is losing young mothers, mid-career men, teachers in poor health or its best paid staff is precisely what a ministry needs to know before choosing among pensions, childcare, pay and workload as the lever, and it is unobservable in the data governments currently use. The third is the institutional reading. Attrition falls as civil-service protection rises across these seven countries. Profiles measured on a common footing would show what that protection buys, whom it retains, and at what cost, evidence that speaks directly to live debates on teacher pay, pension reform and family leave.</w:t>
+      </w:r>
+    </w:p>
+    <w:p>
+      <w:pPr>
+        <w:spacing w:after="90" w:before="240"/>
+      </w:pPr>
+      <w:r>
+        <w:rPr>
+          <w:rFonts w:ascii="Garamond" w:cs="Garamond" w:eastAsia="Garamond" w:hAnsi="Garamond"/>
+          <w:smallCaps/>
+          <w:color w:val="2A5DB0"/>
+          <w:spacing w:val="20"/>
+          <w:sz w:val="22"/>
+          <w:szCs w:val="22"/>
+        </w:rPr>
+        <w:t xml:space="preserve">6.  Work Plan and Deliverables</w:t>
+      </w:r>
+    </w:p>
+    <w:p>
+      <w:pPr>
+        <w:spacing w:after="70" w:line="300" w:lineRule="auto"/>
+        <w:jc w:val="both"/>
+      </w:pPr>
+      <w:r>
+        <w:rPr>
+          <w:rFonts w:ascii="Garamond" w:cs="Garamond" w:eastAsia="Garamond" w:hAnsi="Garamond"/>
+          <w:color w:val="1A2430"/>
+          <w:sz w:val="22"/>
+          <w:szCs w:val="22"/>
+        </w:rPr>
+        <w:t xml:space="preserve">All seven studies are open to researchers at no or nominal cost through standard applications, and the harmonization code is public, so every result can be replicated by anyone. Months one to three cover data access and the validation of the harmonized occupation codes. Months four to eight cover estimation of rates, routes and profiles. Months nine to twelve produce the outputs. The deliverables are a comparative report with the rates and profiles, a public replication package that extends the Comparative Panel File to the teaching profession, and short country notes for the systems where the findings bear on current policy discussions.</w:t>
       </w:r>
     </w:p>
     <w:p>
@@ -383,7 +382,7 @@
           <w:sz w:val="20"/>
           <w:szCs w:val="20"/>
         </w:rPr>
-        <w:t xml:space="preserve">Aldeman, C., and S. Yi (2025). “Are Teachers Abandoning Their Profession in Large Numbers?” Education Next.</w:t>
+        <w:t xml:space="preserve">Buckley, J., and S. Griselda (2025). “Who Stays, Who Goes? A New Look at Teacher Attrition Using Administrative Data.” e61 Institute Research Note.</w:t>
       </w:r>
     </w:p>
     <w:p>
@@ -398,37 +397,7 @@
           <w:sz w:val="20"/>
           <w:szCs w:val="20"/>
         </w:rPr>
-        <w:t xml:space="preserve">Buckley, J., and S. Griselda (2025). “Who Stays, Who Goes? A New Look at Teacher Attrition Using Administrative Data.” e61 Institute Research Note.</w:t>
-      </w:r>
-    </w:p>
-    <w:p>
-      <w:pPr>
-        <w:spacing w:after="120" w:line="276" w:lineRule="auto"/>
-        <w:ind w:left="420" w:hanging="420"/>
-      </w:pPr>
-      <w:r>
-        <w:rPr>
-          <w:rFonts w:ascii="Garamond" w:cs="Garamond" w:eastAsia="Garamond" w:hAnsi="Garamond"/>
-          <w:color w:val="1A2430"/>
-          <w:sz w:val="20"/>
-          <w:szCs w:val="20"/>
-        </w:rPr>
         <w:t xml:space="preserve">Goldring, R., S. Taie, and M. Riddles (2014). Teacher Attrition and Mobility: Results from the 2012–13 Teacher Follow-up Survey. NCES 2014-077, U.S. Department of Education.</w:t>
-      </w:r>
-    </w:p>
-    <w:p>
-      <w:pPr>
-        <w:spacing w:after="120" w:line="276" w:lineRule="auto"/>
-        <w:ind w:left="420" w:hanging="420"/>
-      </w:pPr>
-      <w:r>
-        <w:rPr>
-          <w:rFonts w:ascii="Garamond" w:cs="Garamond" w:eastAsia="Garamond" w:hAnsi="Garamond"/>
-          <w:color w:val="1A2430"/>
-          <w:sz w:val="20"/>
-          <w:szCs w:val="20"/>
-        </w:rPr>
-        <w:t xml:space="preserve">Harris, D., and S. Adams (2007). “Understanding the Level and Causes of Teacher Turnover: A Comparison with Other Professions.” Economics of Education Review 26(3), 325–337.</w:t>
       </w:r>
     </w:p>
     <w:p>

</xml_diff>

<commit_message>
Proposal: implement review comments
Motivation retold around the data problem rather than weak numbers,
objectives as an enumeration, data section opened from the surveys to
the CPF with a table of the seven panels, contribution linked to the
Unlocking Teachers Potential study, work plan removed.

Co-Authored-By: Claude Fable 5 <noreply@anthropic.com>
Claude-Session: https://claude.ai/code/session_01DNzQPDcr3zfLTraMHUHqUn
</commit_message>
<xml_diff>
--- a/report/cpf_proposal.docx
+++ b/report/cpf_proposal.docx
@@ -73,7 +73,7 @@
           <w:sz w:val="22"/>
           <w:szCs w:val="22"/>
         </w:rPr>
-        <w:t xml:space="preserve">1.  Motivation and Background</w:t>
+        <w:t xml:space="preserve">1.  Motivation</w:t>
       </w:r>
     </w:p>
     <w:p>
@@ -88,7 +88,25 @@
           <w:sz w:val="22"/>
           <w:szCs w:val="22"/>
         </w:rPr>
-        <w:t xml:space="preserve">Every few years, in almost every rich country, the public debate rediscovers that teachers are quitting. The numbers behind the alarm are usually weak. Some count teachers who merely changed schools. Some count intentions rather than behavior. Some count exits from the public system while the private sector absorbs the same people. To know how many teachers actually leave the classroom, and who they are, one must follow the same person over time. Very few statistics do that, and almost none do it in a way that can be compared across countries.</w:t>
+        <w:t xml:space="preserve">Teacher shortages are a real and growing concern across the OECD, yet the evidence on who leaves teaching is remarkably thin. Measuring attrition requires either longitudinal data that follow the same teachers over time or administrative records from the labor market, and both are scarce. Where dedicated teacher surveys exist, they are infrequent and closed. The reference instrument in the United States, the Teacher Follow-up Survey, runs only every four to five years, with gaps between waves, and its microdata are not public </w:t>
+      </w:r>
+      <w:r>
+        <w:rPr>
+          <w:rFonts w:ascii="Garamond" w:cs="Garamond" w:eastAsia="Garamond" w:hAnsi="Garamond"/>
+          <w:color w:val="2A5DB0"/>
+          <w:sz w:val="22"/>
+          <w:szCs w:val="22"/>
+        </w:rPr>
+        <w:t xml:space="preserve">(Goldring, Taie and Riddles 2014; NCES 2024)</w:t>
+      </w:r>
+      <w:r>
+        <w:rPr>
+          <w:rFonts w:ascii="Garamond" w:cs="Garamond" w:eastAsia="Garamond" w:hAnsi="Garamond"/>
+          <w:color w:val="1A2430"/>
+          <w:sz w:val="22"/>
+          <w:szCs w:val="22"/>
+        </w:rPr>
+        <w:t xml:space="preserve">. The official reports built on such data are therefore the ceiling of what is known. Far deeper characterizations of who leaves, and of who comes back, would be possible if the underlying data were open.</w:t>
       </w:r>
     </w:p>
     <w:p>
@@ -103,7 +121,7 @@
           <w:sz w:val="22"/>
           <w:szCs w:val="22"/>
         </w:rPr>
-        <w:t xml:space="preserve">The existing measurement landscape has two pillars, and both fall short of that standard. Administrative registers count teachers well but stop at the school door. They carry little beyond age and sex, record no destinations and no returns. Dedicated follow-up surveys are richer but run only every four or five years, their microdata are restricted, and no two countries field the same one </w:t>
+        <w:t xml:space="preserve">The consequence is a policy debate running ahead of its evidence. Annual attrition figures range from about two percent in South Korea to about nine percent in England, but every national statistic measures a different object, so the numbers cannot be compared and a shared problem is being addressed with uncoordinated evidence </w:t>
       </w:r>
       <w:r>
         <w:rPr>
@@ -112,24 +130,6 @@
           <w:sz w:val="22"/>
           <w:szCs w:val="22"/>
         </w:rPr>
-        <w:t xml:space="preserve">(Goldring, Taie and Riddles 2014; NCES 2024)</w:t>
-      </w:r>
-      <w:r>
-        <w:rPr>
-          <w:rFonts w:ascii="Garamond" w:cs="Garamond" w:eastAsia="Garamond" w:hAnsi="Garamond"/>
-          <w:color w:val="1A2430"/>
-          <w:sz w:val="22"/>
-          <w:szCs w:val="22"/>
-        </w:rPr>
-        <w:t xml:space="preserve">. The result is that annual attrition figures range from about two percent in South Korea to about nine percent in England, yet every national statistic measures a different object, so the published numbers cannot be compared, and teacher shortages remain a shared concern addressed with uncoordinated evidence </w:t>
-      </w:r>
-      <w:r>
-        <w:rPr>
-          <w:rFonts w:ascii="Garamond" w:cs="Garamond" w:eastAsia="Garamond" w:hAnsi="Garamond"/>
-          <w:color w:val="2A5DB0"/>
-          <w:sz w:val="22"/>
-          <w:szCs w:val="22"/>
-        </w:rPr>
         <w:t xml:space="preserve">(OECD 2025)</w:t>
       </w:r>
       <w:r>
@@ -139,7 +139,7 @@
           <w:sz w:val="22"/>
           <w:szCs w:val="22"/>
         </w:rPr>
-        <w:t xml:space="preserve">.</w:t>
+        <w:t xml:space="preserve">. Longitudinal household surveys that exist in several countries at once are a unique and largely unused opportunity to change this. They follow the same people for decades, they record the family, income and health context that administrative data never see, and they allow rich detail on the profile of the leaver and the returner. A serious international debate on teacher attrition needs the insight they can provide.</w:t>
       </w:r>
     </w:p>
     <w:p>
@@ -170,7 +170,55 @@
           <w:sz w:val="22"/>
           <w:szCs w:val="22"/>
         </w:rPr>
-        <w:t xml:space="preserve">The project has three objectives. First, to estimate teacher attrition and re-entry rates for seven countries under a single, common definition, decomposed by destination, namely another job, unemployment, or withdrawal from the labor force. Second, to characterize the socioeconomic profile of the teachers who leave and of those who return, using identical variables in every country. Third, to link the cross-country differences in rates and profiles to institutional differences in job protection, pay and family policy, so the comparison speaks to the levers governments actually control.</w:t>
+        <w:t xml:space="preserve">The project has three objectives.</w:t>
+      </w:r>
+    </w:p>
+    <w:p>
+      <w:pPr>
+        <w:spacing w:after="50" w:line="300" w:lineRule="auto"/>
+        <w:ind w:left="400" w:hanging="280"/>
+        <w:jc w:val="both"/>
+      </w:pPr>
+      <w:r>
+        <w:rPr>
+          <w:rFonts w:ascii="Garamond" w:cs="Garamond" w:eastAsia="Garamond" w:hAnsi="Garamond"/>
+          <w:color w:val="1A2430"/>
+          <w:sz w:val="22"/>
+          <w:szCs w:val="22"/>
+        </w:rPr>
+        <w:t xml:space="preserve">1.  To estimate teacher attrition and re-entry rates for seven countries under a single, common definition, decomposed by destination, namely another job, unemployment, or withdrawal from the labor force.</w:t>
+      </w:r>
+    </w:p>
+    <w:p>
+      <w:pPr>
+        <w:spacing w:after="50" w:line="300" w:lineRule="auto"/>
+        <w:ind w:left="400" w:hanging="280"/>
+        <w:jc w:val="both"/>
+      </w:pPr>
+      <w:r>
+        <w:rPr>
+          <w:rFonts w:ascii="Garamond" w:cs="Garamond" w:eastAsia="Garamond" w:hAnsi="Garamond"/>
+          <w:color w:val="1A2430"/>
+          <w:sz w:val="22"/>
+          <w:szCs w:val="22"/>
+        </w:rPr>
+        <w:t xml:space="preserve">2.  To characterize the socioeconomic profile of the teachers who leave and of those who return, using identical variables in every country.</w:t>
+      </w:r>
+    </w:p>
+    <w:p>
+      <w:pPr>
+        <w:spacing w:after="50" w:line="300" w:lineRule="auto"/>
+        <w:ind w:left="400" w:hanging="280"/>
+        <w:jc w:val="both"/>
+      </w:pPr>
+      <w:r>
+        <w:rPr>
+          <w:rFonts w:ascii="Garamond" w:cs="Garamond" w:eastAsia="Garamond" w:hAnsi="Garamond"/>
+          <w:color w:val="1A2430"/>
+          <w:sz w:val="22"/>
+          <w:szCs w:val="22"/>
+        </w:rPr>
+        <w:t xml:space="preserve">3.  To link cross-country differences in rates and profiles to institutional differences in job protection, pay and family policy, so the comparison speaks to the levers governments control.</w:t>
       </w:r>
     </w:p>
     <w:p>
@@ -201,7 +249,7 @@
           <w:sz w:val="22"/>
           <w:szCs w:val="22"/>
         </w:rPr>
-        <w:t xml:space="preserve">The United States, the United Kingdom, Germany, Australia, South Korea, Russia and Switzerland all run a study of the same rare kind. A few thousand households are interviewed every year, in the American case since 1968, about their jobs, incomes, partners, children and health. Because the same people answer year after year, these studies watch careers unfold in a way no snapshot can. They are called household panels. Each has its own name, questionnaire and coding, which is why they have rarely been used together. The Comparative Panel File harmonizes the seven into one open structure with identical variables for employment, income, family and wellbeing </w:t>
+        <w:t xml:space="preserve">Several countries run an annual longitudinal survey that follows a representative sample of households over decades, asking about jobs, incomes, partners, children and health. Because the same people answer year after year, these studies watch careers unfold in a way no snapshot can. The Comparative Panel File (CPF) is an academic initiative that harmonizes the seven longest-running of these panels into one open structure with identical variables for employment, income, family and wellbeing </w:t>
       </w:r>
       <w:r>
         <w:rPr>
@@ -221,6 +269,966 @@
         </w:rPr>
         <w:t xml:space="preserve">. It has been used to study retirement, divorce and unemployment across countries. It has never been used for teachers.</w:t>
       </w:r>
+    </w:p>
+    <w:p>
+      <w:pPr>
+        <w:spacing w:after="40" w:before="60"/>
+      </w:pPr>
+      <w:r>
+        <w:rPr>
+          <w:rFonts w:ascii="Garamond" w:cs="Garamond" w:eastAsia="Garamond" w:hAnsi="Garamond"/>
+          <w:i/>
+          <w:iCs/>
+          <w:color w:val="5A6572"/>
+          <w:sz w:val="20"/>
+          <w:szCs w:val="20"/>
+        </w:rPr>
+        <w:t xml:space="preserve">Table 1. The seven household panels of the Comparative Panel File</w:t>
+      </w:r>
+    </w:p>
+    <w:tbl>
+      <w:tblPr>
+        <w:tblW w:type="dxa" w:w="9400"/>
+        <w:tblBorders>
+          <w:top w:val="single" w:color="auto" w:sz="4"/>
+          <w:left w:val="single" w:color="auto" w:sz="4"/>
+          <w:bottom w:val="single" w:color="auto" w:sz="4"/>
+          <w:right w:val="single" w:color="auto" w:sz="4"/>
+          <w:insideH w:val="single" w:color="auto" w:sz="4"/>
+          <w:insideV w:val="single" w:color="auto" w:sz="4"/>
+        </w:tblBorders>
+      </w:tblPr>
+      <w:tblGrid>
+        <w:gridCol w:w="2700"/>
+        <w:gridCol w:w="3300"/>
+        <w:gridCol w:w="1500"/>
+        <w:gridCol w:w="1900"/>
+      </w:tblGrid>
+      <w:tr>
+        <w:tc>
+          <w:tcPr>
+            <w:tcW w:type="dxa" w:w="2700"/>
+            <w:tcBorders>
+              <w:top w:val="single" w:color="1A2430" w:sz="6"/>
+              <w:left w:val="none" w:color="FFFFFF" w:sz="0"/>
+              <w:bottom w:val="single" w:color="1A2430" w:sz="6"/>
+              <w:right w:val="none" w:color="FFFFFF" w:sz="0"/>
+            </w:tcBorders>
+            <w:tcMar>
+              <w:top w:type="dxa" w:w="40"/>
+              <w:left w:type="dxa" w:w="60"/>
+              <w:bottom w:type="dxa" w:w="40"/>
+              <w:right w:type="dxa" w:w="60"/>
+            </w:tcMar>
+          </w:tcPr>
+          <w:p>
+            <w:r>
+              <w:rPr>
+                <w:rFonts w:ascii="Garamond" w:cs="Garamond" w:eastAsia="Garamond" w:hAnsi="Garamond"/>
+                <w:b/>
+                <w:bCs/>
+                <w:color w:val="1A2430"/>
+                <w:sz w:val="20"/>
+                <w:szCs w:val="20"/>
+              </w:rPr>
+              <w:t xml:space="preserve">Country</w:t>
+            </w:r>
+          </w:p>
+        </w:tc>
+        <w:tc>
+          <w:tcPr>
+            <w:tcW w:type="dxa" w:w="3300"/>
+            <w:tcBorders>
+              <w:top w:val="single" w:color="1A2430" w:sz="6"/>
+              <w:left w:val="none" w:color="FFFFFF" w:sz="0"/>
+              <w:bottom w:val="single" w:color="1A2430" w:sz="6"/>
+              <w:right w:val="none" w:color="FFFFFF" w:sz="0"/>
+            </w:tcBorders>
+            <w:tcMar>
+              <w:top w:type="dxa" w:w="40"/>
+              <w:left w:type="dxa" w:w="60"/>
+              <w:bottom w:type="dxa" w:w="40"/>
+              <w:right w:type="dxa" w:w="60"/>
+            </w:tcMar>
+          </w:tcPr>
+          <w:p>
+            <w:r>
+              <w:rPr>
+                <w:rFonts w:ascii="Garamond" w:cs="Garamond" w:eastAsia="Garamond" w:hAnsi="Garamond"/>
+                <w:b/>
+                <w:bCs/>
+                <w:color w:val="1A2430"/>
+                <w:sz w:val="20"/>
+                <w:szCs w:val="20"/>
+              </w:rPr>
+              <w:t xml:space="preserve">Household panel</w:t>
+            </w:r>
+          </w:p>
+        </w:tc>
+        <w:tc>
+          <w:tcPr>
+            <w:tcW w:type="dxa" w:w="1500"/>
+            <w:tcBorders>
+              <w:top w:val="single" w:color="1A2430" w:sz="6"/>
+              <w:left w:val="none" w:color="FFFFFF" w:sz="0"/>
+              <w:bottom w:val="single" w:color="1A2430" w:sz="6"/>
+              <w:right w:val="none" w:color="FFFFFF" w:sz="0"/>
+            </w:tcBorders>
+            <w:tcMar>
+              <w:top w:type="dxa" w:w="40"/>
+              <w:left w:type="dxa" w:w="60"/>
+              <w:bottom w:type="dxa" w:w="40"/>
+              <w:right w:type="dxa" w:w="60"/>
+            </w:tcMar>
+          </w:tcPr>
+          <w:p>
+            <w:r>
+              <w:rPr>
+                <w:rFonts w:ascii="Garamond" w:cs="Garamond" w:eastAsia="Garamond" w:hAnsi="Garamond"/>
+                <w:b/>
+                <w:bCs/>
+                <w:color w:val="1A2430"/>
+                <w:sz w:val="20"/>
+                <w:szCs w:val="20"/>
+              </w:rPr>
+              <w:t xml:space="preserve">Since</w:t>
+            </w:r>
+          </w:p>
+        </w:tc>
+        <w:tc>
+          <w:tcPr>
+            <w:tcW w:type="dxa" w:w="1900"/>
+            <w:tcBorders>
+              <w:top w:val="single" w:color="1A2430" w:sz="6"/>
+              <w:left w:val="none" w:color="FFFFFF" w:sz="0"/>
+              <w:bottom w:val="single" w:color="1A2430" w:sz="6"/>
+              <w:right w:val="none" w:color="FFFFFF" w:sz="0"/>
+            </w:tcBorders>
+            <w:tcMar>
+              <w:top w:type="dxa" w:w="40"/>
+              <w:left w:type="dxa" w:w="60"/>
+              <w:bottom w:type="dxa" w:w="40"/>
+              <w:right w:type="dxa" w:w="60"/>
+            </w:tcMar>
+          </w:tcPr>
+          <w:p>
+            <w:r>
+              <w:rPr>
+                <w:rFonts w:ascii="Garamond" w:cs="Garamond" w:eastAsia="Garamond" w:hAnsi="Garamond"/>
+                <w:b/>
+                <w:bCs/>
+                <w:color w:val="1A2430"/>
+                <w:sz w:val="20"/>
+                <w:szCs w:val="20"/>
+              </w:rPr>
+              <w:t xml:space="preserve">Households per wave</w:t>
+            </w:r>
+          </w:p>
+        </w:tc>
+      </w:tr>
+      <w:tr>
+        <w:tc>
+          <w:tcPr>
+            <w:tcW w:type="dxa" w:w="2700"/>
+            <w:tcBorders>
+              <w:top w:val="none" w:color="FFFFFF" w:sz="0"/>
+              <w:left w:val="none" w:color="FFFFFF" w:sz="0"/>
+              <w:bottom w:val="none" w:color="FFFFFF" w:sz="0"/>
+              <w:right w:val="none" w:color="FFFFFF" w:sz="0"/>
+            </w:tcBorders>
+            <w:tcMar>
+              <w:top w:type="dxa" w:w="40"/>
+              <w:left w:type="dxa" w:w="60"/>
+              <w:bottom w:type="dxa" w:w="40"/>
+              <w:right w:type="dxa" w:w="60"/>
+            </w:tcMar>
+          </w:tcPr>
+          <w:p>
+            <w:r>
+              <w:rPr>
+                <w:rFonts w:ascii="Garamond" w:cs="Garamond" w:eastAsia="Garamond" w:hAnsi="Garamond"/>
+                <w:color w:val="1A2430"/>
+                <w:sz w:val="20"/>
+                <w:szCs w:val="20"/>
+              </w:rPr>
+              <w:t xml:space="preserve">United States</w:t>
+            </w:r>
+          </w:p>
+        </w:tc>
+        <w:tc>
+          <w:tcPr>
+            <w:tcW w:type="dxa" w:w="3300"/>
+            <w:tcBorders>
+              <w:top w:val="none" w:color="FFFFFF" w:sz="0"/>
+              <w:left w:val="none" w:color="FFFFFF" w:sz="0"/>
+              <w:bottom w:val="none" w:color="FFFFFF" w:sz="0"/>
+              <w:right w:val="none" w:color="FFFFFF" w:sz="0"/>
+            </w:tcBorders>
+            <w:tcMar>
+              <w:top w:type="dxa" w:w="40"/>
+              <w:left w:type="dxa" w:w="60"/>
+              <w:bottom w:type="dxa" w:w="40"/>
+              <w:right w:type="dxa" w:w="60"/>
+            </w:tcMar>
+          </w:tcPr>
+          <w:p>
+            <w:r>
+              <w:rPr>
+                <w:rFonts w:ascii="Garamond" w:cs="Garamond" w:eastAsia="Garamond" w:hAnsi="Garamond"/>
+                <w:color w:val="1A2430"/>
+                <w:sz w:val="20"/>
+                <w:szCs w:val="20"/>
+              </w:rPr>
+              <w:t xml:space="preserve">PSID</w:t>
+            </w:r>
+          </w:p>
+        </w:tc>
+        <w:tc>
+          <w:tcPr>
+            <w:tcW w:type="dxa" w:w="1500"/>
+            <w:tcBorders>
+              <w:top w:val="none" w:color="FFFFFF" w:sz="0"/>
+              <w:left w:val="none" w:color="FFFFFF" w:sz="0"/>
+              <w:bottom w:val="none" w:color="FFFFFF" w:sz="0"/>
+              <w:right w:val="none" w:color="FFFFFF" w:sz="0"/>
+            </w:tcBorders>
+            <w:tcMar>
+              <w:top w:type="dxa" w:w="40"/>
+              <w:left w:type="dxa" w:w="60"/>
+              <w:bottom w:type="dxa" w:w="40"/>
+              <w:right w:type="dxa" w:w="60"/>
+            </w:tcMar>
+          </w:tcPr>
+          <w:p>
+            <w:r>
+              <w:rPr>
+                <w:rFonts w:ascii="Garamond" w:cs="Garamond" w:eastAsia="Garamond" w:hAnsi="Garamond"/>
+                <w:color w:val="1A2430"/>
+                <w:sz w:val="20"/>
+                <w:szCs w:val="20"/>
+              </w:rPr>
+              <w:t xml:space="preserve">1968</w:t>
+            </w:r>
+          </w:p>
+        </w:tc>
+        <w:tc>
+          <w:tcPr>
+            <w:tcW w:type="dxa" w:w="1900"/>
+            <w:tcBorders>
+              <w:top w:val="none" w:color="FFFFFF" w:sz="0"/>
+              <w:left w:val="none" w:color="FFFFFF" w:sz="0"/>
+              <w:bottom w:val="none" w:color="FFFFFF" w:sz="0"/>
+              <w:right w:val="none" w:color="FFFFFF" w:sz="0"/>
+            </w:tcBorders>
+            <w:tcMar>
+              <w:top w:type="dxa" w:w="40"/>
+              <w:left w:type="dxa" w:w="60"/>
+              <w:bottom w:type="dxa" w:w="40"/>
+              <w:right w:type="dxa" w:w="60"/>
+            </w:tcMar>
+          </w:tcPr>
+          <w:p>
+            <w:r>
+              <w:rPr>
+                <w:rFonts w:ascii="Garamond" w:cs="Garamond" w:eastAsia="Garamond" w:hAnsi="Garamond"/>
+                <w:color w:val="1A2430"/>
+                <w:sz w:val="20"/>
+                <w:szCs w:val="20"/>
+              </w:rPr>
+              <w:t xml:space="preserve">≈ 9,000</w:t>
+            </w:r>
+          </w:p>
+        </w:tc>
+      </w:tr>
+      <w:tr>
+        <w:tc>
+          <w:tcPr>
+            <w:tcW w:type="dxa" w:w="2700"/>
+            <w:tcBorders>
+              <w:top w:val="none" w:color="FFFFFF" w:sz="0"/>
+              <w:left w:val="none" w:color="FFFFFF" w:sz="0"/>
+              <w:bottom w:val="none" w:color="FFFFFF" w:sz="0"/>
+              <w:right w:val="none" w:color="FFFFFF" w:sz="0"/>
+            </w:tcBorders>
+            <w:tcMar>
+              <w:top w:type="dxa" w:w="40"/>
+              <w:left w:type="dxa" w:w="60"/>
+              <w:bottom w:type="dxa" w:w="40"/>
+              <w:right w:type="dxa" w:w="60"/>
+            </w:tcMar>
+          </w:tcPr>
+          <w:p>
+            <w:r>
+              <w:rPr>
+                <w:rFonts w:ascii="Garamond" w:cs="Garamond" w:eastAsia="Garamond" w:hAnsi="Garamond"/>
+                <w:color w:val="1A2430"/>
+                <w:sz w:val="20"/>
+                <w:szCs w:val="20"/>
+              </w:rPr>
+              <w:t xml:space="preserve">Germany</w:t>
+            </w:r>
+          </w:p>
+        </w:tc>
+        <w:tc>
+          <w:tcPr>
+            <w:tcW w:type="dxa" w:w="3300"/>
+            <w:tcBorders>
+              <w:top w:val="none" w:color="FFFFFF" w:sz="0"/>
+              <w:left w:val="none" w:color="FFFFFF" w:sz="0"/>
+              <w:bottom w:val="none" w:color="FFFFFF" w:sz="0"/>
+              <w:right w:val="none" w:color="FFFFFF" w:sz="0"/>
+            </w:tcBorders>
+            <w:tcMar>
+              <w:top w:type="dxa" w:w="40"/>
+              <w:left w:type="dxa" w:w="60"/>
+              <w:bottom w:type="dxa" w:w="40"/>
+              <w:right w:type="dxa" w:w="60"/>
+            </w:tcMar>
+          </w:tcPr>
+          <w:p>
+            <w:r>
+              <w:rPr>
+                <w:rFonts w:ascii="Garamond" w:cs="Garamond" w:eastAsia="Garamond" w:hAnsi="Garamond"/>
+                <w:color w:val="1A2430"/>
+                <w:sz w:val="20"/>
+                <w:szCs w:val="20"/>
+              </w:rPr>
+              <w:t xml:space="preserve">SOEP</w:t>
+            </w:r>
+          </w:p>
+        </w:tc>
+        <w:tc>
+          <w:tcPr>
+            <w:tcW w:type="dxa" w:w="1500"/>
+            <w:tcBorders>
+              <w:top w:val="none" w:color="FFFFFF" w:sz="0"/>
+              <w:left w:val="none" w:color="FFFFFF" w:sz="0"/>
+              <w:bottom w:val="none" w:color="FFFFFF" w:sz="0"/>
+              <w:right w:val="none" w:color="FFFFFF" w:sz="0"/>
+            </w:tcBorders>
+            <w:tcMar>
+              <w:top w:type="dxa" w:w="40"/>
+              <w:left w:type="dxa" w:w="60"/>
+              <w:bottom w:type="dxa" w:w="40"/>
+              <w:right w:type="dxa" w:w="60"/>
+            </w:tcMar>
+          </w:tcPr>
+          <w:p>
+            <w:r>
+              <w:rPr>
+                <w:rFonts w:ascii="Garamond" w:cs="Garamond" w:eastAsia="Garamond" w:hAnsi="Garamond"/>
+                <w:color w:val="1A2430"/>
+                <w:sz w:val="20"/>
+                <w:szCs w:val="20"/>
+              </w:rPr>
+              <w:t xml:space="preserve">1984</w:t>
+            </w:r>
+          </w:p>
+        </w:tc>
+        <w:tc>
+          <w:tcPr>
+            <w:tcW w:type="dxa" w:w="1900"/>
+            <w:tcBorders>
+              <w:top w:val="none" w:color="FFFFFF" w:sz="0"/>
+              <w:left w:val="none" w:color="FFFFFF" w:sz="0"/>
+              <w:bottom w:val="none" w:color="FFFFFF" w:sz="0"/>
+              <w:right w:val="none" w:color="FFFFFF" w:sz="0"/>
+            </w:tcBorders>
+            <w:tcMar>
+              <w:top w:type="dxa" w:w="40"/>
+              <w:left w:type="dxa" w:w="60"/>
+              <w:bottom w:type="dxa" w:w="40"/>
+              <w:right w:type="dxa" w:w="60"/>
+            </w:tcMar>
+          </w:tcPr>
+          <w:p>
+            <w:r>
+              <w:rPr>
+                <w:rFonts w:ascii="Garamond" w:cs="Garamond" w:eastAsia="Garamond" w:hAnsi="Garamond"/>
+                <w:color w:val="1A2430"/>
+                <w:sz w:val="20"/>
+                <w:szCs w:val="20"/>
+              </w:rPr>
+              <w:t xml:space="preserve">≈ 15,000</w:t>
+            </w:r>
+          </w:p>
+        </w:tc>
+      </w:tr>
+      <w:tr>
+        <w:tc>
+          <w:tcPr>
+            <w:tcW w:type="dxa" w:w="2700"/>
+            <w:tcBorders>
+              <w:top w:val="none" w:color="FFFFFF" w:sz="0"/>
+              <w:left w:val="none" w:color="FFFFFF" w:sz="0"/>
+              <w:bottom w:val="none" w:color="FFFFFF" w:sz="0"/>
+              <w:right w:val="none" w:color="FFFFFF" w:sz="0"/>
+            </w:tcBorders>
+            <w:tcMar>
+              <w:top w:type="dxa" w:w="40"/>
+              <w:left w:type="dxa" w:w="60"/>
+              <w:bottom w:type="dxa" w:w="40"/>
+              <w:right w:type="dxa" w:w="60"/>
+            </w:tcMar>
+          </w:tcPr>
+          <w:p>
+            <w:r>
+              <w:rPr>
+                <w:rFonts w:ascii="Garamond" w:cs="Garamond" w:eastAsia="Garamond" w:hAnsi="Garamond"/>
+                <w:color w:val="1A2430"/>
+                <w:sz w:val="20"/>
+                <w:szCs w:val="20"/>
+              </w:rPr>
+              <w:t xml:space="preserve">United Kingdom</w:t>
+            </w:r>
+          </w:p>
+        </w:tc>
+        <w:tc>
+          <w:tcPr>
+            <w:tcW w:type="dxa" w:w="3300"/>
+            <w:tcBorders>
+              <w:top w:val="none" w:color="FFFFFF" w:sz="0"/>
+              <w:left w:val="none" w:color="FFFFFF" w:sz="0"/>
+              <w:bottom w:val="none" w:color="FFFFFF" w:sz="0"/>
+              <w:right w:val="none" w:color="FFFFFF" w:sz="0"/>
+            </w:tcBorders>
+            <w:tcMar>
+              <w:top w:type="dxa" w:w="40"/>
+              <w:left w:type="dxa" w:w="60"/>
+              <w:bottom w:type="dxa" w:w="40"/>
+              <w:right w:type="dxa" w:w="60"/>
+            </w:tcMar>
+          </w:tcPr>
+          <w:p>
+            <w:r>
+              <w:rPr>
+                <w:rFonts w:ascii="Garamond" w:cs="Garamond" w:eastAsia="Garamond" w:hAnsi="Garamond"/>
+                <w:color w:val="1A2430"/>
+                <w:sz w:val="20"/>
+                <w:szCs w:val="20"/>
+              </w:rPr>
+              <w:t xml:space="preserve">BHPS, then Understanding Society</w:t>
+            </w:r>
+          </w:p>
+        </w:tc>
+        <w:tc>
+          <w:tcPr>
+            <w:tcW w:type="dxa" w:w="1500"/>
+            <w:tcBorders>
+              <w:top w:val="none" w:color="FFFFFF" w:sz="0"/>
+              <w:left w:val="none" w:color="FFFFFF" w:sz="0"/>
+              <w:bottom w:val="none" w:color="FFFFFF" w:sz="0"/>
+              <w:right w:val="none" w:color="FFFFFF" w:sz="0"/>
+            </w:tcBorders>
+            <w:tcMar>
+              <w:top w:type="dxa" w:w="40"/>
+              <w:left w:type="dxa" w:w="60"/>
+              <w:bottom w:type="dxa" w:w="40"/>
+              <w:right w:type="dxa" w:w="60"/>
+            </w:tcMar>
+          </w:tcPr>
+          <w:p>
+            <w:r>
+              <w:rPr>
+                <w:rFonts w:ascii="Garamond" w:cs="Garamond" w:eastAsia="Garamond" w:hAnsi="Garamond"/>
+                <w:color w:val="1A2430"/>
+                <w:sz w:val="20"/>
+                <w:szCs w:val="20"/>
+              </w:rPr>
+              <w:t xml:space="preserve">1991</w:t>
+            </w:r>
+          </w:p>
+        </w:tc>
+        <w:tc>
+          <w:tcPr>
+            <w:tcW w:type="dxa" w:w="1900"/>
+            <w:tcBorders>
+              <w:top w:val="none" w:color="FFFFFF" w:sz="0"/>
+              <w:left w:val="none" w:color="FFFFFF" w:sz="0"/>
+              <w:bottom w:val="none" w:color="FFFFFF" w:sz="0"/>
+              <w:right w:val="none" w:color="FFFFFF" w:sz="0"/>
+            </w:tcBorders>
+            <w:tcMar>
+              <w:top w:type="dxa" w:w="40"/>
+              <w:left w:type="dxa" w:w="60"/>
+              <w:bottom w:type="dxa" w:w="40"/>
+              <w:right w:type="dxa" w:w="60"/>
+            </w:tcMar>
+          </w:tcPr>
+          <w:p>
+            <w:r>
+              <w:rPr>
+                <w:rFonts w:ascii="Garamond" w:cs="Garamond" w:eastAsia="Garamond" w:hAnsi="Garamond"/>
+                <w:color w:val="1A2430"/>
+                <w:sz w:val="20"/>
+                <w:szCs w:val="20"/>
+              </w:rPr>
+              <w:t xml:space="preserve">≈ 30,000</w:t>
+            </w:r>
+          </w:p>
+        </w:tc>
+      </w:tr>
+      <w:tr>
+        <w:tc>
+          <w:tcPr>
+            <w:tcW w:type="dxa" w:w="2700"/>
+            <w:tcBorders>
+              <w:top w:val="none" w:color="FFFFFF" w:sz="0"/>
+              <w:left w:val="none" w:color="FFFFFF" w:sz="0"/>
+              <w:bottom w:val="none" w:color="FFFFFF" w:sz="0"/>
+              <w:right w:val="none" w:color="FFFFFF" w:sz="0"/>
+            </w:tcBorders>
+            <w:tcMar>
+              <w:top w:type="dxa" w:w="40"/>
+              <w:left w:type="dxa" w:w="60"/>
+              <w:bottom w:type="dxa" w:w="40"/>
+              <w:right w:type="dxa" w:w="60"/>
+            </w:tcMar>
+          </w:tcPr>
+          <w:p>
+            <w:r>
+              <w:rPr>
+                <w:rFonts w:ascii="Garamond" w:cs="Garamond" w:eastAsia="Garamond" w:hAnsi="Garamond"/>
+                <w:color w:val="1A2430"/>
+                <w:sz w:val="20"/>
+                <w:szCs w:val="20"/>
+              </w:rPr>
+              <w:t xml:space="preserve">Russia</w:t>
+            </w:r>
+          </w:p>
+        </w:tc>
+        <w:tc>
+          <w:tcPr>
+            <w:tcW w:type="dxa" w:w="3300"/>
+            <w:tcBorders>
+              <w:top w:val="none" w:color="FFFFFF" w:sz="0"/>
+              <w:left w:val="none" w:color="FFFFFF" w:sz="0"/>
+              <w:bottom w:val="none" w:color="FFFFFF" w:sz="0"/>
+              <w:right w:val="none" w:color="FFFFFF" w:sz="0"/>
+            </w:tcBorders>
+            <w:tcMar>
+              <w:top w:type="dxa" w:w="40"/>
+              <w:left w:type="dxa" w:w="60"/>
+              <w:bottom w:type="dxa" w:w="40"/>
+              <w:right w:type="dxa" w:w="60"/>
+            </w:tcMar>
+          </w:tcPr>
+          <w:p>
+            <w:r>
+              <w:rPr>
+                <w:rFonts w:ascii="Garamond" w:cs="Garamond" w:eastAsia="Garamond" w:hAnsi="Garamond"/>
+                <w:color w:val="1A2430"/>
+                <w:sz w:val="20"/>
+                <w:szCs w:val="20"/>
+              </w:rPr>
+              <w:t xml:space="preserve">RLMS-HSE</w:t>
+            </w:r>
+          </w:p>
+        </w:tc>
+        <w:tc>
+          <w:tcPr>
+            <w:tcW w:type="dxa" w:w="1500"/>
+            <w:tcBorders>
+              <w:top w:val="none" w:color="FFFFFF" w:sz="0"/>
+              <w:left w:val="none" w:color="FFFFFF" w:sz="0"/>
+              <w:bottom w:val="none" w:color="FFFFFF" w:sz="0"/>
+              <w:right w:val="none" w:color="FFFFFF" w:sz="0"/>
+            </w:tcBorders>
+            <w:tcMar>
+              <w:top w:type="dxa" w:w="40"/>
+              <w:left w:type="dxa" w:w="60"/>
+              <w:bottom w:type="dxa" w:w="40"/>
+              <w:right w:type="dxa" w:w="60"/>
+            </w:tcMar>
+          </w:tcPr>
+          <w:p>
+            <w:r>
+              <w:rPr>
+                <w:rFonts w:ascii="Garamond" w:cs="Garamond" w:eastAsia="Garamond" w:hAnsi="Garamond"/>
+                <w:color w:val="1A2430"/>
+                <w:sz w:val="20"/>
+                <w:szCs w:val="20"/>
+              </w:rPr>
+              <w:t xml:space="preserve">1994</w:t>
+            </w:r>
+          </w:p>
+        </w:tc>
+        <w:tc>
+          <w:tcPr>
+            <w:tcW w:type="dxa" w:w="1900"/>
+            <w:tcBorders>
+              <w:top w:val="none" w:color="FFFFFF" w:sz="0"/>
+              <w:left w:val="none" w:color="FFFFFF" w:sz="0"/>
+              <w:bottom w:val="none" w:color="FFFFFF" w:sz="0"/>
+              <w:right w:val="none" w:color="FFFFFF" w:sz="0"/>
+            </w:tcBorders>
+            <w:tcMar>
+              <w:top w:type="dxa" w:w="40"/>
+              <w:left w:type="dxa" w:w="60"/>
+              <w:bottom w:type="dxa" w:w="40"/>
+              <w:right w:type="dxa" w:w="60"/>
+            </w:tcMar>
+          </w:tcPr>
+          <w:p>
+            <w:r>
+              <w:rPr>
+                <w:rFonts w:ascii="Garamond" w:cs="Garamond" w:eastAsia="Garamond" w:hAnsi="Garamond"/>
+                <w:color w:val="1A2430"/>
+                <w:sz w:val="20"/>
+                <w:szCs w:val="20"/>
+              </w:rPr>
+              <w:t xml:space="preserve">≈ 4,500</w:t>
+            </w:r>
+          </w:p>
+        </w:tc>
+      </w:tr>
+      <w:tr>
+        <w:tc>
+          <w:tcPr>
+            <w:tcW w:type="dxa" w:w="2700"/>
+            <w:tcBorders>
+              <w:top w:val="none" w:color="FFFFFF" w:sz="0"/>
+              <w:left w:val="none" w:color="FFFFFF" w:sz="0"/>
+              <w:bottom w:val="none" w:color="FFFFFF" w:sz="0"/>
+              <w:right w:val="none" w:color="FFFFFF" w:sz="0"/>
+            </w:tcBorders>
+            <w:tcMar>
+              <w:top w:type="dxa" w:w="40"/>
+              <w:left w:type="dxa" w:w="60"/>
+              <w:bottom w:type="dxa" w:w="40"/>
+              <w:right w:type="dxa" w:w="60"/>
+            </w:tcMar>
+          </w:tcPr>
+          <w:p>
+            <w:r>
+              <w:rPr>
+                <w:rFonts w:ascii="Garamond" w:cs="Garamond" w:eastAsia="Garamond" w:hAnsi="Garamond"/>
+                <w:color w:val="1A2430"/>
+                <w:sz w:val="20"/>
+                <w:szCs w:val="20"/>
+              </w:rPr>
+              <w:t xml:space="preserve">South Korea</w:t>
+            </w:r>
+          </w:p>
+        </w:tc>
+        <w:tc>
+          <w:tcPr>
+            <w:tcW w:type="dxa" w:w="3300"/>
+            <w:tcBorders>
+              <w:top w:val="none" w:color="FFFFFF" w:sz="0"/>
+              <w:left w:val="none" w:color="FFFFFF" w:sz="0"/>
+              <w:bottom w:val="none" w:color="FFFFFF" w:sz="0"/>
+              <w:right w:val="none" w:color="FFFFFF" w:sz="0"/>
+            </w:tcBorders>
+            <w:tcMar>
+              <w:top w:type="dxa" w:w="40"/>
+              <w:left w:type="dxa" w:w="60"/>
+              <w:bottom w:type="dxa" w:w="40"/>
+              <w:right w:type="dxa" w:w="60"/>
+            </w:tcMar>
+          </w:tcPr>
+          <w:p>
+            <w:r>
+              <w:rPr>
+                <w:rFonts w:ascii="Garamond" w:cs="Garamond" w:eastAsia="Garamond" w:hAnsi="Garamond"/>
+                <w:color w:val="1A2430"/>
+                <w:sz w:val="20"/>
+                <w:szCs w:val="20"/>
+              </w:rPr>
+              <w:t xml:space="preserve">KLIPS</w:t>
+            </w:r>
+          </w:p>
+        </w:tc>
+        <w:tc>
+          <w:tcPr>
+            <w:tcW w:type="dxa" w:w="1500"/>
+            <w:tcBorders>
+              <w:top w:val="none" w:color="FFFFFF" w:sz="0"/>
+              <w:left w:val="none" w:color="FFFFFF" w:sz="0"/>
+              <w:bottom w:val="none" w:color="FFFFFF" w:sz="0"/>
+              <w:right w:val="none" w:color="FFFFFF" w:sz="0"/>
+            </w:tcBorders>
+            <w:tcMar>
+              <w:top w:type="dxa" w:w="40"/>
+              <w:left w:type="dxa" w:w="60"/>
+              <w:bottom w:type="dxa" w:w="40"/>
+              <w:right w:type="dxa" w:w="60"/>
+            </w:tcMar>
+          </w:tcPr>
+          <w:p>
+            <w:r>
+              <w:rPr>
+                <w:rFonts w:ascii="Garamond" w:cs="Garamond" w:eastAsia="Garamond" w:hAnsi="Garamond"/>
+                <w:color w:val="1A2430"/>
+                <w:sz w:val="20"/>
+                <w:szCs w:val="20"/>
+              </w:rPr>
+              <w:t xml:space="preserve">1998</w:t>
+            </w:r>
+          </w:p>
+        </w:tc>
+        <w:tc>
+          <w:tcPr>
+            <w:tcW w:type="dxa" w:w="1900"/>
+            <w:tcBorders>
+              <w:top w:val="none" w:color="FFFFFF" w:sz="0"/>
+              <w:left w:val="none" w:color="FFFFFF" w:sz="0"/>
+              <w:bottom w:val="none" w:color="FFFFFF" w:sz="0"/>
+              <w:right w:val="none" w:color="FFFFFF" w:sz="0"/>
+            </w:tcBorders>
+            <w:tcMar>
+              <w:top w:type="dxa" w:w="40"/>
+              <w:left w:type="dxa" w:w="60"/>
+              <w:bottom w:type="dxa" w:w="40"/>
+              <w:right w:type="dxa" w:w="60"/>
+            </w:tcMar>
+          </w:tcPr>
+          <w:p>
+            <w:r>
+              <w:rPr>
+                <w:rFonts w:ascii="Garamond" w:cs="Garamond" w:eastAsia="Garamond" w:hAnsi="Garamond"/>
+                <w:color w:val="1A2430"/>
+                <w:sz w:val="20"/>
+                <w:szCs w:val="20"/>
+              </w:rPr>
+              <w:t xml:space="preserve">≈ 5,000</w:t>
+            </w:r>
+          </w:p>
+        </w:tc>
+      </w:tr>
+      <w:tr>
+        <w:tc>
+          <w:tcPr>
+            <w:tcW w:type="dxa" w:w="2700"/>
+            <w:tcBorders>
+              <w:top w:val="none" w:color="FFFFFF" w:sz="0"/>
+              <w:left w:val="none" w:color="FFFFFF" w:sz="0"/>
+              <w:bottom w:val="none" w:color="FFFFFF" w:sz="0"/>
+              <w:right w:val="none" w:color="FFFFFF" w:sz="0"/>
+            </w:tcBorders>
+            <w:tcMar>
+              <w:top w:type="dxa" w:w="40"/>
+              <w:left w:type="dxa" w:w="60"/>
+              <w:bottom w:type="dxa" w:w="40"/>
+              <w:right w:type="dxa" w:w="60"/>
+            </w:tcMar>
+          </w:tcPr>
+          <w:p>
+            <w:r>
+              <w:rPr>
+                <w:rFonts w:ascii="Garamond" w:cs="Garamond" w:eastAsia="Garamond" w:hAnsi="Garamond"/>
+                <w:color w:val="1A2430"/>
+                <w:sz w:val="20"/>
+                <w:szCs w:val="20"/>
+              </w:rPr>
+              <w:t xml:space="preserve">Switzerland</w:t>
+            </w:r>
+          </w:p>
+        </w:tc>
+        <w:tc>
+          <w:tcPr>
+            <w:tcW w:type="dxa" w:w="3300"/>
+            <w:tcBorders>
+              <w:top w:val="none" w:color="FFFFFF" w:sz="0"/>
+              <w:left w:val="none" w:color="FFFFFF" w:sz="0"/>
+              <w:bottom w:val="none" w:color="FFFFFF" w:sz="0"/>
+              <w:right w:val="none" w:color="FFFFFF" w:sz="0"/>
+            </w:tcBorders>
+            <w:tcMar>
+              <w:top w:type="dxa" w:w="40"/>
+              <w:left w:type="dxa" w:w="60"/>
+              <w:bottom w:type="dxa" w:w="40"/>
+              <w:right w:type="dxa" w:w="60"/>
+            </w:tcMar>
+          </w:tcPr>
+          <w:p>
+            <w:r>
+              <w:rPr>
+                <w:rFonts w:ascii="Garamond" w:cs="Garamond" w:eastAsia="Garamond" w:hAnsi="Garamond"/>
+                <w:color w:val="1A2430"/>
+                <w:sz w:val="20"/>
+                <w:szCs w:val="20"/>
+              </w:rPr>
+              <w:t xml:space="preserve">SHP</w:t>
+            </w:r>
+          </w:p>
+        </w:tc>
+        <w:tc>
+          <w:tcPr>
+            <w:tcW w:type="dxa" w:w="1500"/>
+            <w:tcBorders>
+              <w:top w:val="none" w:color="FFFFFF" w:sz="0"/>
+              <w:left w:val="none" w:color="FFFFFF" w:sz="0"/>
+              <w:bottom w:val="none" w:color="FFFFFF" w:sz="0"/>
+              <w:right w:val="none" w:color="FFFFFF" w:sz="0"/>
+            </w:tcBorders>
+            <w:tcMar>
+              <w:top w:type="dxa" w:w="40"/>
+              <w:left w:type="dxa" w:w="60"/>
+              <w:bottom w:type="dxa" w:w="40"/>
+              <w:right w:type="dxa" w:w="60"/>
+            </w:tcMar>
+          </w:tcPr>
+          <w:p>
+            <w:r>
+              <w:rPr>
+                <w:rFonts w:ascii="Garamond" w:cs="Garamond" w:eastAsia="Garamond" w:hAnsi="Garamond"/>
+                <w:color w:val="1A2430"/>
+                <w:sz w:val="20"/>
+                <w:szCs w:val="20"/>
+              </w:rPr>
+              <w:t xml:space="preserve">1999</w:t>
+            </w:r>
+          </w:p>
+        </w:tc>
+        <w:tc>
+          <w:tcPr>
+            <w:tcW w:type="dxa" w:w="1900"/>
+            <w:tcBorders>
+              <w:top w:val="none" w:color="FFFFFF" w:sz="0"/>
+              <w:left w:val="none" w:color="FFFFFF" w:sz="0"/>
+              <w:bottom w:val="none" w:color="FFFFFF" w:sz="0"/>
+              <w:right w:val="none" w:color="FFFFFF" w:sz="0"/>
+            </w:tcBorders>
+            <w:tcMar>
+              <w:top w:type="dxa" w:w="40"/>
+              <w:left w:type="dxa" w:w="60"/>
+              <w:bottom w:type="dxa" w:w="40"/>
+              <w:right w:type="dxa" w:w="60"/>
+            </w:tcMar>
+          </w:tcPr>
+          <w:p>
+            <w:r>
+              <w:rPr>
+                <w:rFonts w:ascii="Garamond" w:cs="Garamond" w:eastAsia="Garamond" w:hAnsi="Garamond"/>
+                <w:color w:val="1A2430"/>
+                <w:sz w:val="20"/>
+                <w:szCs w:val="20"/>
+              </w:rPr>
+              <w:t xml:space="preserve">≈ 5,000</w:t>
+            </w:r>
+          </w:p>
+        </w:tc>
+      </w:tr>
+      <w:tr>
+        <w:tc>
+          <w:tcPr>
+            <w:tcW w:type="dxa" w:w="2700"/>
+            <w:tcBorders>
+              <w:top w:val="none" w:color="FFFFFF" w:sz="0"/>
+              <w:left w:val="none" w:color="FFFFFF" w:sz="0"/>
+              <w:bottom w:val="single" w:color="1A2430" w:sz="6"/>
+              <w:right w:val="none" w:color="FFFFFF" w:sz="0"/>
+            </w:tcBorders>
+            <w:tcMar>
+              <w:top w:type="dxa" w:w="40"/>
+              <w:left w:type="dxa" w:w="60"/>
+              <w:bottom w:type="dxa" w:w="40"/>
+              <w:right w:type="dxa" w:w="60"/>
+            </w:tcMar>
+          </w:tcPr>
+          <w:p>
+            <w:r>
+              <w:rPr>
+                <w:rFonts w:ascii="Garamond" w:cs="Garamond" w:eastAsia="Garamond" w:hAnsi="Garamond"/>
+                <w:color w:val="1A2430"/>
+                <w:sz w:val="20"/>
+                <w:szCs w:val="20"/>
+              </w:rPr>
+              <w:t xml:space="preserve">Australia</w:t>
+            </w:r>
+          </w:p>
+        </w:tc>
+        <w:tc>
+          <w:tcPr>
+            <w:tcW w:type="dxa" w:w="3300"/>
+            <w:tcBorders>
+              <w:top w:val="none" w:color="FFFFFF" w:sz="0"/>
+              <w:left w:val="none" w:color="FFFFFF" w:sz="0"/>
+              <w:bottom w:val="single" w:color="1A2430" w:sz="6"/>
+              <w:right w:val="none" w:color="FFFFFF" w:sz="0"/>
+            </w:tcBorders>
+            <w:tcMar>
+              <w:top w:type="dxa" w:w="40"/>
+              <w:left w:type="dxa" w:w="60"/>
+              <w:bottom w:type="dxa" w:w="40"/>
+              <w:right w:type="dxa" w:w="60"/>
+            </w:tcMar>
+          </w:tcPr>
+          <w:p>
+            <w:r>
+              <w:rPr>
+                <w:rFonts w:ascii="Garamond" w:cs="Garamond" w:eastAsia="Garamond" w:hAnsi="Garamond"/>
+                <w:color w:val="1A2430"/>
+                <w:sz w:val="20"/>
+                <w:szCs w:val="20"/>
+              </w:rPr>
+              <w:t xml:space="preserve">HILDA</w:t>
+            </w:r>
+          </w:p>
+        </w:tc>
+        <w:tc>
+          <w:tcPr>
+            <w:tcW w:type="dxa" w:w="1500"/>
+            <w:tcBorders>
+              <w:top w:val="none" w:color="FFFFFF" w:sz="0"/>
+              <w:left w:val="none" w:color="FFFFFF" w:sz="0"/>
+              <w:bottom w:val="single" w:color="1A2430" w:sz="6"/>
+              <w:right w:val="none" w:color="FFFFFF" w:sz="0"/>
+            </w:tcBorders>
+            <w:tcMar>
+              <w:top w:type="dxa" w:w="40"/>
+              <w:left w:type="dxa" w:w="60"/>
+              <w:bottom w:type="dxa" w:w="40"/>
+              <w:right w:type="dxa" w:w="60"/>
+            </w:tcMar>
+          </w:tcPr>
+          <w:p>
+            <w:r>
+              <w:rPr>
+                <w:rFonts w:ascii="Garamond" w:cs="Garamond" w:eastAsia="Garamond" w:hAnsi="Garamond"/>
+                <w:color w:val="1A2430"/>
+                <w:sz w:val="20"/>
+                <w:szCs w:val="20"/>
+              </w:rPr>
+              <w:t xml:space="preserve">2001</w:t>
+            </w:r>
+          </w:p>
+        </w:tc>
+        <w:tc>
+          <w:tcPr>
+            <w:tcW w:type="dxa" w:w="1900"/>
+            <w:tcBorders>
+              <w:top w:val="none" w:color="FFFFFF" w:sz="0"/>
+              <w:left w:val="none" w:color="FFFFFF" w:sz="0"/>
+              <w:bottom w:val="single" w:color="1A2430" w:sz="6"/>
+              <w:right w:val="none" w:color="FFFFFF" w:sz="0"/>
+            </w:tcBorders>
+            <w:tcMar>
+              <w:top w:type="dxa" w:w="40"/>
+              <w:left w:type="dxa" w:w="60"/>
+              <w:bottom w:type="dxa" w:w="40"/>
+              <w:right w:type="dxa" w:w="60"/>
+            </w:tcMar>
+          </w:tcPr>
+          <w:p>
+            <w:r>
+              <w:rPr>
+                <w:rFonts w:ascii="Garamond" w:cs="Garamond" w:eastAsia="Garamond" w:hAnsi="Garamond"/>
+                <w:color w:val="1A2430"/>
+                <w:sz w:val="20"/>
+                <w:szCs w:val="20"/>
+              </w:rPr>
+              <w:t xml:space="preserve">≈ 9,500</w:t>
+            </w:r>
+          </w:p>
+        </w:tc>
+      </w:tr>
+    </w:tbl>
+    <w:p>
+      <w:pPr>
+        <w:spacing w:after="70"/>
+      </w:pPr>
     </w:p>
     <w:p>
       <w:pPr>
@@ -234,7 +1242,7 @@
           <w:sz w:val="22"/>
           <w:szCs w:val="22"/>
         </w:rPr>
-        <w:t xml:space="preserve">A panel observes a teacher before, during and after the exit. It sees the child born two years before the resignation, the partner's earnings that make leaving affordable, the health and job satisfaction that deteriorate beforehand, the wage in the next job, and the return to the classroom three years later. Pooled over twenty to thirty years, the panels hold between roughly three thousand and twenty-five thousand teacher-year observations per country. That is enough to estimate a leaving rate with a precision of about half a percentage point and to support profiles by age, sex and family situation, though not year-by-year series in the smaller countries. The proposal is explicit about that frontier.</w:t>
+        <w:t xml:space="preserve">A panel observes a teacher before, during and after the exit. It sees the child born two years before the resignation, the partner's earnings that make leaving affordable, the health and job satisfaction that deteriorate beforehand, the wage in the next job, and the return to the classroom three years later. Pooled over twenty to thirty years, the panels hold between roughly three thousand and twenty-five thousand teacher-year observations per country. That is enough to estimate a leaving rate with a precision of about half a percentage point and to support profiles by age, sex and family situation, though not year-by-year series in the smaller countries. All seven panels are open to researchers at no or nominal cost, and the harmonization code is public, so every result can be replicated.</w:t>
       </w:r>
     </w:p>
     <w:p>
@@ -314,23 +1322,7 @@
           <w:sz w:val="22"/>
           <w:szCs w:val="22"/>
         </w:rPr>
-        <w:t xml:space="preserve">Three things would exist that do not exist today. The first is a set of attrition and return rates that can genuinely be compared across countries. The second is the profile behind each rate. Whether a system is losing young mothers, mid-career men, teachers in poor health or its best paid staff is precisely what a ministry needs to know before choosing among pensions, childcare, pay and workload as the lever, and it is unobservable in the data governments currently use. The third is the institutional reading. Attrition falls as civil-service protection rises across these seven countries. Profiles measured on a common footing would show what that protection buys, whom it retains, and at what cost, evidence that speaks directly to live debates on teacher pay, pension reform and family leave.</w:t>
-      </w:r>
-    </w:p>
-    <w:p>
-      <w:pPr>
-        <w:spacing w:after="90" w:before="240"/>
-      </w:pPr>
-      <w:r>
-        <w:rPr>
-          <w:rFonts w:ascii="Garamond" w:cs="Garamond" w:eastAsia="Garamond" w:hAnsi="Garamond"/>
-          <w:smallCaps/>
-          <w:color w:val="2A5DB0"/>
-          <w:spacing w:val="20"/>
-          <w:sz w:val="22"/>
-          <w:szCs w:val="22"/>
-        </w:rPr>
-        <w:t xml:space="preserve">6.  Work Plan and Deliverables</w:t>
+        <w:t xml:space="preserve">Three things would exist that do not exist today. The first is a set of attrition and return rates that can genuinely be compared across countries. The second is the profile behind each rate. Whether a system is losing young mothers, mid-career men, teachers in poor health or its best paid staff is precisely what a ministry needs to know before choosing among pensions, childcare, pay and workload as the lever, and it is unobservable in the data governments currently use. The third is the institutional reading. Attrition falls as civil-service protection rises across these seven countries. Profiles measured on a common footing would show what that protection buys, whom it retains, and at what cost.</w:t>
       </w:r>
     </w:p>
     <w:p>
@@ -345,7 +1337,7 @@
           <w:sz w:val="22"/>
           <w:szCs w:val="22"/>
         </w:rPr>
-        <w:t xml:space="preserve">All seven studies are open to researchers at no or nominal cost through standard applications, and the harmonization code is public, so every result can be replicated by anyone. Months one to three cover data access and the validation of the harmonized occupation codes. Months four to eight cover estimation of rates, routes and profiles. Months nine to twelve produce the outputs. The deliverables are a comparative report with the rates and profiles, a public replication package that extends the Comparative Panel File to the teaching profession, and short country notes for the systems where the findings bear on current policy discussions.</w:t>
+        <w:t xml:space="preserve">The project also feeds directly into the OECD Unlocking Teachers' Potential study. It serves the working paper on former teachers now in preparation, and it informs the study as a whole by delivering a database in which teachers, their exits and their returns can be followed in seven of the world's major economies.</w:t>
       </w:r>
     </w:p>
     <w:p>

</xml_diff>

<commit_message>
Motivation flow fixed: measurement difficulty first, shortages as why it matters
Co-Authored-By: Claude Fable 5 <noreply@anthropic.com>
Claude-Session: https://claude.ai/code/session_01DNzQPDcr3zfLTraMHUHqUn
</commit_message>
<xml_diff>
--- a/report/cpf_proposal.docx
+++ b/report/cpf_proposal.docx
@@ -88,7 +88,7 @@
           <w:sz w:val="22"/>
           <w:szCs w:val="22"/>
         </w:rPr>
-        <w:t xml:space="preserve">Teacher shortages are a real and growing concern across the OECD, yet the evidence on who leaves teaching is remarkably thin. Measuring attrition requires either longitudinal data that follow the same teachers over time or administrative records from the labor market, and both are scarce. Where dedicated teacher surveys exist, they are infrequent and closed. The reference instrument in the United States, the Teacher Follow-up Survey, runs only every four to five years, with gaps between waves, and its microdata are not public </w:t>
+        <w:t xml:space="preserve">Obtaining data on teachers who leave the profession is difficult. It requires either longitudinal surveys that follow the same teachers over time or administrative records from the labor market, and both are scarce in the international landscape. Where dedicated instruments exist, they are restricted and infrequent. The reference survey in the United States, the Teacher Follow-up Survey, runs only every four to five years, with gaps between waves, and its microdata are not public </w:t>
       </w:r>
       <w:r>
         <w:rPr>
@@ -106,7 +106,7 @@
           <w:sz w:val="22"/>
           <w:szCs w:val="22"/>
         </w:rPr>
-        <w:t xml:space="preserve">. The official reports built on such data are therefore the ceiling of what is known. Far deeper characterizations of who leaves, and of who comes back, would be possible if the underlying data were open.</w:t>
+        <w:t xml:space="preserve">. The official reports built on these data are therefore the ceiling of what is known. Far deeper characterizations of who leaves, and of who comes back, would be possible if the underlying data were open.</w:t>
       </w:r>
     </w:p>
     <w:p>
@@ -121,7 +121,7 @@
           <w:sz w:val="22"/>
           <w:szCs w:val="22"/>
         </w:rPr>
-        <w:t xml:space="preserve">The consequence is a policy debate running ahead of its evidence. Annual attrition figures range from about two percent in South Korea to about nine percent in England, but every national statistic measures a different object, so the numbers cannot be compared and a shared problem is being addressed with uncoordinated evidence </w:t>
+        <w:t xml:space="preserve">Research on this margin is essential, because teacher shortages are a real problem in many school systems and the debate around them runs on evidence that is neither public nor comparable. Annual attrition figures range from about two percent in South Korea to about nine percent in England, but every national statistic measures a different object </w:t>
       </w:r>
       <w:r>
         <w:rPr>
@@ -139,7 +139,7 @@
           <w:sz w:val="22"/>
           <w:szCs w:val="22"/>
         </w:rPr>
-        <w:t xml:space="preserve">. Longitudinal household surveys that exist in several countries at once are a unique and largely unused opportunity to change this. They follow the same people for decades, they record the family, income and health context that administrative data never see, and they allow rich detail on the profile of the leaver and the returner. A serious international debate on teacher attrition needs the insight they can provide.</w:t>
+        <w:t xml:space="preserve">. Longitudinal household surveys that exist in several countries at once are a unique and largely unused opportunity. They follow the same people for decades, they record the family, income and health context that administrative data never see, and they allow rich detail on the profile of the leaver and the returner. A serious international debate on teacher attrition needs the insight they can provide.</w:t>
       </w:r>
     </w:p>
     <w:p>

</xml_diff>

<commit_message>
Proposal updated to CPF 2.0: Russia excluded, Netherlands LISS added
Per the CPF 2.0 manual of July 2025, the RLMS was removed from the
harmonized file in response to the invasion of Ukraine and the Dutch
LISS panel was added. The panel table, the release facts (43 waves,
1968-2024, three million observations, 400,000 respondents), the
sample-size range, and the references now match the manual.

Co-Authored-By: Claude Fable 5 <noreply@anthropic.com>
Claude-Session: https://claude.ai/code/session_01DNzQPDcr3zfLTraMHUHqUn
</commit_message>
<xml_diff>
--- a/report/cpf_proposal.docx
+++ b/report/cpf_proposal.docx
@@ -249,7 +249,7 @@
           <w:sz w:val="22"/>
           <w:szCs w:val="22"/>
         </w:rPr>
-        <w:t xml:space="preserve">Several countries run an annual longitudinal survey that follows a representative sample of households over decades, asking about jobs, incomes, partners, children and health. Because the same people answer year after year, these studies watch careers unfold in a way no snapshot can. The Comparative Panel File (CPF) is an academic initiative that harmonizes the seven longest-running of these panels into one open structure with identical variables for employment, income, family and wellbeing </w:t>
+        <w:t xml:space="preserve">Several countries run an annual longitudinal survey that follows a representative sample of households over decades, asking about jobs, incomes, partners, children and health. Because the same people answer year after year, these studies watch careers unfold in a way no snapshot can. The Comparative Panel File (CPF) is an academic initiative that harmonizes seven of the world's most important household panels into one open structure with identical variables for employment, income, family and wellbeing </w:t>
       </w:r>
       <w:r>
         <w:rPr>
@@ -258,16 +258,16 @@
           <w:sz w:val="22"/>
           <w:szCs w:val="22"/>
         </w:rPr>
-        <w:t xml:space="preserve">(Turek, Kalmijn and Leopold 2021)</w:t>
-      </w:r>
-      <w:r>
-        <w:rPr>
-          <w:rFonts w:ascii="Garamond" w:cs="Garamond" w:eastAsia="Garamond" w:hAnsi="Garamond"/>
-          <w:color w:val="1A2430"/>
-          <w:sz w:val="22"/>
-          <w:szCs w:val="22"/>
-        </w:rPr>
-        <w:t xml:space="preserve">. It has been used to study retirement, divorce and unemployment across countries. It has never been used for teachers.</w:t>
+        <w:t xml:space="preserve">(Turek, Kalmijn and Leopold 2021; Turek and Kalmijn 2025)</w:t>
+      </w:r>
+      <w:r>
+        <w:rPr>
+          <w:rFonts w:ascii="Garamond" w:cs="Garamond" w:eastAsia="Garamond" w:hAnsi="Garamond"/>
+          <w:color w:val="1A2430"/>
+          <w:sz w:val="22"/>
+          <w:szCs w:val="22"/>
+        </w:rPr>
+        <w:t xml:space="preserve">. Its 2025 release spans 43 waves between 1968 and 2024, around three million observations, and more than 400,000 respondents. It has been used to study retirement, divorce and unemployment across countries. It has never been used for teachers.</w:t>
       </w:r>
     </w:p>
     <w:p>
@@ -793,7 +793,7 @@
                 <w:sz w:val="20"/>
                 <w:szCs w:val="20"/>
               </w:rPr>
-              <w:t xml:space="preserve">Russia</w:t>
+              <w:t xml:space="preserve">South Korea</w:t>
             </w:r>
           </w:p>
         </w:tc>
@@ -821,7 +821,7 @@
                 <w:sz w:val="20"/>
                 <w:szCs w:val="20"/>
               </w:rPr>
-              <w:t xml:space="preserve">RLMS-HSE</w:t>
+              <w:t xml:space="preserve">KLIPS</w:t>
             </w:r>
           </w:p>
         </w:tc>
@@ -849,7 +849,7 @@
                 <w:sz w:val="20"/>
                 <w:szCs w:val="20"/>
               </w:rPr>
-              <w:t xml:space="preserve">1994</w:t>
+              <w:t xml:space="preserve">1998</w:t>
             </w:r>
           </w:p>
         </w:tc>
@@ -877,7 +877,7 @@
                 <w:sz w:val="20"/>
                 <w:szCs w:val="20"/>
               </w:rPr>
-              <w:t xml:space="preserve">≈ 4,500</w:t>
+              <w:t xml:space="preserve">≈ 5,000</w:t>
             </w:r>
           </w:p>
         </w:tc>
@@ -907,7 +907,7 @@
                 <w:sz w:val="20"/>
                 <w:szCs w:val="20"/>
               </w:rPr>
-              <w:t xml:space="preserve">South Korea</w:t>
+              <w:t xml:space="preserve">Switzerland</w:t>
             </w:r>
           </w:p>
         </w:tc>
@@ -935,7 +935,7 @@
                 <w:sz w:val="20"/>
                 <w:szCs w:val="20"/>
               </w:rPr>
-              <w:t xml:space="preserve">KLIPS</w:t>
+              <w:t xml:space="preserve">SHP</w:t>
             </w:r>
           </w:p>
         </w:tc>
@@ -963,7 +963,7 @@
                 <w:sz w:val="20"/>
                 <w:szCs w:val="20"/>
               </w:rPr>
-              <w:t xml:space="preserve">1998</w:t>
+              <w:t xml:space="preserve">1999</w:t>
             </w:r>
           </w:p>
         </w:tc>
@@ -1021,7 +1021,7 @@
                 <w:sz w:val="20"/>
                 <w:szCs w:val="20"/>
               </w:rPr>
-              <w:t xml:space="preserve">Switzerland</w:t>
+              <w:t xml:space="preserve">Australia</w:t>
             </w:r>
           </w:p>
         </w:tc>
@@ -1049,7 +1049,7 @@
                 <w:sz w:val="20"/>
                 <w:szCs w:val="20"/>
               </w:rPr>
-              <w:t xml:space="preserve">SHP</w:t>
+              <w:t xml:space="preserve">HILDA</w:t>
             </w:r>
           </w:p>
         </w:tc>
@@ -1077,7 +1077,7 @@
                 <w:sz w:val="20"/>
                 <w:szCs w:val="20"/>
               </w:rPr>
-              <w:t xml:space="preserve">1999</w:t>
+              <w:t xml:space="preserve">2001</w:t>
             </w:r>
           </w:p>
         </w:tc>
@@ -1105,7 +1105,7 @@
                 <w:sz w:val="20"/>
                 <w:szCs w:val="20"/>
               </w:rPr>
-              <w:t xml:space="preserve">≈ 5,000</w:t>
+              <w:t xml:space="preserve">≈ 9,500</w:t>
             </w:r>
           </w:p>
         </w:tc>
@@ -1135,7 +1135,7 @@
                 <w:sz w:val="20"/>
                 <w:szCs w:val="20"/>
               </w:rPr>
-              <w:t xml:space="preserve">Australia</w:t>
+              <w:t xml:space="preserve">Netherlands</w:t>
             </w:r>
           </w:p>
         </w:tc>
@@ -1163,7 +1163,7 @@
                 <w:sz w:val="20"/>
                 <w:szCs w:val="20"/>
               </w:rPr>
-              <w:t xml:space="preserve">HILDA</w:t>
+              <w:t xml:space="preserve">LISS</w:t>
             </w:r>
           </w:p>
         </w:tc>
@@ -1191,7 +1191,7 @@
                 <w:sz w:val="20"/>
                 <w:szCs w:val="20"/>
               </w:rPr>
-              <w:t xml:space="preserve">2001</w:t>
+              <w:t xml:space="preserve">2007</w:t>
             </w:r>
           </w:p>
         </w:tc>
@@ -1219,7 +1219,7 @@
                 <w:sz w:val="20"/>
                 <w:szCs w:val="20"/>
               </w:rPr>
-              <w:t xml:space="preserve">≈ 9,500</w:t>
+              <w:t xml:space="preserve">≈ 5,000</w:t>
             </w:r>
           </w:p>
         </w:tc>
@@ -1242,7 +1242,7 @@
           <w:sz w:val="22"/>
           <w:szCs w:val="22"/>
         </w:rPr>
-        <w:t xml:space="preserve">A panel observes a teacher before, during and after the exit. It sees the child born two years before the resignation, the partner's earnings that make leaving affordable, the health and job satisfaction that deteriorate beforehand, the wage in the next job, and the return to the classroom three years later. Pooled over twenty to thirty years, the panels hold between roughly three thousand and twenty-five thousand teacher-year observations per country. That is enough to estimate a leaving rate with a precision of about half a percentage point and to support profiles by age, sex and family situation, though not year-by-year series in the smaller countries. All seven panels are open to researchers at no or nominal cost, and the harmonization code is public, so every result can be replicated.</w:t>
+        <w:t xml:space="preserve">A panel observes a teacher before, during and after the exit. It sees the child born two years before the resignation, the partner's earnings that make leaving affordable, the health and job satisfaction that deteriorate beforehand, the wage in the next job, and the return to the classroom three years later. Pooled over twenty to thirty years, the panels hold between roughly two thousand and twenty-five thousand teacher-year observations per country. That is enough to estimate a leaving rate with a precision of about half a percentage point and to support profiles by age, sex and family situation, though not year-by-year series in the smaller countries. All seven panels are open to researchers at no or nominal cost, and the harmonization code is public, so every result can be replicated.</w:t>
       </w:r>
     </w:p>
     <w:p>
@@ -1291,7 +1291,7 @@
           <w:sz w:val="22"/>
           <w:szCs w:val="22"/>
         </w:rPr>
-        <w:t xml:space="preserve">. The empirical design confronts this directly. An exit requires a change of employer, not only of occupational code. Interview flags that mark answers carried over from the previous year are used where available to remove spurious changes. Re-entries are modeled rather than ignored, since they are themselves an object of interest. Rates are estimated by pooling waves within country, profiles by harmonized regression models of the exit and return decisions, and every national estimate is validated against a set of twenty-five administrative benchmarks compiled for this proposal from ministries, statistical offices and teacher registers.</w:t>
+        <w:t xml:space="preserve">. The empirical design confronts this directly. An exit requires a change of employer, not only of occupational code. Interview flags that mark answers carried over from the previous year are used where available to remove spurious changes. Re-entries are modeled rather than ignored, since they are themselves an object of interest. Rates are estimated by pooling waves within country, profiles by harmonized regression models of the exit and return decisions, and every national estimate is validated against administrative benchmarks compiled for this proposal, country by country, from ministries, statistical offices and teacher registers.</w:t>
       </w:r>
     </w:p>
     <w:p>
@@ -1435,6 +1435,21 @@
           <w:szCs w:val="20"/>
         </w:rPr>
         <w:t xml:space="preserve">Turek, K., M. Kalmijn, and T. Leopold (2021). “The Comparative Panel File: Harmonized Panel Surveys from Seven Countries.” European Sociological Review 37(3), 505–523.</w:t>
+      </w:r>
+    </w:p>
+    <w:p>
+      <w:pPr>
+        <w:spacing w:after="120" w:line="276" w:lineRule="auto"/>
+        <w:ind w:left="420" w:hanging="420"/>
+      </w:pPr>
+      <w:r>
+        <w:rPr>
+          <w:rFonts w:ascii="Garamond" w:cs="Garamond" w:eastAsia="Garamond" w:hAnsi="Garamond"/>
+          <w:color w:val="1A2430"/>
+          <w:sz w:val="20"/>
+          <w:szCs w:val="20"/>
+        </w:rPr>
+        <w:t xml:space="preserve">Turek, K., and M. Kalmijn (2025). Comparative Panel File (CPF) 2.0: Information and Manual. OSF, doi 10.31219/osf.io/y3ph6.</w:t>
       </w:r>
     </w:p>
     <w:sectPr>

</xml_diff>

<commit_message>
Motivation claim replaced with the audited version; add instrument-access audit
The blanket restricted-and-infrequent sentence is replaced by the
differentiated claim that survives the seven-country audit: aggregates
are mostly annual, microdata are gated everywhere, and no public tier
carries covariates, destinations or returns. The audit itself, with
per-country verdicts and access regimes, is added under outputs.

Co-Authored-By: Claude Fable 5 <noreply@anthropic.com>
Claude-Session: https://claude.ai/code/session_01DNzQPDcr3zfLTraMHUHqUn
</commit_message>
<xml_diff>
--- a/report/cpf_proposal.docx
+++ b/report/cpf_proposal.docx
@@ -88,7 +88,7 @@
           <w:sz w:val="22"/>
           <w:szCs w:val="22"/>
         </w:rPr>
-        <w:t xml:space="preserve">Keeping good teachers in the classroom is a first-order concern for every school system, and the starting point is knowing who leaves and who returns. Measuring teacher attrition, however, is hard, as it requires following the same teachers over time. That can be done with longitudinal surveys or with administrative labor-market records, and both are scarce in the international landscape. Where dedicated instruments exist, they are restricted and infrequent. The reference survey in the United States, the Teacher Follow-up Survey, runs only every four to five years, with gaps between waves, and its microdata are not public </w:t>
+        <w:t xml:space="preserve">Keeping good teachers in the classroom is a first-order concern for every school system, and the starting point is knowing who leaves and who returns. Measuring teacher attrition, however, is hard, as it requires following the same teachers over time. Most countries now publish an aggregate attrition rate each year from administrative records. What is scarce is everything behind the rate. Person-level records sit in secure enclaves, closed registers or restricted licenses, and the public tables carry no personal characteristics, no destinations and no returns. The one national survey that follows leavers to where they go, the American Teacher Follow-up Survey, has run eight times since 1988, with a nine-year gap before its latest wave, and its recent microdata are available only to licensed institutions in the United States </w:t>
       </w:r>
       <w:r>
         <w:rPr>
@@ -106,7 +106,7 @@
           <w:sz w:val="22"/>
           <w:szCs w:val="22"/>
         </w:rPr>
-        <w:t xml:space="preserve">. The official reports built on these data are therefore the ceiling of what is known. Far deeper characterizations of who leaves, and of who comes back, would be possible if the underlying data were open.</w:t>
+        <w:t xml:space="preserve">. The official reports built on these instruments are therefore the ceiling of what is known. Far deeper characterizations of who leaves, and of who comes back, would be possible with data that are open and comparable.</w:t>
       </w:r>
     </w:p>
     <w:p>

</xml_diff>

<commit_message>
Proposal: name the measured objects instead of generalizing; two-tier data design and ISCO note
Co-Authored-By: Claude Fable 5 <noreply@anthropic.com>
Claude-Session: https://claude.ai/code/session_01DNzQPDcr3zfLTraMHUHqUn
</commit_message>
<xml_diff>
--- a/report/cpf_proposal.docx
+++ b/report/cpf_proposal.docx
@@ -121,7 +121,7 @@
           <w:sz w:val="22"/>
           <w:szCs w:val="22"/>
         </w:rPr>
-        <w:t xml:space="preserve">Research on this margin is essential, because teacher shortages are a real problem in many school systems and the debate around them runs on evidence that is neither public nor comparable. Annual attrition figures range from about two percent in South Korea to about nine percent in England, but every national statistic measures a different object </w:t>
+        <w:t xml:space="preserve">Research on this margin is essential, because teacher shortages are a real concern in many school systems </w:t>
       </w:r>
       <w:r>
         <w:rPr>
@@ -139,7 +139,7 @@
           <w:sz w:val="22"/>
           <w:szCs w:val="22"/>
         </w:rPr>
-        <w:t xml:space="preserve">. Longitudinal household surveys that exist in several countries at once are a unique and largely unused opportunity. They follow the same people for decades, they record the family, income and health context that administrative data never see, and they allow rich detail on the profile of the leaver and the returner. A serious international debate on teacher attrition needs the insight they can provide.</w:t>
+        <w:t xml:space="preserve">, and the numbers in the debate cannot be compared across borders. Annual attrition figures range from about two percent in South Korea to about nine percent in England, but the published statistics count different things. England counts exits from state-funded schools, the Netherlands exits from the education sector, Korea departures before the statutory retirement age, and the United States exits from the profession itself. Longitudinal household surveys that exist in several countries at once are a unique and largely unused opportunity. They follow the same people for decades, they record the family, income and health context that administrative data never see, and they allow rich detail on the profile of the leaver and the returner. A serious international debate on teacher attrition needs the insight they can provide.</w:t>
       </w:r>
     </w:p>
     <w:p>
@@ -1291,7 +1291,7 @@
           <w:sz w:val="22"/>
           <w:szCs w:val="22"/>
         </w:rPr>
-        <w:t xml:space="preserve">. The empirical design confronts this directly. An exit requires a change of employer, not only of occupational code. Interview flags that mark answers carried over from the previous year are used where available to remove spurious changes. Re-entries are modeled rather than ignored, since they are themselves an object of interest. Rates are estimated by pooling waves within country, profiles by harmonized regression models of the exit and return decisions, and every national estimate is validated against administrative benchmarks compiled for this proposal, country by country, from ministries, statistical offices and teacher registers.</w:t>
+        <w:t xml:space="preserve">. The empirical design confronts this directly. An exit requires a change of employer, not only of occupational code. Interview flags that mark answers carried over from the previous year are used where available to remove spurious changes. Re-entries are modeled rather than ignored, since they are themselves an object of interest. Rates are estimated by pooling waves within country, profiles by harmonized regression models of the exit and return decisions, and every national estimate is validated against administrative benchmarks compiled for this proposal, country by country, from ministries, statistical offices and teacher registers. Where administrative microdata are accessible under standard procedures, as in the Netherlands and Australia, they will additionally support country-level deep dives alongside the harmonized estimates. Occupation is harmonized at the two-digit ISCO level in all seven panels; the three-digit codes that separate school teachers from other teaching professionals are available for most panels and, for the United Kingdom, obtainable under a standard special licence.</w:t>
       </w:r>
     </w:p>
     <w:p>

</xml_diff>

<commit_message>
Proposal annex: table documenting national attrition statistics by source, frequency, scope and availability
Co-Authored-By: Claude Fable 5 <noreply@anthropic.com>
Claude-Session: https://claude.ai/code/session_01DNzQPDcr3zfLTraMHUHqUn
</commit_message>
<xml_diff>
--- a/report/cpf_proposal.docx
+++ b/report/cpf_proposal.docx
@@ -1452,6 +1452,1351 @@
         <w:t xml:space="preserve">Turek, K., and M. Kalmijn (2025). Comparative Panel File (CPF) 2.0: Information and Manual. OSF, doi 10.31219/osf.io/y3ph6.</w:t>
       </w:r>
     </w:p>
+    <w:p>
+      <w:r>
+        <w:br w:type="page"/>
+      </w:r>
+    </w:p>
+    <w:p>
+      <w:pPr>
+        <w:spacing w:after="120"/>
+        <w:jc w:val="center"/>
+      </w:pPr>
+      <w:r>
+        <w:rPr>
+          <w:rFonts w:ascii="Garamond" w:cs="Garamond" w:eastAsia="Garamond" w:hAnsi="Garamond"/>
+          <w:b/>
+          <w:bCs/>
+          <w:color w:val="1A2430"/>
+          <w:sz w:val="24"/>
+          <w:szCs w:val="24"/>
+        </w:rPr>
+        <w:t xml:space="preserve">Annex. National publication of teacher attrition statistics</w:t>
+      </w:r>
+    </w:p>
+    <w:p>
+      <w:pPr>
+        <w:spacing w:after="140" w:line="276" w:lineRule="auto"/>
+        <w:jc w:val="both"/>
+      </w:pPr>
+      <w:r>
+        <w:rPr>
+          <w:rFonts w:ascii="Garamond" w:cs="Garamond" w:eastAsia="Garamond" w:hAnsi="Garamond"/>
+          <w:color w:val="5A6572"/>
+          <w:sz w:val="20"/>
+          <w:szCs w:val="20"/>
+        </w:rPr>
+        <w:t xml:space="preserve">This annex documents the statement in Section 1. Aggregate attrition rates are published annually in five of the seven countries; the federal United States and Switzerland are the exceptions. In no country does the public tier include personal characteristics, destinations or returns.</w:t>
+      </w:r>
+    </w:p>
+    <w:tbl>
+      <w:tblPr>
+        <w:tblW w:type="dxa" w:w="9060"/>
+        <w:tblBorders>
+          <w:top w:val="single" w:color="auto" w:sz="4"/>
+          <w:left w:val="single" w:color="auto" w:sz="4"/>
+          <w:bottom w:val="single" w:color="auto" w:sz="4"/>
+          <w:right w:val="single" w:color="auto" w:sz="4"/>
+          <w:insideH w:val="single" w:color="auto" w:sz="4"/>
+          <w:insideV w:val="single" w:color="auto" w:sz="4"/>
+        </w:tblBorders>
+      </w:tblPr>
+      <w:tblGrid>
+        <w:gridCol w:w="1150"/>
+        <w:gridCol w:w="1950"/>
+        <w:gridCol w:w="1500"/>
+        <w:gridCol w:w="2200"/>
+        <w:gridCol w:w="2260"/>
+      </w:tblGrid>
+      <w:tr>
+        <w:tc>
+          <w:tcPr>
+            <w:tcW w:type="dxa" w:w="1150"/>
+            <w:tcBorders>
+              <w:top w:val="single" w:color="1A2430" w:sz="6"/>
+              <w:left w:val="none" w:color="FFFFFF" w:sz="0"/>
+              <w:bottom w:val="single" w:color="1A2430" w:sz="6"/>
+              <w:right w:val="none" w:color="FFFFFF" w:sz="0"/>
+            </w:tcBorders>
+            <w:tcMar>
+              <w:top w:type="dxa" w:w="50"/>
+              <w:left w:type="dxa" w:w="60"/>
+              <w:bottom w:type="dxa" w:w="50"/>
+              <w:right w:type="dxa" w:w="60"/>
+            </w:tcMar>
+          </w:tcPr>
+          <w:p>
+            <w:r>
+              <w:rPr>
+                <w:rFonts w:ascii="Garamond" w:cs="Garamond" w:eastAsia="Garamond" w:hAnsi="Garamond"/>
+                <w:b/>
+                <w:bCs/>
+                <w:color w:val="1A2430"/>
+                <w:sz w:val="18"/>
+                <w:szCs w:val="18"/>
+              </w:rPr>
+              <w:t xml:space="preserve">Country</w:t>
+            </w:r>
+          </w:p>
+        </w:tc>
+        <w:tc>
+          <w:tcPr>
+            <w:tcW w:type="dxa" w:w="1950"/>
+            <w:tcBorders>
+              <w:top w:val="single" w:color="1A2430" w:sz="6"/>
+              <w:left w:val="none" w:color="FFFFFF" w:sz="0"/>
+              <w:bottom w:val="single" w:color="1A2430" w:sz="6"/>
+              <w:right w:val="none" w:color="FFFFFF" w:sz="0"/>
+            </w:tcBorders>
+            <w:tcMar>
+              <w:top w:type="dxa" w:w="50"/>
+              <w:left w:type="dxa" w:w="60"/>
+              <w:bottom w:type="dxa" w:w="50"/>
+              <w:right w:type="dxa" w:w="60"/>
+            </w:tcMar>
+          </w:tcPr>
+          <w:p>
+            <w:r>
+              <w:rPr>
+                <w:rFonts w:ascii="Garamond" w:cs="Garamond" w:eastAsia="Garamond" w:hAnsi="Garamond"/>
+                <w:b/>
+                <w:bCs/>
+                <w:color w:val="1A2430"/>
+                <w:sz w:val="18"/>
+                <w:szCs w:val="18"/>
+              </w:rPr>
+              <w:t xml:space="preserve">Source and steward</w:t>
+            </w:r>
+          </w:p>
+        </w:tc>
+        <w:tc>
+          <w:tcPr>
+            <w:tcW w:type="dxa" w:w="1500"/>
+            <w:tcBorders>
+              <w:top w:val="single" w:color="1A2430" w:sz="6"/>
+              <w:left w:val="none" w:color="FFFFFF" w:sz="0"/>
+              <w:bottom w:val="single" w:color="1A2430" w:sz="6"/>
+              <w:right w:val="none" w:color="FFFFFF" w:sz="0"/>
+            </w:tcBorders>
+            <w:tcMar>
+              <w:top w:type="dxa" w:w="50"/>
+              <w:left w:type="dxa" w:w="60"/>
+              <w:bottom w:type="dxa" w:w="50"/>
+              <w:right w:type="dxa" w:w="60"/>
+            </w:tcMar>
+          </w:tcPr>
+          <w:p>
+            <w:r>
+              <w:rPr>
+                <w:rFonts w:ascii="Garamond" w:cs="Garamond" w:eastAsia="Garamond" w:hAnsi="Garamond"/>
+                <w:b/>
+                <w:bCs/>
+                <w:color w:val="1A2430"/>
+                <w:sz w:val="18"/>
+                <w:szCs w:val="18"/>
+              </w:rPr>
+              <w:t xml:space="preserve">Frequency</w:t>
+            </w:r>
+          </w:p>
+        </w:tc>
+        <w:tc>
+          <w:tcPr>
+            <w:tcW w:type="dxa" w:w="2200"/>
+            <w:tcBorders>
+              <w:top w:val="single" w:color="1A2430" w:sz="6"/>
+              <w:left w:val="none" w:color="FFFFFF" w:sz="0"/>
+              <w:bottom w:val="single" w:color="1A2430" w:sz="6"/>
+              <w:right w:val="none" w:color="FFFFFF" w:sz="0"/>
+            </w:tcBorders>
+            <w:tcMar>
+              <w:top w:type="dxa" w:w="50"/>
+              <w:left w:type="dxa" w:w="60"/>
+              <w:bottom w:type="dxa" w:w="50"/>
+              <w:right w:type="dxa" w:w="60"/>
+            </w:tcMar>
+          </w:tcPr>
+          <w:p>
+            <w:r>
+              <w:rPr>
+                <w:rFonts w:ascii="Garamond" w:cs="Garamond" w:eastAsia="Garamond" w:hAnsi="Garamond"/>
+                <w:b/>
+                <w:bCs/>
+                <w:color w:val="1A2430"/>
+                <w:sz w:val="18"/>
+                <w:szCs w:val="18"/>
+              </w:rPr>
+              <w:t xml:space="preserve">Scope</w:t>
+            </w:r>
+          </w:p>
+        </w:tc>
+        <w:tc>
+          <w:tcPr>
+            <w:tcW w:type="dxa" w:w="2260"/>
+            <w:tcBorders>
+              <w:top w:val="single" w:color="1A2430" w:sz="6"/>
+              <w:left w:val="none" w:color="FFFFFF" w:sz="0"/>
+              <w:bottom w:val="single" w:color="1A2430" w:sz="6"/>
+              <w:right w:val="none" w:color="FFFFFF" w:sz="0"/>
+            </w:tcBorders>
+            <w:tcMar>
+              <w:top w:type="dxa" w:w="50"/>
+              <w:left w:type="dxa" w:w="60"/>
+              <w:bottom w:type="dxa" w:w="50"/>
+              <w:right w:type="dxa" w:w="60"/>
+            </w:tcMar>
+          </w:tcPr>
+          <w:p>
+            <w:r>
+              <w:rPr>
+                <w:rFonts w:ascii="Garamond" w:cs="Garamond" w:eastAsia="Garamond" w:hAnsi="Garamond"/>
+                <w:b/>
+                <w:bCs/>
+                <w:color w:val="1A2430"/>
+                <w:sz w:val="18"/>
+                <w:szCs w:val="18"/>
+              </w:rPr>
+              <w:t xml:space="preserve">Public availability</w:t>
+            </w:r>
+          </w:p>
+        </w:tc>
+      </w:tr>
+      <w:tr>
+        <w:tc>
+          <w:tcPr>
+            <w:tcW w:type="dxa" w:w="1150"/>
+            <w:tcBorders>
+              <w:top w:val="none" w:color="FFFFFF" w:sz="0"/>
+              <w:left w:val="none" w:color="FFFFFF" w:sz="0"/>
+              <w:bottom w:val="none" w:color="FFFFFF" w:sz="0"/>
+              <w:right w:val="none" w:color="FFFFFF" w:sz="0"/>
+            </w:tcBorders>
+            <w:tcMar>
+              <w:top w:type="dxa" w:w="50"/>
+              <w:left w:type="dxa" w:w="60"/>
+              <w:bottom w:type="dxa" w:w="50"/>
+              <w:right w:type="dxa" w:w="60"/>
+            </w:tcMar>
+          </w:tcPr>
+          <w:p>
+            <w:r>
+              <w:rPr>
+                <w:rFonts w:ascii="Garamond" w:cs="Garamond" w:eastAsia="Garamond" w:hAnsi="Garamond"/>
+                <w:color w:val="1A2430"/>
+                <w:sz w:val="18"/>
+                <w:szCs w:val="18"/>
+              </w:rPr>
+              <w:t xml:space="preserve">United States</w:t>
+            </w:r>
+          </w:p>
+        </w:tc>
+        <w:tc>
+          <w:tcPr>
+            <w:tcW w:type="dxa" w:w="1950"/>
+            <w:tcBorders>
+              <w:top w:val="none" w:color="FFFFFF" w:sz="0"/>
+              <w:left w:val="none" w:color="FFFFFF" w:sz="0"/>
+              <w:bottom w:val="none" w:color="FFFFFF" w:sz="0"/>
+              <w:right w:val="none" w:color="FFFFFF" w:sz="0"/>
+            </w:tcBorders>
+            <w:tcMar>
+              <w:top w:type="dxa" w:w="50"/>
+              <w:left w:type="dxa" w:w="60"/>
+              <w:bottom w:type="dxa" w:w="50"/>
+              <w:right w:type="dxa" w:w="60"/>
+            </w:tcMar>
+          </w:tcPr>
+          <w:p>
+            <w:r>
+              <w:rPr>
+                <w:rFonts w:ascii="Garamond" w:cs="Garamond" w:eastAsia="Garamond" w:hAnsi="Garamond"/>
+                <w:color w:val="1A2430"/>
+                <w:sz w:val="18"/>
+                <w:szCs w:val="18"/>
+              </w:rPr>
+              <w:t xml:space="preserve">Teacher Follow-up Survey (NCES, Dept. of Education)</w:t>
+            </w:r>
+          </w:p>
+        </w:tc>
+        <w:tc>
+          <w:tcPr>
+            <w:tcW w:type="dxa" w:w="1500"/>
+            <w:tcBorders>
+              <w:top w:val="none" w:color="FFFFFF" w:sz="0"/>
+              <w:left w:val="none" w:color="FFFFFF" w:sz="0"/>
+              <w:bottom w:val="none" w:color="FFFFFF" w:sz="0"/>
+              <w:right w:val="none" w:color="FFFFFF" w:sz="0"/>
+            </w:tcBorders>
+            <w:tcMar>
+              <w:top w:type="dxa" w:w="50"/>
+              <w:left w:type="dxa" w:w="60"/>
+              <w:bottom w:type="dxa" w:w="50"/>
+              <w:right w:type="dxa" w:w="60"/>
+            </w:tcMar>
+          </w:tcPr>
+          <w:p>
+            <w:r>
+              <w:rPr>
+                <w:rFonts w:ascii="Garamond" w:cs="Garamond" w:eastAsia="Garamond" w:hAnsi="Garamond"/>
+                <w:color w:val="1A2430"/>
+                <w:sz w:val="18"/>
+                <w:szCs w:val="18"/>
+              </w:rPr>
+              <w:t xml:space="preserve">Eight waves since 1988-89; nine-year gap before 2021-22</w:t>
+            </w:r>
+          </w:p>
+        </w:tc>
+        <w:tc>
+          <w:tcPr>
+            <w:tcW w:type="dxa" w:w="2200"/>
+            <w:tcBorders>
+              <w:top w:val="none" w:color="FFFFFF" w:sz="0"/>
+              <w:left w:val="none" w:color="FFFFFF" w:sz="0"/>
+              <w:bottom w:val="none" w:color="FFFFFF" w:sz="0"/>
+              <w:right w:val="none" w:color="FFFFFF" w:sz="0"/>
+            </w:tcBorders>
+            <w:tcMar>
+              <w:top w:type="dxa" w:w="50"/>
+              <w:left w:type="dxa" w:w="60"/>
+              <w:bottom w:type="dxa" w:w="50"/>
+              <w:right w:type="dxa" w:w="60"/>
+            </w:tcMar>
+          </w:tcPr>
+          <w:p>
+            <w:r>
+              <w:rPr>
+                <w:rFonts w:ascii="Garamond" w:cs="Garamond" w:eastAsia="Garamond" w:hAnsi="Garamond"/>
+                <w:color w:val="1A2430"/>
+                <w:sz w:val="18"/>
+                <w:szCs w:val="18"/>
+              </w:rPr>
+              <w:t xml:space="preserve">Public-school teachers leaving the profession, with destinations</w:t>
+            </w:r>
+          </w:p>
+        </w:tc>
+        <w:tc>
+          <w:tcPr>
+            <w:tcW w:type="dxa" w:w="2260"/>
+            <w:tcBorders>
+              <w:top w:val="none" w:color="FFFFFF" w:sz="0"/>
+              <w:left w:val="none" w:color="FFFFFF" w:sz="0"/>
+              <w:bottom w:val="none" w:color="FFFFFF" w:sz="0"/>
+              <w:right w:val="none" w:color="FFFFFF" w:sz="0"/>
+            </w:tcBorders>
+            <w:tcMar>
+              <w:top w:type="dxa" w:w="50"/>
+              <w:left w:type="dxa" w:w="60"/>
+              <w:bottom w:type="dxa" w:w="50"/>
+              <w:right w:type="dxa" w:w="60"/>
+            </w:tcMar>
+          </w:tcPr>
+          <w:p>
+            <w:r>
+              <w:rPr>
+                <w:rFonts w:ascii="Garamond" w:cs="Garamond" w:eastAsia="Garamond" w:hAnsi="Garamond"/>
+                <w:color w:val="1A2430"/>
+                <w:sz w:val="18"/>
+                <w:szCs w:val="18"/>
+              </w:rPr>
+              <w:t xml:space="preserve">Reports public; microdata under restricted-use license for US institutions</w:t>
+            </w:r>
+          </w:p>
+        </w:tc>
+      </w:tr>
+      <w:tr>
+        <w:tc>
+          <w:tcPr>
+            <w:tcW w:type="dxa" w:w="1150"/>
+            <w:tcBorders>
+              <w:top w:val="none" w:color="FFFFFF" w:sz="0"/>
+              <w:left w:val="none" w:color="FFFFFF" w:sz="0"/>
+              <w:bottom w:val="none" w:color="FFFFFF" w:sz="0"/>
+              <w:right w:val="none" w:color="FFFFFF" w:sz="0"/>
+            </w:tcBorders>
+            <w:tcMar>
+              <w:top w:type="dxa" w:w="50"/>
+              <w:left w:type="dxa" w:w="60"/>
+              <w:bottom w:type="dxa" w:w="50"/>
+              <w:right w:type="dxa" w:w="60"/>
+            </w:tcMar>
+          </w:tcPr>
+          <w:p>
+            <w:r>
+              <w:rPr>
+                <w:rFonts w:ascii="Garamond" w:cs="Garamond" w:eastAsia="Garamond" w:hAnsi="Garamond"/>
+                <w:color w:val="1A2430"/>
+                <w:sz w:val="18"/>
+                <w:szCs w:val="18"/>
+              </w:rPr>
+              <w:t xml:space="preserve">United States, states</w:t>
+            </w:r>
+          </w:p>
+        </w:tc>
+        <w:tc>
+          <w:tcPr>
+            <w:tcW w:type="dxa" w:w="1950"/>
+            <w:tcBorders>
+              <w:top w:val="none" w:color="FFFFFF" w:sz="0"/>
+              <w:left w:val="none" w:color="FFFFFF" w:sz="0"/>
+              <w:bottom w:val="none" w:color="FFFFFF" w:sz="0"/>
+              <w:right w:val="none" w:color="FFFFFF" w:sz="0"/>
+            </w:tcBorders>
+            <w:tcMar>
+              <w:top w:type="dxa" w:w="50"/>
+              <w:left w:type="dxa" w:w="60"/>
+              <w:bottom w:type="dxa" w:w="50"/>
+              <w:right w:type="dxa" w:w="60"/>
+            </w:tcMar>
+          </w:tcPr>
+          <w:p>
+            <w:r>
+              <w:rPr>
+                <w:rFonts w:ascii="Garamond" w:cs="Garamond" w:eastAsia="Garamond" w:hAnsi="Garamond"/>
+                <w:color w:val="1A2430"/>
+                <w:sz w:val="18"/>
+                <w:szCs w:val="18"/>
+              </w:rPr>
+              <w:t xml:space="preserve">State administrative systems (e.g. Texas TEA, Washington OSPI)</w:t>
+            </w:r>
+          </w:p>
+        </w:tc>
+        <w:tc>
+          <w:tcPr>
+            <w:tcW w:type="dxa" w:w="1500"/>
+            <w:tcBorders>
+              <w:top w:val="none" w:color="FFFFFF" w:sz="0"/>
+              <w:left w:val="none" w:color="FFFFFF" w:sz="0"/>
+              <w:bottom w:val="none" w:color="FFFFFF" w:sz="0"/>
+              <w:right w:val="none" w:color="FFFFFF" w:sz="0"/>
+            </w:tcBorders>
+            <w:tcMar>
+              <w:top w:type="dxa" w:w="50"/>
+              <w:left w:type="dxa" w:w="60"/>
+              <w:bottom w:type="dxa" w:w="50"/>
+              <w:right w:type="dxa" w:w="60"/>
+            </w:tcMar>
+          </w:tcPr>
+          <w:p>
+            <w:r>
+              <w:rPr>
+                <w:rFonts w:ascii="Garamond" w:cs="Garamond" w:eastAsia="Garamond" w:hAnsi="Garamond"/>
+                <w:color w:val="1A2430"/>
+                <w:sz w:val="18"/>
+                <w:szCs w:val="18"/>
+              </w:rPr>
+              <w:t xml:space="preserve">Annual</w:t>
+            </w:r>
+          </w:p>
+        </w:tc>
+        <w:tc>
+          <w:tcPr>
+            <w:tcW w:type="dxa" w:w="2200"/>
+            <w:tcBorders>
+              <w:top w:val="none" w:color="FFFFFF" w:sz="0"/>
+              <w:left w:val="none" w:color="FFFFFF" w:sz="0"/>
+              <w:bottom w:val="none" w:color="FFFFFF" w:sz="0"/>
+              <w:right w:val="none" w:color="FFFFFF" w:sz="0"/>
+            </w:tcBorders>
+            <w:tcMar>
+              <w:top w:type="dxa" w:w="50"/>
+              <w:left w:type="dxa" w:w="60"/>
+              <w:bottom w:type="dxa" w:w="50"/>
+              <w:right w:type="dxa" w:w="60"/>
+            </w:tcMar>
+          </w:tcPr>
+          <w:p>
+            <w:r>
+              <w:rPr>
+                <w:rFonts w:ascii="Garamond" w:cs="Garamond" w:eastAsia="Garamond" w:hAnsi="Garamond"/>
+                <w:color w:val="1A2430"/>
+                <w:sz w:val="18"/>
+                <w:szCs w:val="18"/>
+              </w:rPr>
+              <w:t xml:space="preserve">Exit from the state public teaching workforce</w:t>
+            </w:r>
+          </w:p>
+        </w:tc>
+        <w:tc>
+          <w:tcPr>
+            <w:tcW w:type="dxa" w:w="2260"/>
+            <w:tcBorders>
+              <w:top w:val="none" w:color="FFFFFF" w:sz="0"/>
+              <w:left w:val="none" w:color="FFFFFF" w:sz="0"/>
+              <w:bottom w:val="none" w:color="FFFFFF" w:sz="0"/>
+              <w:right w:val="none" w:color="FFFFFF" w:sz="0"/>
+            </w:tcBorders>
+            <w:tcMar>
+              <w:top w:type="dxa" w:w="50"/>
+              <w:left w:type="dxa" w:w="60"/>
+              <w:bottom w:type="dxa" w:w="50"/>
+              <w:right w:type="dxa" w:w="60"/>
+            </w:tcMar>
+          </w:tcPr>
+          <w:p>
+            <w:r>
+              <w:rPr>
+                <w:rFonts w:ascii="Garamond" w:cs="Garamond" w:eastAsia="Garamond" w:hAnsi="Garamond"/>
+                <w:color w:val="1A2430"/>
+                <w:sz w:val="18"/>
+                <w:szCs w:val="18"/>
+              </w:rPr>
+              <w:t xml:space="preserve">Aggregates public; Washington person-level files public, Texas secure enclave only</w:t>
+            </w:r>
+          </w:p>
+        </w:tc>
+      </w:tr>
+      <w:tr>
+        <w:tc>
+          <w:tcPr>
+            <w:tcW w:type="dxa" w:w="1150"/>
+            <w:tcBorders>
+              <w:top w:val="none" w:color="FFFFFF" w:sz="0"/>
+              <w:left w:val="none" w:color="FFFFFF" w:sz="0"/>
+              <w:bottom w:val="none" w:color="FFFFFF" w:sz="0"/>
+              <w:right w:val="none" w:color="FFFFFF" w:sz="0"/>
+            </w:tcBorders>
+            <w:tcMar>
+              <w:top w:type="dxa" w:w="50"/>
+              <w:left w:type="dxa" w:w="60"/>
+              <w:bottom w:type="dxa" w:w="50"/>
+              <w:right w:type="dxa" w:w="60"/>
+            </w:tcMar>
+          </w:tcPr>
+          <w:p>
+            <w:r>
+              <w:rPr>
+                <w:rFonts w:ascii="Garamond" w:cs="Garamond" w:eastAsia="Garamond" w:hAnsi="Garamond"/>
+                <w:color w:val="1A2430"/>
+                <w:sz w:val="18"/>
+                <w:szCs w:val="18"/>
+              </w:rPr>
+              <w:t xml:space="preserve">United Kingdom</w:t>
+            </w:r>
+          </w:p>
+        </w:tc>
+        <w:tc>
+          <w:tcPr>
+            <w:tcW w:type="dxa" w:w="1950"/>
+            <w:tcBorders>
+              <w:top w:val="none" w:color="FFFFFF" w:sz="0"/>
+              <w:left w:val="none" w:color="FFFFFF" w:sz="0"/>
+              <w:bottom w:val="none" w:color="FFFFFF" w:sz="0"/>
+              <w:right w:val="none" w:color="FFFFFF" w:sz="0"/>
+            </w:tcBorders>
+            <w:tcMar>
+              <w:top w:type="dxa" w:w="50"/>
+              <w:left w:type="dxa" w:w="60"/>
+              <w:bottom w:type="dxa" w:w="50"/>
+              <w:right w:type="dxa" w:w="60"/>
+            </w:tcMar>
+          </w:tcPr>
+          <w:p>
+            <w:r>
+              <w:rPr>
+                <w:rFonts w:ascii="Garamond" w:cs="Garamond" w:eastAsia="Garamond" w:hAnsi="Garamond"/>
+                <w:color w:val="1A2430"/>
+                <w:sz w:val="18"/>
+                <w:szCs w:val="18"/>
+              </w:rPr>
+              <w:t xml:space="preserve">School Workforce Census (DfE, England)</w:t>
+            </w:r>
+          </w:p>
+        </w:tc>
+        <w:tc>
+          <w:tcPr>
+            <w:tcW w:type="dxa" w:w="1500"/>
+            <w:tcBorders>
+              <w:top w:val="none" w:color="FFFFFF" w:sz="0"/>
+              <w:left w:val="none" w:color="FFFFFF" w:sz="0"/>
+              <w:bottom w:val="none" w:color="FFFFFF" w:sz="0"/>
+              <w:right w:val="none" w:color="FFFFFF" w:sz="0"/>
+            </w:tcBorders>
+            <w:tcMar>
+              <w:top w:type="dxa" w:w="50"/>
+              <w:left w:type="dxa" w:w="60"/>
+              <w:bottom w:type="dxa" w:w="50"/>
+              <w:right w:type="dxa" w:w="60"/>
+            </w:tcMar>
+          </w:tcPr>
+          <w:p>
+            <w:r>
+              <w:rPr>
+                <w:rFonts w:ascii="Garamond" w:cs="Garamond" w:eastAsia="Garamond" w:hAnsi="Garamond"/>
+                <w:color w:val="1A2430"/>
+                <w:sz w:val="18"/>
+                <w:szCs w:val="18"/>
+              </w:rPr>
+              <w:t xml:space="preserve">Annual since 2010</w:t>
+            </w:r>
+          </w:p>
+        </w:tc>
+        <w:tc>
+          <w:tcPr>
+            <w:tcW w:type="dxa" w:w="2200"/>
+            <w:tcBorders>
+              <w:top w:val="none" w:color="FFFFFF" w:sz="0"/>
+              <w:left w:val="none" w:color="FFFFFF" w:sz="0"/>
+              <w:bottom w:val="none" w:color="FFFFFF" w:sz="0"/>
+              <w:right w:val="none" w:color="FFFFFF" w:sz="0"/>
+            </w:tcBorders>
+            <w:tcMar>
+              <w:top w:type="dxa" w:w="50"/>
+              <w:left w:type="dxa" w:w="60"/>
+              <w:bottom w:type="dxa" w:w="50"/>
+              <w:right w:type="dxa" w:w="60"/>
+            </w:tcMar>
+          </w:tcPr>
+          <w:p>
+            <w:r>
+              <w:rPr>
+                <w:rFonts w:ascii="Garamond" w:cs="Garamond" w:eastAsia="Garamond" w:hAnsi="Garamond"/>
+                <w:color w:val="1A2430"/>
+                <w:sz w:val="18"/>
+                <w:szCs w:val="18"/>
+              </w:rPr>
+              <w:t xml:space="preserve">Qualified teachers leaving the state-funded sector, by leaver type</w:t>
+            </w:r>
+          </w:p>
+        </w:tc>
+        <w:tc>
+          <w:tcPr>
+            <w:tcW w:type="dxa" w:w="2260"/>
+            <w:tcBorders>
+              <w:top w:val="none" w:color="FFFFFF" w:sz="0"/>
+              <w:left w:val="none" w:color="FFFFFF" w:sz="0"/>
+              <w:bottom w:val="none" w:color="FFFFFF" w:sz="0"/>
+              <w:right w:val="none" w:color="FFFFFF" w:sz="0"/>
+            </w:tcBorders>
+            <w:tcMar>
+              <w:top w:type="dxa" w:w="50"/>
+              <w:left w:type="dxa" w:w="60"/>
+              <w:bottom w:type="dxa" w:w="50"/>
+              <w:right w:type="dxa" w:w="60"/>
+            </w:tcMar>
+          </w:tcPr>
+          <w:p>
+            <w:r>
+              <w:rPr>
+                <w:rFonts w:ascii="Garamond" w:cs="Garamond" w:eastAsia="Garamond" w:hAnsi="Garamond"/>
+                <w:color w:val="1A2430"/>
+                <w:sz w:val="18"/>
+                <w:szCs w:val="18"/>
+              </w:rPr>
+              <w:t xml:space="preserve">Open granular tables; microdata via ONS Secure Research Service</w:t>
+            </w:r>
+          </w:p>
+        </w:tc>
+      </w:tr>
+      <w:tr>
+        <w:tc>
+          <w:tcPr>
+            <w:tcW w:type="dxa" w:w="1150"/>
+            <w:tcBorders>
+              <w:top w:val="none" w:color="FFFFFF" w:sz="0"/>
+              <w:left w:val="none" w:color="FFFFFF" w:sz="0"/>
+              <w:bottom w:val="none" w:color="FFFFFF" w:sz="0"/>
+              <w:right w:val="none" w:color="FFFFFF" w:sz="0"/>
+            </w:tcBorders>
+            <w:tcMar>
+              <w:top w:type="dxa" w:w="50"/>
+              <w:left w:type="dxa" w:w="60"/>
+              <w:bottom w:type="dxa" w:w="50"/>
+              <w:right w:type="dxa" w:w="60"/>
+            </w:tcMar>
+          </w:tcPr>
+          <w:p>
+            <w:r>
+              <w:rPr>
+                <w:rFonts w:ascii="Garamond" w:cs="Garamond" w:eastAsia="Garamond" w:hAnsi="Garamond"/>
+                <w:color w:val="1A2430"/>
+                <w:sz w:val="18"/>
+                <w:szCs w:val="18"/>
+              </w:rPr>
+              <w:t xml:space="preserve">Germany</w:t>
+            </w:r>
+          </w:p>
+        </w:tc>
+        <w:tc>
+          <w:tcPr>
+            <w:tcW w:type="dxa" w:w="1950"/>
+            <w:tcBorders>
+              <w:top w:val="none" w:color="FFFFFF" w:sz="0"/>
+              <w:left w:val="none" w:color="FFFFFF" w:sz="0"/>
+              <w:bottom w:val="none" w:color="FFFFFF" w:sz="0"/>
+              <w:right w:val="none" w:color="FFFFFF" w:sz="0"/>
+            </w:tcBorders>
+            <w:tcMar>
+              <w:top w:type="dxa" w:w="50"/>
+              <w:left w:type="dxa" w:w="60"/>
+              <w:bottom w:type="dxa" w:w="50"/>
+              <w:right w:type="dxa" w:w="60"/>
+            </w:tcMar>
+          </w:tcPr>
+          <w:p>
+            <w:r>
+              <w:rPr>
+                <w:rFonts w:ascii="Garamond" w:cs="Garamond" w:eastAsia="Garamond" w:hAnsi="Garamond"/>
+                <w:color w:val="1A2430"/>
+                <w:sz w:val="18"/>
+                <w:szCs w:val="18"/>
+              </w:rPr>
+              <w:t xml:space="preserve">School statistics (Destatis and Länder offices)</w:t>
+            </w:r>
+          </w:p>
+        </w:tc>
+        <w:tc>
+          <w:tcPr>
+            <w:tcW w:type="dxa" w:w="1500"/>
+            <w:tcBorders>
+              <w:top w:val="none" w:color="FFFFFF" w:sz="0"/>
+              <w:left w:val="none" w:color="FFFFFF" w:sz="0"/>
+              <w:bottom w:val="none" w:color="FFFFFF" w:sz="0"/>
+              <w:right w:val="none" w:color="FFFFFF" w:sz="0"/>
+            </w:tcBorders>
+            <w:tcMar>
+              <w:top w:type="dxa" w:w="50"/>
+              <w:left w:type="dxa" w:w="60"/>
+              <w:bottom w:type="dxa" w:w="50"/>
+              <w:right w:type="dxa" w:w="60"/>
+            </w:tcMar>
+          </w:tcPr>
+          <w:p>
+            <w:r>
+              <w:rPr>
+                <w:rFonts w:ascii="Garamond" w:cs="Garamond" w:eastAsia="Garamond" w:hAnsi="Garamond"/>
+                <w:color w:val="1A2430"/>
+                <w:sz w:val="18"/>
+                <w:szCs w:val="18"/>
+              </w:rPr>
+              <w:t xml:space="preserve">Annual</w:t>
+            </w:r>
+          </w:p>
+        </w:tc>
+        <w:tc>
+          <w:tcPr>
+            <w:tcW w:type="dxa" w:w="2200"/>
+            <w:tcBorders>
+              <w:top w:val="none" w:color="FFFFFF" w:sz="0"/>
+              <w:left w:val="none" w:color="FFFFFF" w:sz="0"/>
+              <w:bottom w:val="none" w:color="FFFFFF" w:sz="0"/>
+              <w:right w:val="none" w:color="FFFFFF" w:sz="0"/>
+            </w:tcBorders>
+            <w:tcMar>
+              <w:top w:type="dxa" w:w="50"/>
+              <w:left w:type="dxa" w:w="60"/>
+              <w:bottom w:type="dxa" w:w="50"/>
+              <w:right w:type="dxa" w:w="60"/>
+            </w:tcMar>
+          </w:tcPr>
+          <w:p>
+            <w:r>
+              <w:rPr>
+                <w:rFonts w:ascii="Garamond" w:cs="Garamond" w:eastAsia="Garamond" w:hAnsi="Garamond"/>
+                <w:color w:val="1A2430"/>
+                <w:sz w:val="18"/>
+                <w:szCs w:val="18"/>
+              </w:rPr>
+              <w:t xml:space="preserve">Departures from school service by reason; Bavaria, Lower Saxony and NRW missing since 2014/15</w:t>
+            </w:r>
+          </w:p>
+        </w:tc>
+        <w:tc>
+          <w:tcPr>
+            <w:tcW w:type="dxa" w:w="2260"/>
+            <w:tcBorders>
+              <w:top w:val="none" w:color="FFFFFF" w:sz="0"/>
+              <w:left w:val="none" w:color="FFFFFF" w:sz="0"/>
+              <w:bottom w:val="none" w:color="FFFFFF" w:sz="0"/>
+              <w:right w:val="none" w:color="FFFFFF" w:sz="0"/>
+            </w:tcBorders>
+            <w:tcMar>
+              <w:top w:type="dxa" w:w="50"/>
+              <w:left w:type="dxa" w:w="60"/>
+              <w:bottom w:type="dxa" w:w="50"/>
+              <w:right w:type="dxa" w:w="60"/>
+            </w:tcMar>
+          </w:tcPr>
+          <w:p>
+            <w:r>
+              <w:rPr>
+                <w:rFonts w:ascii="Garamond" w:cs="Garamond" w:eastAsia="Garamond" w:hAnsi="Garamond"/>
+                <w:color w:val="1A2430"/>
+                <w:sz w:val="18"/>
+                <w:szCs w:val="18"/>
+              </w:rPr>
+              <w:t xml:space="preserve">Tables free to download; microdata via research data center contracts</w:t>
+            </w:r>
+          </w:p>
+        </w:tc>
+      </w:tr>
+      <w:tr>
+        <w:tc>
+          <w:tcPr>
+            <w:tcW w:type="dxa" w:w="1150"/>
+            <w:tcBorders>
+              <w:top w:val="none" w:color="FFFFFF" w:sz="0"/>
+              <w:left w:val="none" w:color="FFFFFF" w:sz="0"/>
+              <w:bottom w:val="none" w:color="FFFFFF" w:sz="0"/>
+              <w:right w:val="none" w:color="FFFFFF" w:sz="0"/>
+            </w:tcBorders>
+            <w:tcMar>
+              <w:top w:type="dxa" w:w="50"/>
+              <w:left w:type="dxa" w:w="60"/>
+              <w:bottom w:type="dxa" w:w="50"/>
+              <w:right w:type="dxa" w:w="60"/>
+            </w:tcMar>
+          </w:tcPr>
+          <w:p>
+            <w:r>
+              <w:rPr>
+                <w:rFonts w:ascii="Garamond" w:cs="Garamond" w:eastAsia="Garamond" w:hAnsi="Garamond"/>
+                <w:color w:val="1A2430"/>
+                <w:sz w:val="18"/>
+                <w:szCs w:val="18"/>
+              </w:rPr>
+              <w:t xml:space="preserve">Australia</w:t>
+            </w:r>
+          </w:p>
+        </w:tc>
+        <w:tc>
+          <w:tcPr>
+            <w:tcW w:type="dxa" w:w="1950"/>
+            <w:tcBorders>
+              <w:top w:val="none" w:color="FFFFFF" w:sz="0"/>
+              <w:left w:val="none" w:color="FFFFFF" w:sz="0"/>
+              <w:bottom w:val="none" w:color="FFFFFF" w:sz="0"/>
+              <w:right w:val="none" w:color="FFFFFF" w:sz="0"/>
+            </w:tcBorders>
+            <w:tcMar>
+              <w:top w:type="dxa" w:w="50"/>
+              <w:left w:type="dxa" w:w="60"/>
+              <w:bottom w:type="dxa" w:w="50"/>
+              <w:right w:type="dxa" w:w="60"/>
+            </w:tcMar>
+          </w:tcPr>
+          <w:p>
+            <w:r>
+              <w:rPr>
+                <w:rFonts w:ascii="Garamond" w:cs="Garamond" w:eastAsia="Garamond" w:hAnsi="Garamond"/>
+                <w:color w:val="1A2430"/>
+                <w:sz w:val="18"/>
+                <w:szCs w:val="18"/>
+              </w:rPr>
+              <w:t xml:space="preserve">Australian Teacher Workforce Data (AITSL)</w:t>
+            </w:r>
+          </w:p>
+        </w:tc>
+        <w:tc>
+          <w:tcPr>
+            <w:tcW w:type="dxa" w:w="1500"/>
+            <w:tcBorders>
+              <w:top w:val="none" w:color="FFFFFF" w:sz="0"/>
+              <w:left w:val="none" w:color="FFFFFF" w:sz="0"/>
+              <w:bottom w:val="none" w:color="FFFFFF" w:sz="0"/>
+              <w:right w:val="none" w:color="FFFFFF" w:sz="0"/>
+            </w:tcBorders>
+            <w:tcMar>
+              <w:top w:type="dxa" w:w="50"/>
+              <w:left w:type="dxa" w:w="60"/>
+              <w:bottom w:type="dxa" w:w="50"/>
+              <w:right w:type="dxa" w:w="60"/>
+            </w:tcMar>
+          </w:tcPr>
+          <w:p>
+            <w:r>
+              <w:rPr>
+                <w:rFonts w:ascii="Garamond" w:cs="Garamond" w:eastAsia="Garamond" w:hAnsi="Garamond"/>
+                <w:color w:val="1A2430"/>
+                <w:sz w:val="18"/>
+                <w:szCs w:val="18"/>
+              </w:rPr>
+              <w:t xml:space="preserve">Annual national reports since 2021</w:t>
+            </w:r>
+          </w:p>
+        </w:tc>
+        <w:tc>
+          <w:tcPr>
+            <w:tcW w:type="dxa" w:w="2200"/>
+            <w:tcBorders>
+              <w:top w:val="none" w:color="FFFFFF" w:sz="0"/>
+              <w:left w:val="none" w:color="FFFFFF" w:sz="0"/>
+              <w:bottom w:val="none" w:color="FFFFFF" w:sz="0"/>
+              <w:right w:val="none" w:color="FFFFFF" w:sz="0"/>
+            </w:tcBorders>
+            <w:tcMar>
+              <w:top w:type="dxa" w:w="50"/>
+              <w:left w:type="dxa" w:w="60"/>
+              <w:bottom w:type="dxa" w:w="50"/>
+              <w:right w:type="dxa" w:w="60"/>
+            </w:tcMar>
+          </w:tcPr>
+          <w:p>
+            <w:r>
+              <w:rPr>
+                <w:rFonts w:ascii="Garamond" w:cs="Garamond" w:eastAsia="Garamond" w:hAnsi="Garamond"/>
+                <w:color w:val="1A2430"/>
+                <w:sz w:val="18"/>
+                <w:szCs w:val="18"/>
+              </w:rPr>
+              <w:t xml:space="preserve">Registration-based attrition indicators, all sectors</w:t>
+            </w:r>
+          </w:p>
+        </w:tc>
+        <w:tc>
+          <w:tcPr>
+            <w:tcW w:type="dxa" w:w="2260"/>
+            <w:tcBorders>
+              <w:top w:val="none" w:color="FFFFFF" w:sz="0"/>
+              <w:left w:val="none" w:color="FFFFFF" w:sz="0"/>
+              <w:bottom w:val="none" w:color="FFFFFF" w:sz="0"/>
+              <w:right w:val="none" w:color="FFFFFF" w:sz="0"/>
+            </w:tcBorders>
+            <w:tcMar>
+              <w:top w:type="dxa" w:w="50"/>
+              <w:left w:type="dxa" w:w="60"/>
+              <w:bottom w:type="dxa" w:w="50"/>
+              <w:right w:type="dxa" w:w="60"/>
+            </w:tcMar>
+          </w:tcPr>
+          <w:p>
+            <w:r>
+              <w:rPr>
+                <w:rFonts w:ascii="Garamond" w:cs="Garamond" w:eastAsia="Garamond" w:hAnsi="Garamond"/>
+                <w:color w:val="1A2430"/>
+                <w:sz w:val="18"/>
+                <w:szCs w:val="18"/>
+              </w:rPr>
+              <w:t xml:space="preserve">Reports and dashboards public; unit records in secure environment, no extraction</w:t>
+            </w:r>
+          </w:p>
+        </w:tc>
+      </w:tr>
+      <w:tr>
+        <w:tc>
+          <w:tcPr>
+            <w:tcW w:type="dxa" w:w="1150"/>
+            <w:tcBorders>
+              <w:top w:val="none" w:color="FFFFFF" w:sz="0"/>
+              <w:left w:val="none" w:color="FFFFFF" w:sz="0"/>
+              <w:bottom w:val="none" w:color="FFFFFF" w:sz="0"/>
+              <w:right w:val="none" w:color="FFFFFF" w:sz="0"/>
+            </w:tcBorders>
+            <w:tcMar>
+              <w:top w:type="dxa" w:w="50"/>
+              <w:left w:type="dxa" w:w="60"/>
+              <w:bottom w:type="dxa" w:w="50"/>
+              <w:right w:type="dxa" w:w="60"/>
+            </w:tcMar>
+          </w:tcPr>
+          <w:p>
+            <w:r>
+              <w:rPr>
+                <w:rFonts w:ascii="Garamond" w:cs="Garamond" w:eastAsia="Garamond" w:hAnsi="Garamond"/>
+                <w:color w:val="1A2430"/>
+                <w:sz w:val="18"/>
+                <w:szCs w:val="18"/>
+              </w:rPr>
+              <w:t xml:space="preserve">South Korea</w:t>
+            </w:r>
+          </w:p>
+        </w:tc>
+        <w:tc>
+          <w:tcPr>
+            <w:tcW w:type="dxa" w:w="1950"/>
+            <w:tcBorders>
+              <w:top w:val="none" w:color="FFFFFF" w:sz="0"/>
+              <w:left w:val="none" w:color="FFFFFF" w:sz="0"/>
+              <w:bottom w:val="none" w:color="FFFFFF" w:sz="0"/>
+              <w:right w:val="none" w:color="FFFFFF" w:sz="0"/>
+            </w:tcBorders>
+            <w:tcMar>
+              <w:top w:type="dxa" w:w="50"/>
+              <w:left w:type="dxa" w:w="60"/>
+              <w:bottom w:type="dxa" w:w="50"/>
+              <w:right w:type="dxa" w:w="60"/>
+            </w:tcMar>
+          </w:tcPr>
+          <w:p>
+            <w:r>
+              <w:rPr>
+                <w:rFonts w:ascii="Garamond" w:cs="Garamond" w:eastAsia="Garamond" w:hAnsi="Garamond"/>
+                <w:color w:val="1A2430"/>
+                <w:sz w:val="18"/>
+                <w:szCs w:val="18"/>
+              </w:rPr>
+              <w:t xml:space="preserve">Educational statistics (KEDI/KESS); Teachers’ Pension open data</w:t>
+            </w:r>
+          </w:p>
+        </w:tc>
+        <w:tc>
+          <w:tcPr>
+            <w:tcW w:type="dxa" w:w="1500"/>
+            <w:tcBorders>
+              <w:top w:val="none" w:color="FFFFFF" w:sz="0"/>
+              <w:left w:val="none" w:color="FFFFFF" w:sz="0"/>
+              <w:bottom w:val="none" w:color="FFFFFF" w:sz="0"/>
+              <w:right w:val="none" w:color="FFFFFF" w:sz="0"/>
+            </w:tcBorders>
+            <w:tcMar>
+              <w:top w:type="dxa" w:w="50"/>
+              <w:left w:type="dxa" w:w="60"/>
+              <w:bottom w:type="dxa" w:w="50"/>
+              <w:right w:type="dxa" w:w="60"/>
+            </w:tcMar>
+          </w:tcPr>
+          <w:p>
+            <w:r>
+              <w:rPr>
+                <w:rFonts w:ascii="Garamond" w:cs="Garamond" w:eastAsia="Garamond" w:hAnsi="Garamond"/>
+                <w:color w:val="1A2430"/>
+                <w:sz w:val="18"/>
+                <w:szCs w:val="18"/>
+              </w:rPr>
+              <w:t xml:space="preserve">Annual</w:t>
+            </w:r>
+          </w:p>
+        </w:tc>
+        <w:tc>
+          <w:tcPr>
+            <w:tcW w:type="dxa" w:w="2200"/>
+            <w:tcBorders>
+              <w:top w:val="none" w:color="FFFFFF" w:sz="0"/>
+              <w:left w:val="none" w:color="FFFFFF" w:sz="0"/>
+              <w:bottom w:val="none" w:color="FFFFFF" w:sz="0"/>
+              <w:right w:val="none" w:color="FFFFFF" w:sz="0"/>
+            </w:tcBorders>
+            <w:tcMar>
+              <w:top w:type="dxa" w:w="50"/>
+              <w:left w:type="dxa" w:w="60"/>
+              <w:bottom w:type="dxa" w:w="50"/>
+              <w:right w:type="dxa" w:w="60"/>
+            </w:tcMar>
+          </w:tcPr>
+          <w:p>
+            <w:r>
+              <w:rPr>
+                <w:rFonts w:ascii="Garamond" w:cs="Garamond" w:eastAsia="Garamond" w:hAnsi="Garamond"/>
+                <w:color w:val="1A2430"/>
+                <w:sz w:val="18"/>
+                <w:szCs w:val="18"/>
+              </w:rPr>
+              <w:t xml:space="preserve">Departures by cause: retirement, honorary retirement, resignation</w:t>
+            </w:r>
+          </w:p>
+        </w:tc>
+        <w:tc>
+          <w:tcPr>
+            <w:tcW w:type="dxa" w:w="2260"/>
+            <w:tcBorders>
+              <w:top w:val="none" w:color="FFFFFF" w:sz="0"/>
+              <w:left w:val="none" w:color="FFFFFF" w:sz="0"/>
+              <w:bottom w:val="none" w:color="FFFFFF" w:sz="0"/>
+              <w:right w:val="none" w:color="FFFFFF" w:sz="0"/>
+            </w:tcBorders>
+            <w:tcMar>
+              <w:top w:type="dxa" w:w="50"/>
+              <w:left w:type="dxa" w:w="60"/>
+              <w:bottom w:type="dxa" w:w="50"/>
+              <w:right w:type="dxa" w:w="60"/>
+            </w:tcMar>
+          </w:tcPr>
+          <w:p>
+            <w:r>
+              <w:rPr>
+                <w:rFonts w:ascii="Garamond" w:cs="Garamond" w:eastAsia="Garamond" w:hAnsi="Garamond"/>
+                <w:color w:val="1A2430"/>
+                <w:sz w:val="18"/>
+                <w:szCs w:val="18"/>
+              </w:rPr>
+              <w:t xml:space="preserve">Yearbook and open-data files public; no teacher-level microdata released</w:t>
+            </w:r>
+          </w:p>
+        </w:tc>
+      </w:tr>
+      <w:tr>
+        <w:tc>
+          <w:tcPr>
+            <w:tcW w:type="dxa" w:w="1150"/>
+            <w:tcBorders>
+              <w:top w:val="none" w:color="FFFFFF" w:sz="0"/>
+              <w:left w:val="none" w:color="FFFFFF" w:sz="0"/>
+              <w:bottom w:val="none" w:color="FFFFFF" w:sz="0"/>
+              <w:right w:val="none" w:color="FFFFFF" w:sz="0"/>
+            </w:tcBorders>
+            <w:tcMar>
+              <w:top w:type="dxa" w:w="50"/>
+              <w:left w:type="dxa" w:w="60"/>
+              <w:bottom w:type="dxa" w:w="50"/>
+              <w:right w:type="dxa" w:w="60"/>
+            </w:tcMar>
+          </w:tcPr>
+          <w:p>
+            <w:r>
+              <w:rPr>
+                <w:rFonts w:ascii="Garamond" w:cs="Garamond" w:eastAsia="Garamond" w:hAnsi="Garamond"/>
+                <w:color w:val="1A2430"/>
+                <w:sz w:val="18"/>
+                <w:szCs w:val="18"/>
+              </w:rPr>
+              <w:t xml:space="preserve">Netherlands</w:t>
+            </w:r>
+          </w:p>
+        </w:tc>
+        <w:tc>
+          <w:tcPr>
+            <w:tcW w:type="dxa" w:w="1950"/>
+            <w:tcBorders>
+              <w:top w:val="none" w:color="FFFFFF" w:sz="0"/>
+              <w:left w:val="none" w:color="FFFFFF" w:sz="0"/>
+              <w:bottom w:val="none" w:color="FFFFFF" w:sz="0"/>
+              <w:right w:val="none" w:color="FFFFFF" w:sz="0"/>
+            </w:tcBorders>
+            <w:tcMar>
+              <w:top w:type="dxa" w:w="50"/>
+              <w:left w:type="dxa" w:w="60"/>
+              <w:bottom w:type="dxa" w:w="50"/>
+              <w:right w:type="dxa" w:w="60"/>
+            </w:tcMar>
+          </w:tcPr>
+          <w:p>
+            <w:r>
+              <w:rPr>
+                <w:rFonts w:ascii="Garamond" w:cs="Garamond" w:eastAsia="Garamond" w:hAnsi="Garamond"/>
+                <w:color w:val="1A2430"/>
+                <w:sz w:val="18"/>
+                <w:szCs w:val="18"/>
+              </w:rPr>
+              <w:t xml:space="preserve">Trendrapportage Arbeidsmarkt Leraren (OCW, on DUO payroll records)</w:t>
+            </w:r>
+          </w:p>
+        </w:tc>
+        <w:tc>
+          <w:tcPr>
+            <w:tcW w:type="dxa" w:w="1500"/>
+            <w:tcBorders>
+              <w:top w:val="none" w:color="FFFFFF" w:sz="0"/>
+              <w:left w:val="none" w:color="FFFFFF" w:sz="0"/>
+              <w:bottom w:val="none" w:color="FFFFFF" w:sz="0"/>
+              <w:right w:val="none" w:color="FFFFFF" w:sz="0"/>
+            </w:tcBorders>
+            <w:tcMar>
+              <w:top w:type="dxa" w:w="50"/>
+              <w:left w:type="dxa" w:w="60"/>
+              <w:bottom w:type="dxa" w:w="50"/>
+              <w:right w:type="dxa" w:w="60"/>
+            </w:tcMar>
+          </w:tcPr>
+          <w:p>
+            <w:r>
+              <w:rPr>
+                <w:rFonts w:ascii="Garamond" w:cs="Garamond" w:eastAsia="Garamond" w:hAnsi="Garamond"/>
+                <w:color w:val="1A2430"/>
+                <w:sz w:val="18"/>
+                <w:szCs w:val="18"/>
+              </w:rPr>
+              <w:t xml:space="preserve">Annual</w:t>
+            </w:r>
+          </w:p>
+        </w:tc>
+        <w:tc>
+          <w:tcPr>
+            <w:tcW w:type="dxa" w:w="2200"/>
+            <w:tcBorders>
+              <w:top w:val="none" w:color="FFFFFF" w:sz="0"/>
+              <w:left w:val="none" w:color="FFFFFF" w:sz="0"/>
+              <w:bottom w:val="none" w:color="FFFFFF" w:sz="0"/>
+              <w:right w:val="none" w:color="FFFFFF" w:sz="0"/>
+            </w:tcBorders>
+            <w:tcMar>
+              <w:top w:type="dxa" w:w="50"/>
+              <w:left w:type="dxa" w:w="60"/>
+              <w:bottom w:type="dxa" w:w="50"/>
+              <w:right w:type="dxa" w:w="60"/>
+            </w:tcMar>
+          </w:tcPr>
+          <w:p>
+            <w:r>
+              <w:rPr>
+                <w:rFonts w:ascii="Garamond" w:cs="Garamond" w:eastAsia="Garamond" w:hAnsi="Garamond"/>
+                <w:color w:val="1A2430"/>
+                <w:sz w:val="18"/>
+                <w:szCs w:val="18"/>
+              </w:rPr>
+              <w:t xml:space="preserve">Outflow from government-funded education by sector and age</w:t>
+            </w:r>
+          </w:p>
+        </w:tc>
+        <w:tc>
+          <w:tcPr>
+            <w:tcW w:type="dxa" w:w="2260"/>
+            <w:tcBorders>
+              <w:top w:val="none" w:color="FFFFFF" w:sz="0"/>
+              <w:left w:val="none" w:color="FFFFFF" w:sz="0"/>
+              <w:bottom w:val="none" w:color="FFFFFF" w:sz="0"/>
+              <w:right w:val="none" w:color="FFFFFF" w:sz="0"/>
+            </w:tcBorders>
+            <w:tcMar>
+              <w:top w:type="dxa" w:w="50"/>
+              <w:left w:type="dxa" w:w="60"/>
+              <w:bottom w:type="dxa" w:w="50"/>
+              <w:right w:type="dxa" w:w="60"/>
+            </w:tcMar>
+          </w:tcPr>
+          <w:p>
+            <w:r>
+              <w:rPr>
+                <w:rFonts w:ascii="Garamond" w:cs="Garamond" w:eastAsia="Garamond" w:hAnsi="Garamond"/>
+                <w:color w:val="1A2430"/>
+                <w:sz w:val="18"/>
+                <w:szCs w:val="18"/>
+              </w:rPr>
+              <w:t xml:space="preserve">Reports, dashboards and DUO open data public; person-level via CBS remote access</w:t>
+            </w:r>
+          </w:p>
+        </w:tc>
+      </w:tr>
+      <w:tr>
+        <w:tc>
+          <w:tcPr>
+            <w:tcW w:type="dxa" w:w="1150"/>
+            <w:tcBorders>
+              <w:top w:val="none" w:color="FFFFFF" w:sz="0"/>
+              <w:left w:val="none" w:color="FFFFFF" w:sz="0"/>
+              <w:bottom w:val="single" w:color="1A2430" w:sz="6"/>
+              <w:right w:val="none" w:color="FFFFFF" w:sz="0"/>
+            </w:tcBorders>
+            <w:tcMar>
+              <w:top w:type="dxa" w:w="50"/>
+              <w:left w:type="dxa" w:w="60"/>
+              <w:bottom w:type="dxa" w:w="50"/>
+              <w:right w:type="dxa" w:w="60"/>
+            </w:tcMar>
+          </w:tcPr>
+          <w:p>
+            <w:r>
+              <w:rPr>
+                <w:rFonts w:ascii="Garamond" w:cs="Garamond" w:eastAsia="Garamond" w:hAnsi="Garamond"/>
+                <w:color w:val="1A2430"/>
+                <w:sz w:val="18"/>
+                <w:szCs w:val="18"/>
+              </w:rPr>
+              <w:t xml:space="preserve">Switzerland</w:t>
+            </w:r>
+          </w:p>
+        </w:tc>
+        <w:tc>
+          <w:tcPr>
+            <w:tcW w:type="dxa" w:w="1950"/>
+            <w:tcBorders>
+              <w:top w:val="none" w:color="FFFFFF" w:sz="0"/>
+              <w:left w:val="none" w:color="FFFFFF" w:sz="0"/>
+              <w:bottom w:val="single" w:color="1A2430" w:sz="6"/>
+              <w:right w:val="none" w:color="FFFFFF" w:sz="0"/>
+            </w:tcBorders>
+            <w:tcMar>
+              <w:top w:type="dxa" w:w="50"/>
+              <w:left w:type="dxa" w:w="60"/>
+              <w:bottom w:type="dxa" w:w="50"/>
+              <w:right w:type="dxa" w:w="60"/>
+            </w:tcMar>
+          </w:tcPr>
+          <w:p>
+            <w:r>
+              <w:rPr>
+                <w:rFonts w:ascii="Garamond" w:cs="Garamond" w:eastAsia="Garamond" w:hAnsi="Garamond"/>
+                <w:color w:val="1A2430"/>
+                <w:sz w:val="18"/>
+                <w:szCs w:val="18"/>
+              </w:rPr>
+              <w:t xml:space="preserve">School staff statistics (BFS) with LABB longitudinal studies</w:t>
+            </w:r>
+          </w:p>
+        </w:tc>
+        <w:tc>
+          <w:tcPr>
+            <w:tcW w:type="dxa" w:w="1500"/>
+            <w:tcBorders>
+              <w:top w:val="none" w:color="FFFFFF" w:sz="0"/>
+              <w:left w:val="none" w:color="FFFFFF" w:sz="0"/>
+              <w:bottom w:val="single" w:color="1A2430" w:sz="6"/>
+              <w:right w:val="none" w:color="FFFFFF" w:sz="0"/>
+            </w:tcBorders>
+            <w:tcMar>
+              <w:top w:type="dxa" w:w="50"/>
+              <w:left w:type="dxa" w:w="60"/>
+              <w:bottom w:type="dxa" w:w="50"/>
+              <w:right w:type="dxa" w:w="60"/>
+            </w:tcMar>
+          </w:tcPr>
+          <w:p>
+            <w:r>
+              <w:rPr>
+                <w:rFonts w:ascii="Garamond" w:cs="Garamond" w:eastAsia="Garamond" w:hAnsi="Garamond"/>
+                <w:color w:val="1A2430"/>
+                <w:sz w:val="18"/>
+                <w:szCs w:val="18"/>
+              </w:rPr>
+              <w:t xml:space="preserve">Stocks annual; attrition studies occasional (2014, 2022)</w:t>
+            </w:r>
+          </w:p>
+        </w:tc>
+        <w:tc>
+          <w:tcPr>
+            <w:tcW w:type="dxa" w:w="2200"/>
+            <w:tcBorders>
+              <w:top w:val="none" w:color="FFFFFF" w:sz="0"/>
+              <w:left w:val="none" w:color="FFFFFF" w:sz="0"/>
+              <w:bottom w:val="single" w:color="1A2430" w:sz="6"/>
+              <w:right w:val="none" w:color="FFFFFF" w:sz="0"/>
+            </w:tcBorders>
+            <w:tcMar>
+              <w:top w:type="dxa" w:w="50"/>
+              <w:left w:type="dxa" w:w="60"/>
+              <w:bottom w:type="dxa" w:w="50"/>
+              <w:right w:type="dxa" w:w="60"/>
+            </w:tcMar>
+          </w:tcPr>
+          <w:p>
+            <w:r>
+              <w:rPr>
+                <w:rFonts w:ascii="Garamond" w:cs="Garamond" w:eastAsia="Garamond" w:hAnsi="Garamond"/>
+                <w:color w:val="1A2430"/>
+                <w:sz w:val="18"/>
+                <w:szCs w:val="18"/>
+              </w:rPr>
+              <w:t xml:space="preserve">Exit from the school registers; cohort retention</w:t>
+            </w:r>
+          </w:p>
+        </w:tc>
+        <w:tc>
+          <w:tcPr>
+            <w:tcW w:type="dxa" w:w="2260"/>
+            <w:tcBorders>
+              <w:top w:val="none" w:color="FFFFFF" w:sz="0"/>
+              <w:left w:val="none" w:color="FFFFFF" w:sz="0"/>
+              <w:bottom w:val="single" w:color="1A2430" w:sz="6"/>
+              <w:right w:val="none" w:color="FFFFFF" w:sz="0"/>
+            </w:tcBorders>
+            <w:tcMar>
+              <w:top w:type="dxa" w:w="50"/>
+              <w:left w:type="dxa" w:w="60"/>
+              <w:bottom w:type="dxa" w:w="50"/>
+              <w:right w:type="dxa" w:w="60"/>
+            </w:tcMar>
+          </w:tcPr>
+          <w:p>
+            <w:r>
+              <w:rPr>
+                <w:rFonts w:ascii="Garamond" w:cs="Garamond" w:eastAsia="Garamond" w:hAnsi="Garamond"/>
+                <w:color w:val="1A2430"/>
+                <w:sz w:val="18"/>
+                <w:szCs w:val="18"/>
+              </w:rPr>
+              <w:t xml:space="preserve">Reports public; microdata by data-protection contract with BFS</w:t>
+            </w:r>
+          </w:p>
+        </w:tc>
+      </w:tr>
+    </w:tbl>
     <w:sectPr>
       <w:pgSz w:w="11906" w:h="16838" w:orient="portrait"/>
       <w:pgMar w:top="1360" w:right="1420" w:bottom="1250" w:left="1420" w:header="708" w:footer="708" w:gutter="0"/>

</xml_diff>

<commit_message>
Annex table audited row by row: verified start years, corrections, per-row sources note
Co-Authored-By: Claude Fable 5 <noreply@anthropic.com>
Claude-Session: https://claude.ai/code/session_01DNzQPDcr3zfLTraMHUHqUn
</commit_message>
<xml_diff>
--- a/report/cpf_proposal.docx
+++ b/report/cpf_proposal.docx
@@ -88,7 +88,22 @@
           <w:sz w:val="22"/>
           <w:szCs w:val="22"/>
         </w:rPr>
-        <w:t xml:space="preserve">Keeping good teachers in the classroom is a first-order concern for every school system, and the starting point is knowing who leaves and who returns. Measuring teacher attrition, however, is hard, as it requires following the same teachers over time. Most countries now publish an aggregate attrition rate each year from administrative records. What is scarce is everything behind the rate. Person-level records sit in secure enclaves, closed registers or restricted licenses, and the public tables carry no personal characteristics, no destinations and no returns. The one national survey that follows leavers to where they go, the American Teacher Follow-up Survey, has run eight times since 1988, with a nine-year gap before its latest wave, and its recent microdata are available only to licensed institutions in the United States </w:t>
+        <w:t xml:space="preserve">Keeping good teachers in the classroom is a first-order concern for every school system, and the starting point is knowing who leaves and who returns. Measuring teacher attrition, however, is hard, as it requires following the same teachers over time. Most countries now publish an aggregate attrition rate each year from administrative records (see Table A1 in the Annex). What is scarce is everything behind the rate. Person-level records sit in secure enclaves, closed registers or restricted licenses, and the public tables carry no personal characteristics, no destinations and no returns.</w:t>
+      </w:r>
+      <w:r>
+        <w:rPr>
+          <w:rStyle w:val="FootnoteReference"/>
+        </w:rPr>
+        <w:footnoteReference w:id="1"/>
+      </w:r>
+      <w:r>
+        <w:rPr>
+          <w:rFonts w:ascii="Garamond" w:cs="Garamond" w:eastAsia="Garamond" w:hAnsi="Garamond"/>
+          <w:color w:val="1A2430"/>
+          <w:sz w:val="22"/>
+          <w:szCs w:val="22"/>
+        </w:rPr>
+        <w:t xml:space="preserve"> The one national survey that follows leavers to where they go, the American Teacher Follow-up Survey, has run eight times since 1988, with a nine-year gap before its latest wave, and its recent microdata are available only to licensed institutions in the United States </w:t>
       </w:r>
       <w:r>
         <w:rPr>
@@ -139,7 +154,22 @@
           <w:sz w:val="22"/>
           <w:szCs w:val="22"/>
         </w:rPr>
-        <w:t xml:space="preserve">, and the numbers in the debate cannot be compared across borders. Annual attrition figures range from about two percent in South Korea to about nine percent in England, but the published statistics count different things. England counts exits from state-funded schools, the Netherlands exits from the education sector, Korea departures before the statutory retirement age, and the United States exits from the profession itself. Longitudinal household surveys that exist in several countries at once are a unique and largely unused opportunity. They follow the same people for decades, they record the family, income and health context that administrative data never see, and they allow rich detail on the profile of the leaver and the returner. A serious international debate on teacher attrition needs the insight they can provide.</w:t>
+        <w:t xml:space="preserve">, and the numbers in the debate cannot be compared across borders. Annual attrition figures range from about two percent in South Korea to about nine percent in England,</w:t>
+      </w:r>
+      <w:r>
+        <w:rPr>
+          <w:rStyle w:val="FootnoteReference"/>
+        </w:rPr>
+        <w:footnoteReference w:id="2"/>
+      </w:r>
+      <w:r>
+        <w:rPr>
+          <w:rFonts w:ascii="Garamond" w:cs="Garamond" w:eastAsia="Garamond" w:hAnsi="Garamond"/>
+          <w:color w:val="1A2430"/>
+          <w:sz w:val="22"/>
+          <w:szCs w:val="22"/>
+        </w:rPr>
+        <w:t xml:space="preserve"> but the published statistics count different things. England counts exits from state-funded schools, the Netherlands exits from the education sector, Korea departures before the statutory retirement age, and the United States exits from the profession itself. Longitudinal household surveys that exist in several countries at once are a unique and largely unused opportunity. They follow the same people for decades, they record the family, income and health context that administrative data never see, and they allow rich detail on the profile of the leaver and the returner. A serious international debate on teacher attrition needs the insight they can provide.</w:t>
       </w:r>
     </w:p>
     <w:p>
@@ -1471,7 +1501,7 @@
           <w:sz w:val="24"/>
           <w:szCs w:val="24"/>
         </w:rPr>
-        <w:t xml:space="preserve">Annex. National publication of teacher attrition statistics</w:t>
+        <w:t xml:space="preserve">Annex</w:t>
       </w:r>
     </w:p>
     <w:p>
@@ -1482,11 +1512,28 @@
       <w:r>
         <w:rPr>
           <w:rFonts w:ascii="Garamond" w:cs="Garamond" w:eastAsia="Garamond" w:hAnsi="Garamond"/>
+          <w:i/>
+          <w:iCs/>
           <w:color w:val="5A6572"/>
           <w:sz w:val="20"/>
           <w:szCs w:val="20"/>
         </w:rPr>
-        <w:t xml:space="preserve">This annex documents the statement in Section 1. Aggregate attrition rates are published annually in five of the seven countries; the federal United States and Switzerland are the exceptions. In no country does the public tier include personal characteristics, destinations or returns.</w:t>
+        <w:t xml:space="preserve">Table A1. National publication of teacher attrition statistics</w:t>
+      </w:r>
+    </w:p>
+    <w:p>
+      <w:pPr>
+        <w:spacing w:after="140" w:line="276" w:lineRule="auto"/>
+        <w:jc w:val="both"/>
+      </w:pPr>
+      <w:r>
+        <w:rPr>
+          <w:rFonts w:ascii="Garamond" w:cs="Garamond" w:eastAsia="Garamond" w:hAnsi="Garamond"/>
+          <w:color w:val="5A6572"/>
+          <w:sz w:val="20"/>
+          <w:szCs w:val="20"/>
+        </w:rPr>
+        <w:t xml:space="preserve">This table documents the statement in Section 1. Aggregate attrition rates are published annually in five of the seven countries; the federal United States and Switzerland are the exceptions. In no country does the public tier include personal characteristics, destinations or returns.</w:t>
       </w:r>
     </w:p>
     <w:tbl>
@@ -1595,7 +1642,7 @@
                 <w:sz w:val="18"/>
                 <w:szCs w:val="18"/>
               </w:rPr>
-              <w:t xml:space="preserve">Frequency</w:t>
+              <w:t xml:space="preserve">Frequency and start</w:t>
             </w:r>
           </w:p>
         </w:tc>
@@ -1741,7 +1788,7 @@
                 <w:sz w:val="18"/>
                 <w:szCs w:val="18"/>
               </w:rPr>
-              <w:t xml:space="preserve">Eight waves since 1988-89; nine-year gap before 2021-22</w:t>
+              <w:t xml:space="preserve">Eight waves, 1988–89 to 2021–22; nine-year gap before the latest</w:t>
             </w:r>
           </w:p>
         </w:tc>
@@ -1855,7 +1902,7 @@
                 <w:sz w:val="18"/>
                 <w:szCs w:val="18"/>
               </w:rPr>
-              <w:t xml:space="preserve">State administrative systems (e.g. Texas TEA, Washington OSPI)</w:t>
+              <w:t xml:space="preserve">State systems: Texas PEIMS (since 1987–88); Washington S-275 (since 1984–85)</w:t>
             </w:r>
           </w:p>
         </w:tc>
@@ -1997,7 +2044,7 @@
                 <w:sz w:val="18"/>
                 <w:szCs w:val="18"/>
               </w:rPr>
-              <w:t xml:space="preserve">School Workforce Census (DfE, England)</w:t>
+              <w:t xml:space="preserve">School Workforce Census (DfE, England); successor of the Form 618G survey</w:t>
             </w:r>
           </w:p>
         </w:tc>
@@ -2025,7 +2072,7 @@
                 <w:sz w:val="18"/>
                 <w:szCs w:val="18"/>
               </w:rPr>
-              <w:t xml:space="preserve">Annual since 2010</w:t>
+              <w:t xml:space="preserve">Annual since November 2010</w:t>
             </w:r>
           </w:p>
         </w:tc>
@@ -2167,7 +2214,7 @@
                 <w:sz w:val="18"/>
                 <w:szCs w:val="18"/>
               </w:rPr>
-              <w:t xml:space="preserve">Annual</w:t>
+              <w:t xml:space="preserve">Annual; departure-by-reason tables published since 1984</w:t>
             </w:r>
           </w:p>
         </w:tc>
@@ -2281,7 +2328,7 @@
                 <w:sz w:val="18"/>
                 <w:szCs w:val="18"/>
               </w:rPr>
-              <w:t xml:space="preserve">Australian Teacher Workforce Data (AITSL)</w:t>
+              <w:t xml:space="preserve">Australian Teacher Workforce Data (AITSL, commissioned 2016)</w:t>
             </w:r>
           </w:p>
         </w:tc>
@@ -2309,7 +2356,7 @@
                 <w:sz w:val="18"/>
                 <w:szCs w:val="18"/>
               </w:rPr>
-              <w:t xml:space="preserve">Annual national reports since 2021</w:t>
+              <w:t xml:space="preserve">Data collected since 2018; annual national reports since December 2021</w:t>
             </w:r>
           </w:p>
         </w:tc>
@@ -2423,7 +2470,7 @@
                 <w:sz w:val="18"/>
                 <w:szCs w:val="18"/>
               </w:rPr>
-              <w:t xml:space="preserve">Educational statistics (KEDI/KESS); Teachers’ Pension open data</w:t>
+              <w:t xml:space="preserve">Educational statistics (KEDI/KESS, yearbook since 1963); Teachers’ Pension (est. 1974) open data</w:t>
             </w:r>
           </w:p>
         </w:tc>
@@ -2479,7 +2526,7 @@
                 <w:sz w:val="18"/>
                 <w:szCs w:val="18"/>
               </w:rPr>
-              <w:t xml:space="preserve">Departures by cause: retirement, honorary retirement, resignation</w:t>
+              <w:t xml:space="preserve">Departures by cause: retirement, honorary retirement, resignation; pension data cover private schools only</w:t>
             </w:r>
           </w:p>
         </w:tc>
@@ -2593,7 +2640,7 @@
                 <w:sz w:val="18"/>
                 <w:szCs w:val="18"/>
               </w:rPr>
-              <w:t xml:space="preserve">Annual</w:t>
+              <w:t xml:space="preserve">Annual since 2020; DUO open data files since 2011</w:t>
             </w:r>
           </w:p>
         </w:tc>
@@ -2707,7 +2754,7 @@
                 <w:sz w:val="18"/>
                 <w:szCs w:val="18"/>
               </w:rPr>
-              <w:t xml:space="preserve">School staff statistics (BFS) with LABB longitudinal studies</w:t>
+              <w:t xml:space="preserve">School staff statistics (BFS SSP, since 2010/11) with LABB longitudinal studies</w:t>
             </w:r>
           </w:p>
         </w:tc>
@@ -2797,6 +2844,21 @@
         </w:tc>
       </w:tr>
     </w:tbl>
+    <w:p>
+      <w:pPr>
+        <w:spacing w:after="60" w:before="80" w:line="240" w:lineRule="auto"/>
+        <w:jc w:val="both"/>
+      </w:pPr>
+      <w:r>
+        <w:rPr>
+          <w:rFonts w:ascii="Garamond" w:cs="Garamond" w:eastAsia="Garamond" w:hAnsi="Garamond"/>
+          <w:color w:val="5A6572"/>
+          <w:sz w:val="17"/>
+          <w:szCs w:val="17"/>
+        </w:rPr>
+        <w:t xml:space="preserve">Sources, by row: NCES, Teacher Follow-up Survey (nces.ed.gov/surveys/ntps); Texas Education Agency, PEIMS, and Washington OSPI, S-275 (tea.texas.gov; ospi.k12.wa.us); Department for Education, School Workforce in England (explore-education-statistics.service.gov.uk); Statistisches Bundesamt, Fachserie 11 Reihe 1 and successors (statistischebibliothek.de; destatis.de); AITSL, Australian Teacher Workforce Data (aitsl.edu.au); KEDI, Korean Educational Statistics Service, and Korea Teachers’ Pension (kess.kedi.re.kr; data.go.kr); OCW, Trendrapportage Arbeidsmarkt Leraren, and DUO open data (ocwincijfers.nl; duo.nl/open_onderwijsdata); BFS, Statistik des Schulpersonals and LABB (bfs.admin.ch). Start years and access regimes verified against the primary documentation of each steward, July 2026.</w:t>
+      </w:r>
+    </w:p>
     <w:sectPr>
       <w:pgSz w:w="11906" w:h="16838" w:orient="portrait"/>
       <w:pgMar w:top="1360" w:right="1420" w:bottom="1250" w:left="1420" w:header="708" w:footer="708" w:gutter="0"/>
@@ -2879,6 +2941,149 @@
       </w:r>
       <w:r>
         <w:continuationSeparator/>
+      </w:r>
+    </w:p>
+  </w:footnote>
+  <w:footnote w:id="1">
+    <w:p>
+      <w:r>
+        <w:rPr>
+          <w:rStyle w:val="FootnoteReference"/>
+        </w:rPr>
+        <w:footnoteRef/>
+      </w:r>
+      <w:r>
+        <w:rPr>
+          <w:rFonts w:ascii="Garamond" w:cs="Garamond" w:eastAsia="Garamond" w:hAnsi="Garamond"/>
+          <w:color w:val="1A2430"/>
+          <w:sz w:val="18"/>
+          <w:szCs w:val="18"/>
+        </w:rPr>
+        <w:t xml:space="preserve">In England, for instance, the person-level School Workforce Census can be analysed only by accredited researchers inside the Office for National Statistics Secure Research Service (</w:t>
+      </w:r>
+      <w:hyperlink w:history="1" r:id="rIdbpcrqrayfgrwhxs57duas">
+        <w:r>
+          <w:rPr>
+            <w:rFonts w:ascii="Garamond" w:cs="Garamond" w:eastAsia="Garamond" w:hAnsi="Garamond"/>
+            <w:color w:val="2A5DB0"/>
+            <w:sz w:val="18"/>
+            <w:szCs w:val="18"/>
+            <w:u w:val="single"/>
+          </w:rPr>
+          <w:t xml:space="preserve">ifs.org.uk/school-workforce-data</w:t>
+        </w:r>
+      </w:hyperlink>
+      <w:r>
+        <w:rPr>
+          <w:rFonts w:ascii="Garamond" w:cs="Garamond" w:eastAsia="Garamond" w:hAnsi="Garamond"/>
+          <w:color w:val="1A2430"/>
+          <w:sz w:val="18"/>
+          <w:szCs w:val="18"/>
+        </w:rPr>
+        <w:t xml:space="preserve">); in Australia, the national teacher workforce data are accessible only within the Australian Institute of Health and Welfare’s secure environment, with no extraction of records (</w:t>
+      </w:r>
+      <w:hyperlink w:history="1" r:id="rIdzqesd2k5w3a8ogmr3rln2">
+        <w:r>
+          <w:rPr>
+            <w:rFonts w:ascii="Garamond" w:cs="Garamond" w:eastAsia="Garamond" w:hAnsi="Garamond"/>
+            <w:color w:val="2A5DB0"/>
+            <w:sz w:val="18"/>
+            <w:szCs w:val="18"/>
+            <w:u w:val="single"/>
+          </w:rPr>
+          <w:t xml:space="preserve">aitsl.edu.au</w:t>
+        </w:r>
+      </w:hyperlink>
+      <w:r>
+        <w:rPr>
+          <w:rFonts w:ascii="Garamond" w:cs="Garamond" w:eastAsia="Garamond" w:hAnsi="Garamond"/>
+          <w:color w:val="1A2430"/>
+          <w:sz w:val="18"/>
+          <w:szCs w:val="18"/>
+        </w:rPr>
+        <w:t xml:space="preserve">); and the United States has released no public-use microdata of its Teacher Follow-up Survey since the 2000–01 cohort (</w:t>
+      </w:r>
+      <w:hyperlink w:history="1" r:id="rIdhfphggiany97kwcnftub2">
+        <w:r>
+          <w:rPr>
+            <w:rFonts w:ascii="Garamond" w:cs="Garamond" w:eastAsia="Garamond" w:hAnsi="Garamond"/>
+            <w:color w:val="2A5DB0"/>
+            <w:sz w:val="18"/>
+            <w:szCs w:val="18"/>
+            <w:u w:val="single"/>
+          </w:rPr>
+          <w:t xml:space="preserve">nces.ed.gov</w:t>
+        </w:r>
+      </w:hyperlink>
+      <w:r>
+        <w:rPr>
+          <w:rFonts w:ascii="Garamond" w:cs="Garamond" w:eastAsia="Garamond" w:hAnsi="Garamond"/>
+          <w:color w:val="1A2430"/>
+          <w:sz w:val="18"/>
+          <w:szCs w:val="18"/>
+        </w:rPr>
+        <w:t xml:space="preserve">). The exceptions prove the rule: Washington State publishes its personnel files openly, and the Netherlands routinizes fee-based remote access to register microdata.</w:t>
+      </w:r>
+    </w:p>
+  </w:footnote>
+  <w:footnote w:id="2">
+    <w:p>
+      <w:r>
+        <w:rPr>
+          <w:rStyle w:val="FootnoteReference"/>
+        </w:rPr>
+        <w:footnoteRef/>
+      </w:r>
+      <w:r>
+        <w:rPr>
+          <w:rFonts w:ascii="Garamond" w:cs="Garamond" w:eastAsia="Garamond" w:hAnsi="Garamond"/>
+          <w:color w:val="1A2430"/>
+          <w:sz w:val="18"/>
+          <w:szCs w:val="18"/>
+        </w:rPr>
+        <w:t xml:space="preserve">Author’s compilation of some twenty-five national statistics from ministries, statistical offices and teacher registers across the seven countries; for the two endpoints, see the Korean educational statistics (</w:t>
+      </w:r>
+      <w:hyperlink w:history="1" r:id="rIdnmhjbi0qwnnxef2dhume9">
+        <w:r>
+          <w:rPr>
+            <w:rFonts w:ascii="Garamond" w:cs="Garamond" w:eastAsia="Garamond" w:hAnsi="Garamond"/>
+            <w:color w:val="2A5DB0"/>
+            <w:sz w:val="18"/>
+            <w:szCs w:val="18"/>
+            <w:u w:val="single"/>
+          </w:rPr>
+          <w:t xml:space="preserve">kess.kedi.re.kr</w:t>
+        </w:r>
+      </w:hyperlink>
+      <w:r>
+        <w:rPr>
+          <w:rFonts w:ascii="Garamond" w:cs="Garamond" w:eastAsia="Garamond" w:hAnsi="Garamond"/>
+          <w:color w:val="1A2430"/>
+          <w:sz w:val="18"/>
+          <w:szCs w:val="18"/>
+        </w:rPr>
+        <w:t xml:space="preserve">) and the English School Workforce Census (</w:t>
+      </w:r>
+      <w:hyperlink w:history="1" r:id="rIdr7b4cyw01kzinnnvkkc8x">
+        <w:r>
+          <w:rPr>
+            <w:rFonts w:ascii="Garamond" w:cs="Garamond" w:eastAsia="Garamond" w:hAnsi="Garamond"/>
+            <w:color w:val="2A5DB0"/>
+            <w:sz w:val="18"/>
+            <w:szCs w:val="18"/>
+            <w:u w:val="single"/>
+          </w:rPr>
+          <w:t xml:space="preserve">explore-education-statistics.service.gov.uk</w:t>
+        </w:r>
+      </w:hyperlink>
+      <w:r>
+        <w:rPr>
+          <w:rFonts w:ascii="Garamond" w:cs="Garamond" w:eastAsia="Garamond" w:hAnsi="Garamond"/>
+          <w:color w:val="1A2430"/>
+          <w:sz w:val="18"/>
+          <w:szCs w:val="18"/>
+        </w:rPr>
+        <w:t xml:space="preserve">).</w:t>
       </w:r>
     </w:p>
   </w:footnote>

</xml_diff>